<commit_message>
feat: implement `VehicleInvoiceService` for managing vehicle invoices, associated vehicles, and OCR extraction.
</commit_message>
<xml_diff>
--- a/src/main/resources/templates/GiaiNgan/de-xuat-giai-ngan.docx
+++ b/src/main/resources/templates/GiaiNgan/de-xuat-giai-ngan.docx
@@ -31,21 +31,7 @@
         <w:rPr>
           <w:rFonts w:asciiTheme="majorHAnsi" w:hAnsiTheme="majorHAnsi" w:cstheme="majorHAnsi"/>
         </w:rPr>
-        <w:t xml:space="preserve">P. Cao </w:t>
-      </w:r>
-      <w:proofErr w:type="spellStart"/>
-      <w:r>
-        <w:rPr>
-          <w:rFonts w:asciiTheme="majorHAnsi" w:hAnsiTheme="majorHAnsi" w:cstheme="majorHAnsi"/>
-        </w:rPr>
-        <w:t>Lãnh</w:t>
-      </w:r>
-      <w:proofErr w:type="spellEnd"/>
-      <w:r>
-        <w:rPr>
-          <w:rFonts w:asciiTheme="majorHAnsi" w:hAnsiTheme="majorHAnsi" w:cstheme="majorHAnsi"/>
-        </w:rPr>
-        <w:t xml:space="preserve">, </w:t>
+        <w:t xml:space="preserve">P. Cao Lãnh, </w:t>
       </w:r>
       <w:r>
         <w:rPr>
@@ -631,170 +617,48 @@
           <w:i/>
           <w:iCs/>
         </w:rPr>
-        <w:t xml:space="preserve">(để kinh doanh xe ô tô khác, phụ tùng và các bộ phận phụ trợ xe ô tô từ HTC-VN và Vinfast, các nhu cầu </w:t>
-      </w:r>
-      <w:proofErr w:type="spellStart"/>
+        <w:t>(để kinh doanh xe ô tô khác, phụ tùng và các bộ phận phụ trợ xe ô tô từ HTC-VN và Vinfast, các nhu cầu vốn lưu động khác,</w:t>
+      </w:r>
       <w:r>
         <w:rPr>
           <w:rFonts w:asciiTheme="majorHAnsi" w:hAnsiTheme="majorHAnsi" w:cstheme="majorHAnsi"/>
           <w:i/>
           <w:iCs/>
         </w:rPr>
-        <w:t>vốn</w:t>
-      </w:r>
-      <w:proofErr w:type="spellEnd"/>
+        <w:t>…</w:t>
+      </w:r>
       <w:r>
         <w:rPr>
           <w:rFonts w:asciiTheme="majorHAnsi" w:hAnsiTheme="majorHAnsi" w:cstheme="majorHAnsi"/>
           <w:i/>
           <w:iCs/>
         </w:rPr>
+        <w:t>)</w:t>
+      </w:r>
+      <w:r>
+        <w:rPr>
+          <w:rFonts w:asciiTheme="majorHAnsi" w:hAnsiTheme="majorHAnsi" w:cstheme="majorHAnsi"/>
+        </w:rPr>
+        <w:t>:Tài sản bảo đảm là bất động sản/tiền gửi và đáp ứng tỷ lệ tài sản bảo đảm bằng bất động sản/tiền gửi tối thiểu là 78%.</w:t>
+      </w:r>
+      <w:r>
+        <w:rPr>
+          <w:rFonts w:asciiTheme="majorHAnsi" w:hAnsiTheme="majorHAnsi" w:cstheme="majorHAnsi"/>
+        </w:rPr>
         <w:t xml:space="preserve"> </w:t>
       </w:r>
-      <w:proofErr w:type="spellStart"/>
+      <w:r>
+        <w:rPr>
+          <w:rFonts w:asciiTheme="majorHAnsi" w:hAnsiTheme="majorHAnsi" w:cstheme="majorHAnsi"/>
+        </w:rPr>
+        <w:t xml:space="preserve">Hiện tại tài sản bảo đảm là quyền sử dụng đất và tài sản gắn liền với đất theo Giấy chứng nhận QSD đất, QSH nhà ở và tài sản khác gắn liền với đất số phát hành CY 605654, số vào sổ CS07342 do Sở Tài nguyên và Môi trường tỉnh Đồng Tháp cấp ngày 29/01/2021 </w:t>
+      </w:r>
       <w:r>
         <w:rPr>
           <w:rFonts w:asciiTheme="majorHAnsi" w:hAnsiTheme="majorHAnsi" w:cstheme="majorHAnsi"/>
           <w:i/>
           <w:iCs/>
         </w:rPr>
-        <w:t>lưu</w:t>
-      </w:r>
-      <w:proofErr w:type="spellEnd"/>
-      <w:r>
-        <w:rPr>
-          <w:rFonts w:asciiTheme="majorHAnsi" w:hAnsiTheme="majorHAnsi" w:cstheme="majorHAnsi"/>
-          <w:i/>
-          <w:iCs/>
-        </w:rPr>
-        <w:t xml:space="preserve"> </w:t>
-      </w:r>
-      <w:proofErr w:type="spellStart"/>
-      <w:r>
-        <w:rPr>
-          <w:rFonts w:asciiTheme="majorHAnsi" w:hAnsiTheme="majorHAnsi" w:cstheme="majorHAnsi"/>
-          <w:i/>
-          <w:iCs/>
-        </w:rPr>
-        <w:t>động</w:t>
-      </w:r>
-      <w:proofErr w:type="spellEnd"/>
-      <w:r>
-        <w:rPr>
-          <w:rFonts w:asciiTheme="majorHAnsi" w:hAnsiTheme="majorHAnsi" w:cstheme="majorHAnsi"/>
-          <w:i/>
-          <w:iCs/>
-        </w:rPr>
-        <w:t xml:space="preserve"> </w:t>
-      </w:r>
-      <w:proofErr w:type="spellStart"/>
-      <w:proofErr w:type="gramStart"/>
-      <w:r>
-        <w:rPr>
-          <w:rFonts w:asciiTheme="majorHAnsi" w:hAnsiTheme="majorHAnsi" w:cstheme="majorHAnsi"/>
-          <w:i/>
-          <w:iCs/>
-        </w:rPr>
-        <w:t>khác</w:t>
-      </w:r>
-      <w:proofErr w:type="spellEnd"/>
-      <w:r>
-        <w:rPr>
-          <w:rFonts w:asciiTheme="majorHAnsi" w:hAnsiTheme="majorHAnsi" w:cstheme="majorHAnsi"/>
-          <w:i/>
-          <w:iCs/>
-        </w:rPr>
-        <w:t>,</w:t>
-      </w:r>
-      <w:r>
-        <w:rPr>
-          <w:rFonts w:asciiTheme="majorHAnsi" w:hAnsiTheme="majorHAnsi" w:cstheme="majorHAnsi"/>
-          <w:i/>
-          <w:iCs/>
-        </w:rPr>
-        <w:t>…</w:t>
-      </w:r>
-      <w:r>
-        <w:rPr>
-          <w:rFonts w:asciiTheme="majorHAnsi" w:hAnsiTheme="majorHAnsi" w:cstheme="majorHAnsi"/>
-          <w:i/>
-          <w:iCs/>
-        </w:rPr>
-        <w:t>)</w:t>
-      </w:r>
-      <w:r>
-        <w:rPr>
-          <w:rFonts w:asciiTheme="majorHAnsi" w:hAnsiTheme="majorHAnsi" w:cstheme="majorHAnsi"/>
-        </w:rPr>
-        <w:t>:Tài</w:t>
-      </w:r>
-      <w:proofErr w:type="gramEnd"/>
-      <w:r>
-        <w:rPr>
-          <w:rFonts w:asciiTheme="majorHAnsi" w:hAnsiTheme="majorHAnsi" w:cstheme="majorHAnsi"/>
-        </w:rPr>
-        <w:t xml:space="preserve"> </w:t>
-      </w:r>
-      <w:proofErr w:type="spellStart"/>
-      <w:r>
-        <w:rPr>
-          <w:rFonts w:asciiTheme="majorHAnsi" w:hAnsiTheme="majorHAnsi" w:cstheme="majorHAnsi"/>
-        </w:rPr>
-        <w:t>sản</w:t>
-      </w:r>
-      <w:proofErr w:type="spellEnd"/>
-      <w:r>
-        <w:rPr>
-          <w:rFonts w:asciiTheme="majorHAnsi" w:hAnsiTheme="majorHAnsi" w:cstheme="majorHAnsi"/>
-        </w:rPr>
-        <w:t xml:space="preserve"> </w:t>
-      </w:r>
-      <w:proofErr w:type="spellStart"/>
-      <w:r>
-        <w:rPr>
-          <w:rFonts w:asciiTheme="majorHAnsi" w:hAnsiTheme="majorHAnsi" w:cstheme="majorHAnsi"/>
-        </w:rPr>
-        <w:t>bảo</w:t>
-      </w:r>
-      <w:proofErr w:type="spellEnd"/>
-      <w:r>
-        <w:rPr>
-          <w:rFonts w:asciiTheme="majorHAnsi" w:hAnsiTheme="majorHAnsi" w:cstheme="majorHAnsi"/>
-        </w:rPr>
-        <w:t xml:space="preserve"> </w:t>
-      </w:r>
-      <w:proofErr w:type="spellStart"/>
-      <w:r>
-        <w:rPr>
-          <w:rFonts w:asciiTheme="majorHAnsi" w:hAnsiTheme="majorHAnsi" w:cstheme="majorHAnsi"/>
-        </w:rPr>
-        <w:t>đảm</w:t>
-      </w:r>
-      <w:proofErr w:type="spellEnd"/>
-      <w:r>
-        <w:rPr>
-          <w:rFonts w:asciiTheme="majorHAnsi" w:hAnsiTheme="majorHAnsi" w:cstheme="majorHAnsi"/>
-        </w:rPr>
-        <w:t xml:space="preserve"> là bất động sản/tiền gửi và đáp ứng tỷ lệ tài sản bảo đảm bằng bất động sản/tiền gửi tối thiểu là 78%.</w:t>
-      </w:r>
-      <w:r>
-        <w:rPr>
-          <w:rFonts w:asciiTheme="majorHAnsi" w:hAnsiTheme="majorHAnsi" w:cstheme="majorHAnsi"/>
-        </w:rPr>
-        <w:t xml:space="preserve"> </w:t>
-      </w:r>
-      <w:r>
-        <w:rPr>
-          <w:rFonts w:asciiTheme="majorHAnsi" w:hAnsiTheme="majorHAnsi" w:cstheme="majorHAnsi"/>
-        </w:rPr>
-        <w:t xml:space="preserve">Hiện tại tài sản bảo đảm là quyền sử dụng đất và tài sản gắn liền với đất theo Giấy chứng nhận QSD đất, QSH nhà ở và tài sản khác gắn liền với đất số phát hành CY 605654, số vào sổ CS07342 do Sở Tài nguyên và Môi trường tỉnh Đồng Tháp cấp ngày 29/01/2021 </w:t>
-      </w:r>
-      <w:r>
-        <w:rPr>
-          <w:rFonts w:asciiTheme="majorHAnsi" w:hAnsiTheme="majorHAnsi" w:cstheme="majorHAnsi"/>
-          <w:i/>
-          <w:iCs/>
-        </w:rPr>
         <w:t>(theo Hợp đồng thế chấp số 01/2021/10987477/HĐBĐ ngày 29/03/2021).</w:t>
       </w:r>
     </w:p>
@@ -815,49 +679,7 @@
         <w:rPr>
           <w:rFonts w:asciiTheme="majorHAnsi" w:hAnsiTheme="majorHAnsi" w:cstheme="majorHAnsi"/>
         </w:rPr>
-        <w:t xml:space="preserve">Trong mọi trường hợp, tổng dư nợ được bảo đảm bằng bất động sản tại mọi thời điểm tối đa </w:t>
-      </w:r>
-      <w:proofErr w:type="spellStart"/>
-      <w:r>
-        <w:rPr>
-          <w:rFonts w:asciiTheme="majorHAnsi" w:hAnsiTheme="majorHAnsi" w:cstheme="majorHAnsi"/>
-        </w:rPr>
-        <w:t>là</w:t>
-      </w:r>
-      <w:proofErr w:type="spellEnd"/>
-      <w:r>
-        <w:rPr>
-          <w:rFonts w:asciiTheme="majorHAnsi" w:hAnsiTheme="majorHAnsi" w:cstheme="majorHAnsi"/>
-        </w:rPr>
-        <w:t xml:space="preserve"> 9 </w:t>
-      </w:r>
-      <w:proofErr w:type="spellStart"/>
-      <w:r>
-        <w:rPr>
-          <w:rFonts w:asciiTheme="majorHAnsi" w:hAnsiTheme="majorHAnsi" w:cstheme="majorHAnsi"/>
-        </w:rPr>
-        <w:t>tỷ</w:t>
-      </w:r>
-      <w:proofErr w:type="spellEnd"/>
-      <w:r>
-        <w:rPr>
-          <w:rFonts w:asciiTheme="majorHAnsi" w:hAnsiTheme="majorHAnsi" w:cstheme="majorHAnsi"/>
-        </w:rPr>
-        <w:t xml:space="preserve"> </w:t>
-      </w:r>
-      <w:proofErr w:type="spellStart"/>
-      <w:r>
-        <w:rPr>
-          <w:rFonts w:asciiTheme="majorHAnsi" w:hAnsiTheme="majorHAnsi" w:cstheme="majorHAnsi"/>
-        </w:rPr>
-        <w:t>đồng</w:t>
-      </w:r>
-      <w:proofErr w:type="spellEnd"/>
-      <w:r>
-        <w:rPr>
-          <w:rFonts w:asciiTheme="majorHAnsi" w:hAnsiTheme="majorHAnsi" w:cstheme="majorHAnsi"/>
-        </w:rPr>
-        <w:t>.</w:t>
+        <w:t>Trong mọi trường hợp, tổng dư nợ được bảo đảm bằng bất động sản tại mọi thời điểm tối đa là 9 tỷ đồng.</w:t>
       </w:r>
     </w:p>
     <w:tbl>
@@ -962,16 +784,8 @@
               <w:rPr>
                 <w:rFonts w:asciiTheme="majorHAnsi" w:hAnsiTheme="majorHAnsi" w:cstheme="majorHAnsi"/>
               </w:rPr>
-              <w:t xml:space="preserve">Trong </w:t>
-            </w:r>
-            <w:proofErr w:type="spellStart"/>
-            <w:r>
-              <w:rPr>
-                <w:rFonts w:asciiTheme="majorHAnsi" w:hAnsiTheme="majorHAnsi" w:cstheme="majorHAnsi"/>
-              </w:rPr>
-              <w:t>đó</w:t>
-            </w:r>
-            <w:proofErr w:type="spellEnd"/>
+              <w:t>Trong đó</w:t>
+            </w:r>
           </w:p>
         </w:tc>
         <w:tc>
@@ -1019,119 +833,7 @@
               <w:rPr>
                 <w:rFonts w:asciiTheme="majorHAnsi" w:hAnsiTheme="majorHAnsi" w:cstheme="majorHAnsi"/>
               </w:rPr>
-              <w:t>+ TSHTTTL (</w:t>
-            </w:r>
-            <w:proofErr w:type="spellStart"/>
-            <w:r>
-              <w:rPr>
-                <w:rFonts w:asciiTheme="majorHAnsi" w:hAnsiTheme="majorHAnsi" w:cstheme="majorHAnsi"/>
-              </w:rPr>
-              <w:t>xe</w:t>
-            </w:r>
-            <w:proofErr w:type="spellEnd"/>
-            <w:r>
-              <w:rPr>
-                <w:rFonts w:asciiTheme="majorHAnsi" w:hAnsiTheme="majorHAnsi" w:cstheme="majorHAnsi"/>
-              </w:rPr>
-              <w:t xml:space="preserve"> ô </w:t>
-            </w:r>
-            <w:proofErr w:type="spellStart"/>
-            <w:r>
-              <w:rPr>
-                <w:rFonts w:asciiTheme="majorHAnsi" w:hAnsiTheme="majorHAnsi" w:cstheme="majorHAnsi"/>
-              </w:rPr>
-              <w:t>tô</w:t>
-            </w:r>
-            <w:proofErr w:type="spellEnd"/>
-            <w:r>
-              <w:rPr>
-                <w:rFonts w:asciiTheme="majorHAnsi" w:hAnsiTheme="majorHAnsi" w:cstheme="majorHAnsi"/>
-              </w:rPr>
-              <w:t xml:space="preserve">, </w:t>
-            </w:r>
-            <w:proofErr w:type="spellStart"/>
-            <w:r>
-              <w:rPr>
-                <w:rFonts w:asciiTheme="majorHAnsi" w:hAnsiTheme="majorHAnsi" w:cstheme="majorHAnsi"/>
-              </w:rPr>
-              <w:t>đã</w:t>
-            </w:r>
-            <w:proofErr w:type="spellEnd"/>
-            <w:r>
-              <w:rPr>
-                <w:rFonts w:asciiTheme="majorHAnsi" w:hAnsiTheme="majorHAnsi" w:cstheme="majorHAnsi"/>
-              </w:rPr>
-              <w:t xml:space="preserve"> </w:t>
-            </w:r>
-            <w:proofErr w:type="spellStart"/>
-            <w:r>
-              <w:rPr>
-                <w:rFonts w:asciiTheme="majorHAnsi" w:hAnsiTheme="majorHAnsi" w:cstheme="majorHAnsi"/>
-              </w:rPr>
-              <w:t>nhận</w:t>
-            </w:r>
-            <w:proofErr w:type="spellEnd"/>
-            <w:r>
-              <w:rPr>
-                <w:rFonts w:asciiTheme="majorHAnsi" w:hAnsiTheme="majorHAnsi" w:cstheme="majorHAnsi"/>
-              </w:rPr>
-              <w:t xml:space="preserve"> </w:t>
-            </w:r>
-            <w:proofErr w:type="spellStart"/>
-            <w:r>
-              <w:rPr>
-                <w:rFonts w:asciiTheme="majorHAnsi" w:hAnsiTheme="majorHAnsi" w:cstheme="majorHAnsi"/>
-              </w:rPr>
-              <w:t>hồ</w:t>
-            </w:r>
-            <w:proofErr w:type="spellEnd"/>
-            <w:r>
-              <w:rPr>
-                <w:rFonts w:asciiTheme="majorHAnsi" w:hAnsiTheme="majorHAnsi" w:cstheme="majorHAnsi"/>
-              </w:rPr>
-              <w:t xml:space="preserve"> </w:t>
-            </w:r>
-            <w:proofErr w:type="spellStart"/>
-            <w:r>
-              <w:rPr>
-                <w:rFonts w:asciiTheme="majorHAnsi" w:hAnsiTheme="majorHAnsi" w:cstheme="majorHAnsi"/>
-              </w:rPr>
-              <w:t>sơ</w:t>
-            </w:r>
-            <w:proofErr w:type="spellEnd"/>
-            <w:r>
-              <w:rPr>
-                <w:rFonts w:asciiTheme="majorHAnsi" w:hAnsiTheme="majorHAnsi" w:cstheme="majorHAnsi"/>
-              </w:rPr>
-              <w:t xml:space="preserve"> </w:t>
-            </w:r>
-            <w:proofErr w:type="spellStart"/>
-            <w:r>
-              <w:rPr>
-                <w:rFonts w:asciiTheme="majorHAnsi" w:hAnsiTheme="majorHAnsi" w:cstheme="majorHAnsi"/>
-              </w:rPr>
-              <w:t>nhập</w:t>
-            </w:r>
-            <w:proofErr w:type="spellEnd"/>
-            <w:r>
-              <w:rPr>
-                <w:rFonts w:asciiTheme="majorHAnsi" w:hAnsiTheme="majorHAnsi" w:cstheme="majorHAnsi"/>
-              </w:rPr>
-              <w:t xml:space="preserve"> </w:t>
-            </w:r>
-            <w:proofErr w:type="spellStart"/>
-            <w:r>
-              <w:rPr>
-                <w:rFonts w:asciiTheme="majorHAnsi" w:hAnsiTheme="majorHAnsi" w:cstheme="majorHAnsi"/>
-              </w:rPr>
-              <w:t>kho</w:t>
-            </w:r>
-            <w:proofErr w:type="spellEnd"/>
-            <w:r>
-              <w:rPr>
-                <w:rFonts w:asciiTheme="majorHAnsi" w:hAnsiTheme="majorHAnsi" w:cstheme="majorHAnsi"/>
-              </w:rPr>
-              <w:t>):</w:t>
+              <w:t>+ TSHTTTL (xe ô tô, đã nhận hồ sơ nhập kho):</w:t>
             </w:r>
           </w:p>
         </w:tc>
@@ -1163,19 +865,8 @@
                 <w:bCs/>
                 <w:color w:val="EE0000"/>
               </w:rPr>
-              <w:t xml:space="preserve"> </w:t>
-            </w:r>
-            <w:proofErr w:type="spellStart"/>
-            <w:r>
-              <w:rPr>
-                <w:rFonts w:asciiTheme="majorHAnsi" w:hAnsiTheme="majorHAnsi" w:cstheme="majorHAnsi"/>
-                <w:b/>
-                <w:bCs/>
-                <w:color w:val="EE0000"/>
-              </w:rPr>
-              <w:t>đồng</w:t>
-            </w:r>
-            <w:proofErr w:type="spellEnd"/>
+              <w:t xml:space="preserve"> đồng</w:t>
+            </w:r>
           </w:p>
         </w:tc>
       </w:tr>
@@ -1196,49 +887,7 @@
               <w:rPr>
                 <w:rFonts w:asciiTheme="majorHAnsi" w:hAnsiTheme="majorHAnsi" w:cstheme="majorHAnsi"/>
               </w:rPr>
-              <w:t xml:space="preserve">+ </w:t>
-            </w:r>
-            <w:proofErr w:type="spellStart"/>
-            <w:r>
-              <w:rPr>
-                <w:rFonts w:asciiTheme="majorHAnsi" w:hAnsiTheme="majorHAnsi" w:cstheme="majorHAnsi"/>
-              </w:rPr>
-              <w:t>Bất</w:t>
-            </w:r>
-            <w:proofErr w:type="spellEnd"/>
-            <w:r>
-              <w:rPr>
-                <w:rFonts w:asciiTheme="majorHAnsi" w:hAnsiTheme="majorHAnsi" w:cstheme="majorHAnsi"/>
-              </w:rPr>
-              <w:t xml:space="preserve"> </w:t>
-            </w:r>
-            <w:proofErr w:type="spellStart"/>
-            <w:r>
-              <w:rPr>
-                <w:rFonts w:asciiTheme="majorHAnsi" w:hAnsiTheme="majorHAnsi" w:cstheme="majorHAnsi"/>
-              </w:rPr>
-              <w:t>động</w:t>
-            </w:r>
-            <w:proofErr w:type="spellEnd"/>
-            <w:r>
-              <w:rPr>
-                <w:rFonts w:asciiTheme="majorHAnsi" w:hAnsiTheme="majorHAnsi" w:cstheme="majorHAnsi"/>
-              </w:rPr>
-              <w:t xml:space="preserve"> </w:t>
-            </w:r>
-            <w:proofErr w:type="spellStart"/>
-            <w:r>
-              <w:rPr>
-                <w:rFonts w:asciiTheme="majorHAnsi" w:hAnsiTheme="majorHAnsi" w:cstheme="majorHAnsi"/>
-              </w:rPr>
-              <w:t>sản</w:t>
-            </w:r>
-            <w:proofErr w:type="spellEnd"/>
-            <w:r>
-              <w:rPr>
-                <w:rFonts w:asciiTheme="majorHAnsi" w:hAnsiTheme="majorHAnsi" w:cstheme="majorHAnsi"/>
-              </w:rPr>
-              <w:t>:</w:t>
+              <w:t>+ Bất động sản:</w:t>
             </w:r>
           </w:p>
         </w:tc>
@@ -1259,17 +908,8 @@
                 <w:rFonts w:asciiTheme="majorHAnsi" w:hAnsiTheme="majorHAnsi" w:cstheme="majorHAnsi"/>
                 <w:color w:val="EE0000"/>
               </w:rPr>
-              <w:t xml:space="preserve">8,910,000,000 </w:t>
-            </w:r>
-            <w:proofErr w:type="spellStart"/>
-            <w:r>
-              <w:rPr>
-                <w:rFonts w:asciiTheme="majorHAnsi" w:hAnsiTheme="majorHAnsi" w:cstheme="majorHAnsi"/>
-                <w:color w:val="EE0000"/>
-              </w:rPr>
-              <w:t>đồng</w:t>
-            </w:r>
-            <w:proofErr w:type="spellEnd"/>
+              <w:t>8,910,000,000 đồng</w:t>
+            </w:r>
           </w:p>
         </w:tc>
       </w:tr>
@@ -1288,86 +928,8 @@
               <w:rPr>
                 <w:rFonts w:asciiTheme="majorHAnsi" w:hAnsiTheme="majorHAnsi" w:cstheme="majorHAnsi"/>
               </w:rPr>
-              <w:t xml:space="preserve">→ </w:t>
-            </w:r>
-            <w:proofErr w:type="spellStart"/>
-            <w:r>
-              <w:rPr>
-                <w:rFonts w:asciiTheme="majorHAnsi" w:hAnsiTheme="majorHAnsi" w:cstheme="majorHAnsi"/>
-              </w:rPr>
-              <w:t>Giá</w:t>
-            </w:r>
-            <w:proofErr w:type="spellEnd"/>
-            <w:r>
-              <w:rPr>
-                <w:rFonts w:asciiTheme="majorHAnsi" w:hAnsiTheme="majorHAnsi" w:cstheme="majorHAnsi"/>
-              </w:rPr>
-              <w:t xml:space="preserve"> </w:t>
-            </w:r>
-            <w:proofErr w:type="spellStart"/>
-            <w:r>
-              <w:rPr>
-                <w:rFonts w:asciiTheme="majorHAnsi" w:hAnsiTheme="majorHAnsi" w:cstheme="majorHAnsi"/>
-              </w:rPr>
-              <w:t>trị</w:t>
-            </w:r>
-            <w:proofErr w:type="spellEnd"/>
-            <w:r>
-              <w:rPr>
-                <w:rFonts w:asciiTheme="majorHAnsi" w:hAnsiTheme="majorHAnsi" w:cstheme="majorHAnsi"/>
-              </w:rPr>
-              <w:t xml:space="preserve"> TSBĐ </w:t>
-            </w:r>
-            <w:proofErr w:type="spellStart"/>
-            <w:r>
-              <w:rPr>
-                <w:rFonts w:asciiTheme="majorHAnsi" w:hAnsiTheme="majorHAnsi" w:cstheme="majorHAnsi"/>
-              </w:rPr>
-              <w:t>sau</w:t>
-            </w:r>
-            <w:proofErr w:type="spellEnd"/>
-            <w:r>
-              <w:rPr>
-                <w:rFonts w:asciiTheme="majorHAnsi" w:hAnsiTheme="majorHAnsi" w:cstheme="majorHAnsi"/>
-              </w:rPr>
-              <w:t xml:space="preserve"> </w:t>
-            </w:r>
-            <w:proofErr w:type="spellStart"/>
-            <w:r>
-              <w:rPr>
-                <w:rFonts w:asciiTheme="majorHAnsi" w:hAnsiTheme="majorHAnsi" w:cstheme="majorHAnsi"/>
-              </w:rPr>
-              <w:t>khi</w:t>
-            </w:r>
-            <w:proofErr w:type="spellEnd"/>
-            <w:r>
-              <w:rPr>
-                <w:rFonts w:asciiTheme="majorHAnsi" w:hAnsiTheme="majorHAnsi" w:cstheme="majorHAnsi"/>
-              </w:rPr>
-              <w:t xml:space="preserve"> </w:t>
-            </w:r>
-            <w:proofErr w:type="spellStart"/>
-            <w:r>
-              <w:rPr>
-                <w:rFonts w:asciiTheme="majorHAnsi" w:hAnsiTheme="majorHAnsi" w:cstheme="majorHAnsi"/>
-              </w:rPr>
-              <w:t>nhân</w:t>
-            </w:r>
-            <w:proofErr w:type="spellEnd"/>
-            <w:r>
-              <w:rPr>
-                <w:rFonts w:asciiTheme="majorHAnsi" w:hAnsiTheme="majorHAnsi" w:cstheme="majorHAnsi"/>
-              </w:rPr>
-              <w:t xml:space="preserve"> </w:t>
-            </w:r>
-            <w:proofErr w:type="spellStart"/>
-            <w:r>
-              <w:rPr>
-                <w:rFonts w:asciiTheme="majorHAnsi" w:hAnsiTheme="majorHAnsi" w:cstheme="majorHAnsi"/>
-              </w:rPr>
-              <w:t>hệ</w:t>
-            </w:r>
-            <w:proofErr w:type="spellEnd"/>
+              <w:t>→ Giá trị TSBĐ sau khi nhân hệ</w:t>
+            </w:r>
           </w:p>
         </w:tc>
         <w:tc>
@@ -1399,17 +961,8 @@
                 <w:rFonts w:asciiTheme="majorHAnsi" w:hAnsiTheme="majorHAnsi" w:cstheme="majorHAnsi"/>
                 <w:color w:val="EE0000"/>
               </w:rPr>
-              <w:t xml:space="preserve">27,892,638,950 </w:t>
-            </w:r>
-            <w:proofErr w:type="spellStart"/>
-            <w:r>
-              <w:rPr>
-                <w:rFonts w:asciiTheme="majorHAnsi" w:hAnsiTheme="majorHAnsi" w:cstheme="majorHAnsi"/>
-                <w:color w:val="EE0000"/>
-              </w:rPr>
-              <w:t>đồng</w:t>
-            </w:r>
-            <w:proofErr w:type="spellEnd"/>
+              <w:t>27,892,638,950 đồng</w:t>
+            </w:r>
           </w:p>
         </w:tc>
       </w:tr>
@@ -1428,16 +981,8 @@
               <w:rPr>
                 <w:rFonts w:asciiTheme="majorHAnsi" w:hAnsiTheme="majorHAnsi" w:cstheme="majorHAnsi"/>
               </w:rPr>
-              <w:t xml:space="preserve">Trong </w:t>
-            </w:r>
-            <w:proofErr w:type="spellStart"/>
-            <w:r>
-              <w:rPr>
-                <w:rFonts w:asciiTheme="majorHAnsi" w:hAnsiTheme="majorHAnsi" w:cstheme="majorHAnsi"/>
-              </w:rPr>
-              <w:t>đó</w:t>
-            </w:r>
-            <w:proofErr w:type="spellEnd"/>
+              <w:t>Trong đó</w:t>
+            </w:r>
           </w:p>
         </w:tc>
         <w:tc>
@@ -1483,49 +1028,7 @@
               <w:rPr>
                 <w:rFonts w:asciiTheme="majorHAnsi" w:hAnsiTheme="majorHAnsi" w:cstheme="majorHAnsi"/>
               </w:rPr>
-              <w:t>+ TSHTTTL (</w:t>
-            </w:r>
-            <w:proofErr w:type="spellStart"/>
-            <w:r>
-              <w:rPr>
-                <w:rFonts w:asciiTheme="majorHAnsi" w:hAnsiTheme="majorHAnsi" w:cstheme="majorHAnsi"/>
-              </w:rPr>
-              <w:t>xe</w:t>
-            </w:r>
-            <w:proofErr w:type="spellEnd"/>
-            <w:r>
-              <w:rPr>
-                <w:rFonts w:asciiTheme="majorHAnsi" w:hAnsiTheme="majorHAnsi" w:cstheme="majorHAnsi"/>
-              </w:rPr>
-              <w:t xml:space="preserve"> ô </w:t>
-            </w:r>
-            <w:proofErr w:type="spellStart"/>
-            <w:r>
-              <w:rPr>
-                <w:rFonts w:asciiTheme="majorHAnsi" w:hAnsiTheme="majorHAnsi" w:cstheme="majorHAnsi"/>
-              </w:rPr>
-              <w:t>tô</w:t>
-            </w:r>
-            <w:proofErr w:type="spellEnd"/>
-            <w:r>
-              <w:rPr>
-                <w:rFonts w:asciiTheme="majorHAnsi" w:hAnsiTheme="majorHAnsi" w:cstheme="majorHAnsi"/>
-              </w:rPr>
-              <w:t xml:space="preserve">, </w:t>
-            </w:r>
-            <w:proofErr w:type="spellStart"/>
-            <w:r>
-              <w:rPr>
-                <w:rFonts w:asciiTheme="majorHAnsi" w:hAnsiTheme="majorHAnsi" w:cstheme="majorHAnsi"/>
-              </w:rPr>
-              <w:t>đã</w:t>
-            </w:r>
-            <w:proofErr w:type="spellEnd"/>
-            <w:r>
-              <w:rPr>
-                <w:rFonts w:asciiTheme="majorHAnsi" w:hAnsiTheme="majorHAnsi" w:cstheme="majorHAnsi"/>
-              </w:rPr>
-              <w:t xml:space="preserve"> nhận hồ sơ nhập kho):</w:t>
+              <w:t>+ TSHTTTL (xe ô tô, đã nhận hồ sơ nhập kho):</w:t>
             </w:r>
           </w:p>
         </w:tc>
@@ -1568,49 +1071,7 @@
               <w:rPr>
                 <w:rFonts w:asciiTheme="majorHAnsi" w:hAnsiTheme="majorHAnsi" w:cstheme="majorHAnsi"/>
               </w:rPr>
-              <w:t xml:space="preserve">+ </w:t>
-            </w:r>
-            <w:proofErr w:type="spellStart"/>
-            <w:r>
-              <w:rPr>
-                <w:rFonts w:asciiTheme="majorHAnsi" w:hAnsiTheme="majorHAnsi" w:cstheme="majorHAnsi"/>
-              </w:rPr>
-              <w:t>Bất</w:t>
-            </w:r>
-            <w:proofErr w:type="spellEnd"/>
-            <w:r>
-              <w:rPr>
-                <w:rFonts w:asciiTheme="majorHAnsi" w:hAnsiTheme="majorHAnsi" w:cstheme="majorHAnsi"/>
-              </w:rPr>
-              <w:t xml:space="preserve"> </w:t>
-            </w:r>
-            <w:proofErr w:type="spellStart"/>
-            <w:r>
-              <w:rPr>
-                <w:rFonts w:asciiTheme="majorHAnsi" w:hAnsiTheme="majorHAnsi" w:cstheme="majorHAnsi"/>
-              </w:rPr>
-              <w:t>động</w:t>
-            </w:r>
-            <w:proofErr w:type="spellEnd"/>
-            <w:r>
-              <w:rPr>
-                <w:rFonts w:asciiTheme="majorHAnsi" w:hAnsiTheme="majorHAnsi" w:cstheme="majorHAnsi"/>
-              </w:rPr>
-              <w:t xml:space="preserve"> </w:t>
-            </w:r>
-            <w:proofErr w:type="spellStart"/>
-            <w:r>
-              <w:rPr>
-                <w:rFonts w:asciiTheme="majorHAnsi" w:hAnsiTheme="majorHAnsi" w:cstheme="majorHAnsi"/>
-              </w:rPr>
-              <w:t>sản</w:t>
-            </w:r>
-            <w:proofErr w:type="spellEnd"/>
-            <w:r>
-              <w:rPr>
-                <w:rFonts w:asciiTheme="majorHAnsi" w:hAnsiTheme="majorHAnsi" w:cstheme="majorHAnsi"/>
-              </w:rPr>
-              <w:t>:</w:t>
+              <w:t>+ Bất động sản:</w:t>
             </w:r>
           </w:p>
         </w:tc>
@@ -1654,55 +1115,21 @@
                 <w:rFonts w:asciiTheme="majorHAnsi" w:hAnsiTheme="majorHAnsi" w:cstheme="majorHAnsi"/>
                 <w:i/>
               </w:rPr>
-              <w:t xml:space="preserve">-GHTD </w:t>
-            </w:r>
-            <w:proofErr w:type="spellStart"/>
+              <w:t>-GHTD được sử</w:t>
+            </w:r>
             <w:r>
               <w:rPr>
                 <w:rFonts w:asciiTheme="majorHAnsi" w:hAnsiTheme="majorHAnsi" w:cstheme="majorHAnsi"/>
                 <w:i/>
               </w:rPr>
-              <w:t>được</w:t>
-            </w:r>
-            <w:proofErr w:type="spellEnd"/>
+              <w:t xml:space="preserve"> </w:t>
+            </w:r>
             <w:r>
               <w:rPr>
                 <w:rFonts w:asciiTheme="majorHAnsi" w:hAnsiTheme="majorHAnsi" w:cstheme="majorHAnsi"/>
                 <w:i/>
               </w:rPr>
-              <w:t xml:space="preserve"> </w:t>
-            </w:r>
-            <w:proofErr w:type="spellStart"/>
-            <w:r>
-              <w:rPr>
-                <w:rFonts w:asciiTheme="majorHAnsi" w:hAnsiTheme="majorHAnsi" w:cstheme="majorHAnsi"/>
-                <w:i/>
-              </w:rPr>
-              <w:t>sử</w:t>
-            </w:r>
-            <w:proofErr w:type="spellEnd"/>
-            <w:r>
-              <w:rPr>
-                <w:rFonts w:asciiTheme="majorHAnsi" w:hAnsiTheme="majorHAnsi" w:cstheme="majorHAnsi"/>
-                <w:i/>
-              </w:rPr>
-              <w:t xml:space="preserve"> </w:t>
-            </w:r>
-            <w:proofErr w:type="spellStart"/>
-            <w:r>
-              <w:rPr>
-                <w:rFonts w:asciiTheme="majorHAnsi" w:hAnsiTheme="majorHAnsi" w:cstheme="majorHAnsi"/>
-                <w:i/>
-              </w:rPr>
-              <w:t>dụng</w:t>
-            </w:r>
-            <w:proofErr w:type="spellEnd"/>
-            <w:r>
-              <w:rPr>
-                <w:rFonts w:asciiTheme="majorHAnsi" w:hAnsiTheme="majorHAnsi" w:cstheme="majorHAnsi"/>
-                <w:i/>
-              </w:rPr>
-              <w:t>:</w:t>
+              <w:t>dụng:</w:t>
             </w:r>
           </w:p>
         </w:tc>
@@ -1738,17 +1165,8 @@
                 <w:rFonts w:asciiTheme="majorHAnsi" w:hAnsiTheme="majorHAnsi" w:cstheme="majorHAnsi"/>
                 <w:color w:val="4472C4" w:themeColor="accent1"/>
               </w:rPr>
-              <w:t xml:space="preserve">60,000,000,000 </w:t>
-            </w:r>
-            <w:proofErr w:type="spellStart"/>
-            <w:r>
-              <w:rPr>
-                <w:rFonts w:asciiTheme="majorHAnsi" w:hAnsiTheme="majorHAnsi" w:cstheme="majorHAnsi"/>
-                <w:color w:val="4472C4" w:themeColor="accent1"/>
-              </w:rPr>
-              <w:t>đồng</w:t>
-            </w:r>
-            <w:proofErr w:type="spellEnd"/>
+              <w:t>60,000,000,000 đồng</w:t>
+            </w:r>
           </w:p>
         </w:tc>
       </w:tr>
@@ -1865,35 +1283,7 @@
         <w:rPr>
           <w:rFonts w:asciiTheme="majorHAnsi" w:hAnsiTheme="majorHAnsi" w:cstheme="majorHAnsi"/>
         </w:rPr>
-        <w:t xml:space="preserve">Tình hình giao dịch tại BIDV Đồng Tháp: </w:t>
-      </w:r>
-      <w:proofErr w:type="spellStart"/>
-      <w:r>
-        <w:rPr>
-          <w:rFonts w:asciiTheme="majorHAnsi" w:hAnsiTheme="majorHAnsi" w:cstheme="majorHAnsi"/>
-        </w:rPr>
-        <w:t>Đến</w:t>
-      </w:r>
-      <w:proofErr w:type="spellEnd"/>
-      <w:r>
-        <w:rPr>
-          <w:rFonts w:asciiTheme="majorHAnsi" w:hAnsiTheme="majorHAnsi" w:cstheme="majorHAnsi"/>
-        </w:rPr>
-        <w:t xml:space="preserve"> </w:t>
-      </w:r>
-      <w:proofErr w:type="spellStart"/>
-      <w:r>
-        <w:rPr>
-          <w:rFonts w:asciiTheme="majorHAnsi" w:hAnsiTheme="majorHAnsi" w:cstheme="majorHAnsi"/>
-        </w:rPr>
-        <w:t>ngày</w:t>
-      </w:r>
-      <w:proofErr w:type="spellEnd"/>
-      <w:r>
-        <w:rPr>
-          <w:rFonts w:asciiTheme="majorHAnsi" w:hAnsiTheme="majorHAnsi" w:cstheme="majorHAnsi"/>
-        </w:rPr>
-        <w:t xml:space="preserve"> </w:t>
+        <w:t xml:space="preserve">Tình hình giao dịch tại BIDV Đồng Tháp: Đến ngày </w:t>
       </w:r>
       <w:r>
         <w:rPr>
@@ -1940,23 +1330,7 @@
           <w:rFonts w:asciiTheme="majorHAnsi" w:hAnsiTheme="majorHAnsi" w:cstheme="majorHAnsi"/>
           <w:color w:val="4472C4" w:themeColor="accent1"/>
         </w:rPr>
-        <w:t xml:space="preserve">38,731,972,700 </w:t>
-      </w:r>
-      <w:proofErr w:type="spellStart"/>
-      <w:r>
-        <w:rPr>
-          <w:rFonts w:asciiTheme="majorHAnsi" w:hAnsiTheme="majorHAnsi" w:cstheme="majorHAnsi"/>
-          <w:color w:val="4472C4" w:themeColor="accent1"/>
-        </w:rPr>
-        <w:t>đồng</w:t>
-      </w:r>
-      <w:proofErr w:type="spellEnd"/>
-      <w:r>
-        <w:rPr>
-          <w:rFonts w:asciiTheme="majorHAnsi" w:hAnsiTheme="majorHAnsi" w:cstheme="majorHAnsi"/>
-          <w:color w:val="4472C4" w:themeColor="accent1"/>
-        </w:rPr>
-        <w:t xml:space="preserve"> </w:t>
+        <w:t xml:space="preserve">38,731,972,700 đồng </w:t>
       </w:r>
     </w:p>
     <w:p>
@@ -1988,125 +1362,61 @@
         <w:rPr>
           <w:rFonts w:asciiTheme="majorHAnsi" w:hAnsiTheme="majorHAnsi" w:cstheme="majorHAnsi"/>
         </w:rPr>
-        <w:t xml:space="preserve">đến </w:t>
-      </w:r>
-      <w:proofErr w:type="spellStart"/>
-      <w:r>
-        <w:rPr>
-          <w:rFonts w:asciiTheme="majorHAnsi" w:hAnsiTheme="majorHAnsi" w:cstheme="majorHAnsi"/>
-        </w:rPr>
-        <w:t>hết</w:t>
-      </w:r>
-      <w:proofErr w:type="spellEnd"/>
+        <w:t>đến hết ngày 3</w:t>
+      </w:r>
+      <w:r>
+        <w:rPr>
+          <w:rFonts w:asciiTheme="majorHAnsi" w:hAnsiTheme="majorHAnsi" w:cstheme="majorHAnsi"/>
+        </w:rPr>
+        <w:t>1</w:t>
+      </w:r>
+      <w:r>
+        <w:rPr>
+          <w:rFonts w:asciiTheme="majorHAnsi" w:hAnsiTheme="majorHAnsi" w:cstheme="majorHAnsi"/>
+        </w:rPr>
+        <w:t>/</w:t>
+      </w:r>
+      <w:r>
+        <w:rPr>
+          <w:rFonts w:asciiTheme="majorHAnsi" w:hAnsiTheme="majorHAnsi" w:cstheme="majorHAnsi"/>
+        </w:rPr>
+        <w:t>12</w:t>
+      </w:r>
+      <w:r>
+        <w:rPr>
+          <w:rFonts w:asciiTheme="majorHAnsi" w:hAnsiTheme="majorHAnsi" w:cstheme="majorHAnsi"/>
+        </w:rPr>
+        <w:t>/202</w:t>
+      </w:r>
+      <w:r>
+        <w:rPr>
+          <w:rFonts w:asciiTheme="majorHAnsi" w:hAnsiTheme="majorHAnsi" w:cstheme="majorHAnsi"/>
+        </w:rPr>
+        <w:t>4</w:t>
+      </w:r>
       <w:r>
         <w:rPr>
           <w:rFonts w:asciiTheme="majorHAnsi" w:hAnsiTheme="majorHAnsi" w:cstheme="majorHAnsi"/>
         </w:rPr>
         <w:t xml:space="preserve"> </w:t>
       </w:r>
-      <w:proofErr w:type="spellStart"/>
-      <w:r>
-        <w:rPr>
-          <w:rFonts w:asciiTheme="majorHAnsi" w:hAnsiTheme="majorHAnsi" w:cstheme="majorHAnsi"/>
-        </w:rPr>
-        <w:t>ngày</w:t>
-      </w:r>
-      <w:proofErr w:type="spellEnd"/>
-      <w:r>
-        <w:rPr>
-          <w:rFonts w:asciiTheme="majorHAnsi" w:hAnsiTheme="majorHAnsi" w:cstheme="majorHAnsi"/>
-        </w:rPr>
-        <w:t xml:space="preserve"> 3</w:t>
-      </w:r>
-      <w:r>
-        <w:rPr>
-          <w:rFonts w:asciiTheme="majorHAnsi" w:hAnsiTheme="majorHAnsi" w:cstheme="majorHAnsi"/>
-        </w:rPr>
-        <w:t>1</w:t>
-      </w:r>
-      <w:r>
-        <w:rPr>
-          <w:rFonts w:asciiTheme="majorHAnsi" w:hAnsiTheme="majorHAnsi" w:cstheme="majorHAnsi"/>
-        </w:rPr>
-        <w:t>/</w:t>
-      </w:r>
-      <w:r>
-        <w:rPr>
-          <w:rFonts w:asciiTheme="majorHAnsi" w:hAnsiTheme="majorHAnsi" w:cstheme="majorHAnsi"/>
-        </w:rPr>
-        <w:t>12</w:t>
-      </w:r>
-      <w:r>
-        <w:rPr>
-          <w:rFonts w:asciiTheme="majorHAnsi" w:hAnsiTheme="majorHAnsi" w:cstheme="majorHAnsi"/>
-        </w:rPr>
-        <w:t>/202</w:t>
-      </w:r>
-      <w:r>
-        <w:rPr>
-          <w:rFonts w:asciiTheme="majorHAnsi" w:hAnsiTheme="majorHAnsi" w:cstheme="majorHAnsi"/>
-        </w:rPr>
-        <w:t>4</w:t>
-      </w:r>
-      <w:r>
-        <w:rPr>
-          <w:rFonts w:asciiTheme="majorHAnsi" w:hAnsiTheme="majorHAnsi" w:cstheme="majorHAnsi"/>
-        </w:rPr>
-        <w:t xml:space="preserve"> </w:t>
-      </w:r>
       <w:r>
         <w:rPr>
           <w:rFonts w:asciiTheme="majorHAnsi" w:hAnsiTheme="majorHAnsi" w:cstheme="majorHAnsi"/>
         </w:rPr>
         <w:t>(</w:t>
       </w:r>
-      <w:proofErr w:type="spellStart"/>
-      <w:r>
-        <w:rPr>
-          <w:rFonts w:asciiTheme="majorHAnsi" w:hAnsiTheme="majorHAnsi" w:cstheme="majorHAnsi"/>
-        </w:rPr>
-        <w:t>theo</w:t>
-      </w:r>
-      <w:proofErr w:type="spellEnd"/>
-      <w:r>
-        <w:rPr>
-          <w:rFonts w:asciiTheme="majorHAnsi" w:hAnsiTheme="majorHAnsi" w:cstheme="majorHAnsi"/>
-        </w:rPr>
-        <w:t xml:space="preserve"> </w:t>
-      </w:r>
-      <w:r>
-        <w:rPr>
-          <w:rFonts w:asciiTheme="majorHAnsi" w:hAnsiTheme="majorHAnsi" w:cstheme="majorHAnsi"/>
-        </w:rPr>
-        <w:t xml:space="preserve">BCTC </w:t>
-      </w:r>
-      <w:proofErr w:type="spellStart"/>
-      <w:r>
-        <w:rPr>
-          <w:rFonts w:asciiTheme="majorHAnsi" w:hAnsiTheme="majorHAnsi" w:cstheme="majorHAnsi"/>
-        </w:rPr>
-        <w:t>của</w:t>
-      </w:r>
-      <w:proofErr w:type="spellEnd"/>
-      <w:r>
-        <w:rPr>
-          <w:rFonts w:asciiTheme="majorHAnsi" w:hAnsiTheme="majorHAnsi" w:cstheme="majorHAnsi"/>
-        </w:rPr>
-        <w:t xml:space="preserve"> </w:t>
-      </w:r>
-      <w:proofErr w:type="spellStart"/>
-      <w:r>
-        <w:rPr>
-          <w:rFonts w:asciiTheme="majorHAnsi" w:hAnsiTheme="majorHAnsi" w:cstheme="majorHAnsi"/>
-        </w:rPr>
-        <w:t>công</w:t>
-      </w:r>
-      <w:proofErr w:type="spellEnd"/>
-      <w:r>
-        <w:rPr>
-          <w:rFonts w:asciiTheme="majorHAnsi" w:hAnsiTheme="majorHAnsi" w:cstheme="majorHAnsi"/>
-        </w:rPr>
-        <w:t xml:space="preserve"> ty)</w:t>
+      <w:r>
+        <w:rPr>
+          <w:rFonts w:asciiTheme="majorHAnsi" w:hAnsiTheme="majorHAnsi" w:cstheme="majorHAnsi"/>
+        </w:rPr>
+        <w:t xml:space="preserve">theo </w:t>
+      </w:r>
+      <w:r>
+        <w:rPr>
+          <w:rFonts w:asciiTheme="majorHAnsi" w:hAnsiTheme="majorHAnsi" w:cstheme="majorHAnsi"/>
+        </w:rPr>
+        <w:t>BCTC của công ty)</w:t>
       </w:r>
     </w:p>
     <w:p>
@@ -3029,37 +2339,12 @@
           <w:rFonts w:asciiTheme="majorHAnsi" w:hAnsiTheme="majorHAnsi" w:cstheme="majorHAnsi"/>
         </w:rPr>
       </w:pPr>
-      <w:proofErr w:type="spellStart"/>
       <w:r>
         <w:rPr>
           <w:rFonts w:asciiTheme="majorHAnsi" w:hAnsiTheme="majorHAnsi" w:cstheme="majorHAnsi"/>
           <w:u w:val="single"/>
         </w:rPr>
-        <w:t>Kết</w:t>
-      </w:r>
-      <w:proofErr w:type="spellEnd"/>
-      <w:r>
-        <w:rPr>
-          <w:rFonts w:asciiTheme="majorHAnsi" w:hAnsiTheme="majorHAnsi" w:cstheme="majorHAnsi"/>
-          <w:u w:val="single"/>
-        </w:rPr>
-        <w:t xml:space="preserve"> </w:t>
-      </w:r>
-      <w:proofErr w:type="spellStart"/>
-      <w:r>
-        <w:rPr>
-          <w:rFonts w:asciiTheme="majorHAnsi" w:hAnsiTheme="majorHAnsi" w:cstheme="majorHAnsi"/>
-          <w:u w:val="single"/>
-        </w:rPr>
-        <w:t>luận</w:t>
-      </w:r>
-      <w:proofErr w:type="spellEnd"/>
-      <w:r>
-        <w:rPr>
-          <w:rFonts w:asciiTheme="majorHAnsi" w:hAnsiTheme="majorHAnsi" w:cstheme="majorHAnsi"/>
-          <w:u w:val="single"/>
-        </w:rPr>
-        <w:t>:</w:t>
+        <w:t>Kết luận:</w:t>
       </w:r>
     </w:p>
     <w:p>
@@ -3740,56 +3025,12 @@
                 <w:rFonts w:asciiTheme="majorHAnsi" w:hAnsiTheme="majorHAnsi" w:cstheme="majorHAnsi"/>
               </w:rPr>
             </w:pPr>
-            <w:proofErr w:type="spellStart"/>
-            <w:r>
-              <w:rPr>
-                <w:rFonts w:asciiTheme="majorHAnsi" w:hAnsiTheme="majorHAnsi" w:cstheme="majorHAnsi"/>
-              </w:rPr>
-              <w:t>Lãi</w:t>
-            </w:r>
-            <w:proofErr w:type="spellEnd"/>
-            <w:r>
-              <w:rPr>
-                <w:rFonts w:asciiTheme="majorHAnsi" w:hAnsiTheme="majorHAnsi" w:cstheme="majorHAnsi"/>
-              </w:rPr>
-              <w:t xml:space="preserve"> </w:t>
-            </w:r>
-            <w:proofErr w:type="spellStart"/>
-            <w:r>
-              <w:rPr>
-                <w:rFonts w:asciiTheme="majorHAnsi" w:hAnsiTheme="majorHAnsi" w:cstheme="majorHAnsi"/>
-              </w:rPr>
-              <w:t>suất</w:t>
-            </w:r>
-            <w:proofErr w:type="spellEnd"/>
-            <w:r>
-              <w:rPr>
-                <w:rFonts w:asciiTheme="majorHAnsi" w:hAnsiTheme="majorHAnsi" w:cstheme="majorHAnsi"/>
-              </w:rPr>
-              <w:t xml:space="preserve"> </w:t>
-            </w:r>
-            <w:proofErr w:type="spellStart"/>
-            <w:r>
-              <w:rPr>
-                <w:rFonts w:asciiTheme="majorHAnsi" w:hAnsiTheme="majorHAnsi" w:cstheme="majorHAnsi"/>
-              </w:rPr>
-              <w:t>cho</w:t>
-            </w:r>
-            <w:proofErr w:type="spellEnd"/>
-            <w:r>
-              <w:rPr>
-                <w:rFonts w:asciiTheme="majorHAnsi" w:hAnsiTheme="majorHAnsi" w:cstheme="majorHAnsi"/>
-              </w:rPr>
-              <w:t xml:space="preserve"> </w:t>
-            </w:r>
-            <w:proofErr w:type="spellStart"/>
-            <w:r>
-              <w:rPr>
-                <w:rFonts w:asciiTheme="majorHAnsi" w:hAnsiTheme="majorHAnsi" w:cstheme="majorHAnsi"/>
-              </w:rPr>
-              <w:t>vay</w:t>
-            </w:r>
-            <w:proofErr w:type="spellEnd"/>
+            <w:r>
+              <w:rPr>
+                <w:rFonts w:asciiTheme="majorHAnsi" w:hAnsiTheme="majorHAnsi" w:cstheme="majorHAnsi"/>
+              </w:rPr>
+              <w:t>Lãi suất cho vay</w:t>
+            </w:r>
           </w:p>
         </w:tc>
         <w:tc>
@@ -3812,16 +3053,8 @@
               <w:rPr>
                 <w:rFonts w:asciiTheme="majorHAnsi" w:hAnsiTheme="majorHAnsi" w:cstheme="majorHAnsi"/>
               </w:rPr>
-              <w:t xml:space="preserve">7,0%/ </w:t>
-            </w:r>
-            <w:proofErr w:type="spellStart"/>
-            <w:r>
-              <w:rPr>
-                <w:rFonts w:asciiTheme="majorHAnsi" w:hAnsiTheme="majorHAnsi" w:cstheme="majorHAnsi"/>
-              </w:rPr>
-              <w:t>năm</w:t>
-            </w:r>
-            <w:proofErr w:type="spellEnd"/>
+              <w:t>7,0%/ năm</w:t>
+            </w:r>
           </w:p>
         </w:tc>
         <w:tc>
@@ -3845,217 +3078,13 @@
               <w:rPr>
                 <w:rFonts w:asciiTheme="majorHAnsi" w:hAnsiTheme="majorHAnsi" w:cstheme="majorHAnsi"/>
               </w:rPr>
-              <w:t>(</w:t>
-            </w:r>
-            <w:proofErr w:type="spellStart"/>
-            <w:r>
-              <w:rPr>
-                <w:rFonts w:asciiTheme="majorHAnsi" w:hAnsiTheme="majorHAnsi" w:cstheme="majorHAnsi"/>
-              </w:rPr>
-              <w:t>theo</w:t>
-            </w:r>
-            <w:proofErr w:type="spellEnd"/>
-            <w:r>
-              <w:rPr>
-                <w:rFonts w:asciiTheme="majorHAnsi" w:hAnsiTheme="majorHAnsi" w:cstheme="majorHAnsi"/>
-              </w:rPr>
-              <w:t xml:space="preserve"> </w:t>
-            </w:r>
-            <w:proofErr w:type="spellStart"/>
-            <w:r>
-              <w:rPr>
-                <w:rFonts w:asciiTheme="majorHAnsi" w:hAnsiTheme="majorHAnsi" w:cstheme="majorHAnsi"/>
-              </w:rPr>
-              <w:t>tờ</w:t>
-            </w:r>
-            <w:proofErr w:type="spellEnd"/>
-            <w:r>
-              <w:rPr>
-                <w:rFonts w:asciiTheme="majorHAnsi" w:hAnsiTheme="majorHAnsi" w:cstheme="majorHAnsi"/>
-              </w:rPr>
-              <w:t xml:space="preserve"> </w:t>
-            </w:r>
-            <w:proofErr w:type="spellStart"/>
-            <w:r>
-              <w:rPr>
-                <w:rFonts w:asciiTheme="majorHAnsi" w:hAnsiTheme="majorHAnsi" w:cstheme="majorHAnsi"/>
-              </w:rPr>
-              <w:t>trình</w:t>
-            </w:r>
-            <w:proofErr w:type="spellEnd"/>
-            <w:r>
-              <w:rPr>
-                <w:rFonts w:asciiTheme="majorHAnsi" w:hAnsiTheme="majorHAnsi" w:cstheme="majorHAnsi"/>
-              </w:rPr>
-              <w:t xml:space="preserve"> </w:t>
-            </w:r>
-            <w:proofErr w:type="spellStart"/>
-            <w:r>
-              <w:rPr>
-                <w:rFonts w:asciiTheme="majorHAnsi" w:hAnsiTheme="majorHAnsi" w:cstheme="majorHAnsi"/>
-              </w:rPr>
-              <w:t>số</w:t>
-            </w:r>
-            <w:proofErr w:type="spellEnd"/>
-            <w:r>
-              <w:rPr>
-                <w:rFonts w:asciiTheme="majorHAnsi" w:hAnsiTheme="majorHAnsi" w:cstheme="majorHAnsi"/>
-              </w:rPr>
-              <w:t xml:space="preserve"> 986/</w:t>
-            </w:r>
-            <w:proofErr w:type="spellStart"/>
-            <w:r>
-              <w:rPr>
-                <w:rFonts w:asciiTheme="majorHAnsi" w:hAnsiTheme="majorHAnsi" w:cstheme="majorHAnsi"/>
-              </w:rPr>
-              <w:t>TTr</w:t>
-            </w:r>
-            <w:proofErr w:type="spellEnd"/>
-            <w:r>
-              <w:rPr>
-                <w:rFonts w:asciiTheme="majorHAnsi" w:hAnsiTheme="majorHAnsi" w:cstheme="majorHAnsi"/>
-              </w:rPr>
-              <w:t xml:space="preserve">-KHND </w:t>
-            </w:r>
-            <w:proofErr w:type="spellStart"/>
-            <w:r>
-              <w:rPr>
-                <w:rFonts w:asciiTheme="majorHAnsi" w:hAnsiTheme="majorHAnsi" w:cstheme="majorHAnsi"/>
-              </w:rPr>
-              <w:t>ngày</w:t>
-            </w:r>
-            <w:proofErr w:type="spellEnd"/>
-            <w:r>
-              <w:rPr>
-                <w:rFonts w:asciiTheme="majorHAnsi" w:hAnsiTheme="majorHAnsi" w:cstheme="majorHAnsi"/>
-              </w:rPr>
-              <w:t xml:space="preserve"> 25/11/2025, </w:t>
-            </w:r>
-            <w:proofErr w:type="spellStart"/>
-            <w:r>
-              <w:rPr>
-                <w:rFonts w:asciiTheme="majorHAnsi" w:hAnsiTheme="majorHAnsi" w:cstheme="majorHAnsi"/>
-              </w:rPr>
-              <w:t>áp</w:t>
-            </w:r>
-            <w:proofErr w:type="spellEnd"/>
-            <w:r>
-              <w:rPr>
-                <w:rFonts w:asciiTheme="majorHAnsi" w:hAnsiTheme="majorHAnsi" w:cstheme="majorHAnsi"/>
-              </w:rPr>
-              <w:t xml:space="preserve"> </w:t>
-            </w:r>
-            <w:proofErr w:type="spellStart"/>
-            <w:r>
-              <w:rPr>
-                <w:rFonts w:asciiTheme="majorHAnsi" w:hAnsiTheme="majorHAnsi" w:cstheme="majorHAnsi"/>
-              </w:rPr>
-              <w:t>dụng</w:t>
-            </w:r>
-            <w:proofErr w:type="spellEnd"/>
-            <w:r>
-              <w:rPr>
-                <w:rFonts w:asciiTheme="majorHAnsi" w:hAnsiTheme="majorHAnsi" w:cstheme="majorHAnsi"/>
-              </w:rPr>
-              <w:t xml:space="preserve"> </w:t>
-            </w:r>
-            <w:proofErr w:type="spellStart"/>
-            <w:r>
-              <w:rPr>
-                <w:rFonts w:asciiTheme="majorHAnsi" w:hAnsiTheme="majorHAnsi" w:cstheme="majorHAnsi"/>
-              </w:rPr>
-              <w:t>cho</w:t>
-            </w:r>
-            <w:proofErr w:type="spellEnd"/>
-            <w:r>
-              <w:rPr>
-                <w:rFonts w:asciiTheme="majorHAnsi" w:hAnsiTheme="majorHAnsi" w:cstheme="majorHAnsi"/>
-              </w:rPr>
-              <w:t xml:space="preserve"> </w:t>
-            </w:r>
-            <w:proofErr w:type="spellStart"/>
-            <w:r>
-              <w:rPr>
-                <w:rFonts w:asciiTheme="majorHAnsi" w:hAnsiTheme="majorHAnsi" w:cstheme="majorHAnsi"/>
-              </w:rPr>
-              <w:t>vay</w:t>
-            </w:r>
-            <w:proofErr w:type="spellEnd"/>
-            <w:r>
-              <w:rPr>
-                <w:rFonts w:asciiTheme="majorHAnsi" w:hAnsiTheme="majorHAnsi" w:cstheme="majorHAnsi"/>
-              </w:rPr>
-              <w:t xml:space="preserve"> </w:t>
-            </w:r>
-            <w:proofErr w:type="spellStart"/>
-            <w:r>
-              <w:rPr>
-                <w:rFonts w:asciiTheme="majorHAnsi" w:hAnsiTheme="majorHAnsi" w:cstheme="majorHAnsi"/>
-              </w:rPr>
-              <w:t>thông</w:t>
-            </w:r>
-            <w:proofErr w:type="spellEnd"/>
-            <w:r>
-              <w:rPr>
-                <w:rFonts w:asciiTheme="majorHAnsi" w:hAnsiTheme="majorHAnsi" w:cstheme="majorHAnsi"/>
-              </w:rPr>
-              <w:t xml:space="preserve"> </w:t>
-            </w:r>
-            <w:proofErr w:type="spellStart"/>
-            <w:r>
-              <w:rPr>
-                <w:rFonts w:asciiTheme="majorHAnsi" w:hAnsiTheme="majorHAnsi" w:cstheme="majorHAnsi"/>
-              </w:rPr>
-              <w:t>thường</w:t>
-            </w:r>
-            <w:proofErr w:type="spellEnd"/>
-            <w:r>
-              <w:rPr>
-                <w:rFonts w:asciiTheme="majorHAnsi" w:hAnsiTheme="majorHAnsi" w:cstheme="majorHAnsi"/>
-              </w:rPr>
-              <w:t xml:space="preserve">, </w:t>
-            </w:r>
-            <w:proofErr w:type="spellStart"/>
-            <w:r>
-              <w:rPr>
-                <w:rFonts w:asciiTheme="majorHAnsi" w:hAnsiTheme="majorHAnsi" w:cstheme="majorHAnsi"/>
-              </w:rPr>
-              <w:t>đảm</w:t>
-            </w:r>
-            <w:proofErr w:type="spellEnd"/>
-            <w:r>
-              <w:rPr>
-                <w:rFonts w:asciiTheme="majorHAnsi" w:hAnsiTheme="majorHAnsi" w:cstheme="majorHAnsi"/>
-              </w:rPr>
-              <w:t xml:space="preserve"> </w:t>
-            </w:r>
-            <w:proofErr w:type="spellStart"/>
-            <w:r>
-              <w:rPr>
-                <w:rFonts w:asciiTheme="majorHAnsi" w:hAnsiTheme="majorHAnsi" w:cstheme="majorHAnsi"/>
-              </w:rPr>
-              <w:t>bảo</w:t>
-            </w:r>
-            <w:proofErr w:type="spellEnd"/>
-            <w:r>
-              <w:rPr>
-                <w:rFonts w:asciiTheme="majorHAnsi" w:hAnsiTheme="majorHAnsi" w:cstheme="majorHAnsi"/>
-              </w:rPr>
-              <w:t xml:space="preserve"> NIM </w:t>
-            </w:r>
-            <w:proofErr w:type="spellStart"/>
-            <w:r>
-              <w:rPr>
-                <w:rFonts w:asciiTheme="majorHAnsi" w:hAnsiTheme="majorHAnsi" w:cstheme="majorHAnsi"/>
-              </w:rPr>
-              <w:t>tối</w:t>
-            </w:r>
-            <w:proofErr w:type="spellEnd"/>
-            <w:r>
-              <w:rPr>
-                <w:rFonts w:asciiTheme="majorHAnsi" w:hAnsiTheme="majorHAnsi" w:cstheme="majorHAnsi"/>
-              </w:rPr>
-              <w:t xml:space="preserve"> thiểu theo tờ trình được phê duyệt).</w:t>
+              <w:t>(theo tờ trình số 986/TTr-KHND ngày 25/11/2025, áp dụng cho vay</w:t>
+            </w:r>
+            <w:r>
+              <w:rPr>
+                <w:rFonts w:asciiTheme="majorHAnsi" w:hAnsiTheme="majorHAnsi" w:cstheme="majorHAnsi"/>
+              </w:rPr>
+              <w:t xml:space="preserve"> thông thường, đảm bảo NIM tối thiểu theo tờ trình được phê duyệt).</w:t>
             </w:r>
           </w:p>
         </w:tc>
@@ -4173,61 +3202,11 @@
                 <w:rFonts w:asciiTheme="majorHAnsi" w:hAnsiTheme="majorHAnsi" w:cstheme="majorHAnsi"/>
               </w:rPr>
             </w:pPr>
-            <w:proofErr w:type="spellStart"/>
-            <w:r>
-              <w:rPr>
-                <w:rFonts w:asciiTheme="majorHAnsi" w:hAnsiTheme="majorHAnsi" w:cstheme="majorHAnsi"/>
-              </w:rPr>
-              <w:t>Chênh</w:t>
-            </w:r>
-            <w:proofErr w:type="spellEnd"/>
-            <w:r>
-              <w:rPr>
-                <w:rFonts w:asciiTheme="majorHAnsi" w:hAnsiTheme="majorHAnsi" w:cstheme="majorHAnsi"/>
-              </w:rPr>
-              <w:t xml:space="preserve"> </w:t>
-            </w:r>
-            <w:proofErr w:type="spellStart"/>
-            <w:r>
-              <w:rPr>
-                <w:rFonts w:asciiTheme="majorHAnsi" w:hAnsiTheme="majorHAnsi" w:cstheme="majorHAnsi"/>
-              </w:rPr>
-              <w:t>lệch</w:t>
-            </w:r>
-            <w:proofErr w:type="spellEnd"/>
-            <w:r>
-              <w:rPr>
-                <w:rFonts w:asciiTheme="majorHAnsi" w:hAnsiTheme="majorHAnsi" w:cstheme="majorHAnsi"/>
-              </w:rPr>
-              <w:t xml:space="preserve"> </w:t>
-            </w:r>
-            <w:proofErr w:type="spellStart"/>
-            <w:r>
-              <w:rPr>
-                <w:rFonts w:asciiTheme="majorHAnsi" w:hAnsiTheme="majorHAnsi" w:cstheme="majorHAnsi"/>
-              </w:rPr>
-              <w:t>thu</w:t>
-            </w:r>
-            <w:proofErr w:type="spellEnd"/>
-            <w:r>
-              <w:rPr>
-                <w:rFonts w:asciiTheme="majorHAnsi" w:hAnsiTheme="majorHAnsi" w:cstheme="majorHAnsi"/>
-              </w:rPr>
-              <w:t xml:space="preserve"> </w:t>
-            </w:r>
-            <w:proofErr w:type="spellStart"/>
-            <w:r>
-              <w:rPr>
-                <w:rFonts w:asciiTheme="majorHAnsi" w:hAnsiTheme="majorHAnsi" w:cstheme="majorHAnsi"/>
-              </w:rPr>
-              <w:t>được</w:t>
-            </w:r>
-            <w:proofErr w:type="spellEnd"/>
-            <w:r>
-              <w:rPr>
-                <w:rFonts w:asciiTheme="majorHAnsi" w:hAnsiTheme="majorHAnsi" w:cstheme="majorHAnsi"/>
-              </w:rPr>
-              <w:t xml:space="preserve"> </w:t>
+            <w:r>
+              <w:rPr>
+                <w:rFonts w:asciiTheme="majorHAnsi" w:hAnsiTheme="majorHAnsi" w:cstheme="majorHAnsi"/>
+              </w:rPr>
+              <w:t xml:space="preserve">Chênh lệch thu được </w:t>
             </w:r>
           </w:p>
         </w:tc>
@@ -4374,115 +3353,71 @@
         <w:rPr>
           <w:rFonts w:asciiTheme="majorHAnsi" w:hAnsiTheme="majorHAnsi" w:cstheme="majorHAnsi"/>
         </w:rPr>
-        <w:t xml:space="preserve">Tổng HMTD đã sử dụng tại BIDV Đồng Tháp (kể cả khoản giải ngân theo </w:t>
-      </w:r>
-      <w:proofErr w:type="spellStart"/>
-      <w:r>
-        <w:rPr>
-          <w:rFonts w:asciiTheme="majorHAnsi" w:hAnsiTheme="majorHAnsi" w:cstheme="majorHAnsi"/>
-        </w:rPr>
-        <w:t>đề</w:t>
-      </w:r>
-      <w:proofErr w:type="spellEnd"/>
-      <w:r>
-        <w:rPr>
-          <w:rFonts w:asciiTheme="majorHAnsi" w:hAnsiTheme="majorHAnsi" w:cstheme="majorHAnsi"/>
+        <w:t xml:space="preserve">Tổng HMTD đã sử dụng tại BIDV Đồng Tháp (kể cả khoản giải ngân theo đề xuất này): </w:t>
+      </w:r>
+      <w:r>
+        <w:rPr>
+          <w:rFonts w:asciiTheme="majorHAnsi" w:hAnsiTheme="majorHAnsi" w:cstheme="majorHAnsi"/>
+          <w:color w:val="4472C4" w:themeColor="accent1"/>
+        </w:rPr>
+        <w:t>42</w:t>
+      </w:r>
+      <w:r>
+        <w:rPr>
+          <w:rFonts w:asciiTheme="majorHAnsi" w:hAnsiTheme="majorHAnsi" w:cstheme="majorHAnsi"/>
+          <w:color w:val="4472C4" w:themeColor="accent1"/>
+        </w:rPr>
+        <w:t>,</w:t>
+      </w:r>
+      <w:r>
+        <w:rPr>
+          <w:rFonts w:asciiTheme="majorHAnsi" w:hAnsiTheme="majorHAnsi" w:cstheme="majorHAnsi"/>
+          <w:color w:val="4472C4" w:themeColor="accent1"/>
+        </w:rPr>
+        <w:t>421</w:t>
+      </w:r>
+      <w:r>
+        <w:rPr>
+          <w:rFonts w:asciiTheme="majorHAnsi" w:hAnsiTheme="majorHAnsi" w:cstheme="majorHAnsi"/>
+          <w:color w:val="4472C4" w:themeColor="accent1"/>
+        </w:rPr>
+        <w:t>,</w:t>
+      </w:r>
+      <w:r>
+        <w:rPr>
+          <w:rFonts w:asciiTheme="majorHAnsi" w:hAnsiTheme="majorHAnsi" w:cstheme="majorHAnsi"/>
+          <w:color w:val="4472C4" w:themeColor="accent1"/>
+        </w:rPr>
+        <w:t>252</w:t>
+      </w:r>
+      <w:r>
+        <w:rPr>
+          <w:rFonts w:asciiTheme="majorHAnsi" w:hAnsiTheme="majorHAnsi" w:cstheme="majorHAnsi"/>
+          <w:color w:val="4472C4" w:themeColor="accent1"/>
+        </w:rPr>
+        <w:t>,</w:t>
+      </w:r>
+      <w:r>
+        <w:rPr>
+          <w:rFonts w:asciiTheme="majorHAnsi" w:hAnsiTheme="majorHAnsi" w:cstheme="majorHAnsi"/>
+          <w:color w:val="4472C4" w:themeColor="accent1"/>
+        </w:rPr>
+        <w:t>700</w:t>
+      </w:r>
+      <w:r>
+        <w:rPr>
+          <w:rFonts w:asciiTheme="majorHAnsi" w:hAnsiTheme="majorHAnsi" w:cstheme="majorHAnsi"/>
+          <w:color w:val="4472C4" w:themeColor="accent1"/>
         </w:rPr>
         <w:t xml:space="preserve"> </w:t>
       </w:r>
-      <w:proofErr w:type="spellStart"/>
-      <w:r>
-        <w:rPr>
-          <w:rFonts w:asciiTheme="majorHAnsi" w:hAnsiTheme="majorHAnsi" w:cstheme="majorHAnsi"/>
-        </w:rPr>
-        <w:t>xuất</w:t>
-      </w:r>
-      <w:proofErr w:type="spellEnd"/>
-      <w:r>
-        <w:rPr>
-          <w:rFonts w:asciiTheme="majorHAnsi" w:hAnsiTheme="majorHAnsi" w:cstheme="majorHAnsi"/>
-        </w:rPr>
-        <w:t xml:space="preserve"> </w:t>
-      </w:r>
-      <w:proofErr w:type="spellStart"/>
-      <w:r>
-        <w:rPr>
-          <w:rFonts w:asciiTheme="majorHAnsi" w:hAnsiTheme="majorHAnsi" w:cstheme="majorHAnsi"/>
-        </w:rPr>
-        <w:t>này</w:t>
-      </w:r>
-      <w:proofErr w:type="spellEnd"/>
-      <w:r>
-        <w:rPr>
-          <w:rFonts w:asciiTheme="majorHAnsi" w:hAnsiTheme="majorHAnsi" w:cstheme="majorHAnsi"/>
-        </w:rPr>
-        <w:t xml:space="preserve">): </w:t>
-      </w:r>
       <w:r>
         <w:rPr>
           <w:rFonts w:asciiTheme="majorHAnsi" w:hAnsiTheme="majorHAnsi" w:cstheme="majorHAnsi"/>
           <w:color w:val="4472C4" w:themeColor="accent1"/>
         </w:rPr>
-        <w:t>42</w:t>
-      </w:r>
-      <w:r>
-        <w:rPr>
-          <w:rFonts w:asciiTheme="majorHAnsi" w:hAnsiTheme="majorHAnsi" w:cstheme="majorHAnsi"/>
-          <w:color w:val="4472C4" w:themeColor="accent1"/>
-        </w:rPr>
-        <w:t>,</w:t>
-      </w:r>
-      <w:r>
-        <w:rPr>
-          <w:rFonts w:asciiTheme="majorHAnsi" w:hAnsiTheme="majorHAnsi" w:cstheme="majorHAnsi"/>
-          <w:color w:val="4472C4" w:themeColor="accent1"/>
-        </w:rPr>
-        <w:t>421</w:t>
-      </w:r>
-      <w:r>
-        <w:rPr>
-          <w:rFonts w:asciiTheme="majorHAnsi" w:hAnsiTheme="majorHAnsi" w:cstheme="majorHAnsi"/>
-          <w:color w:val="4472C4" w:themeColor="accent1"/>
-        </w:rPr>
-        <w:t>,</w:t>
-      </w:r>
-      <w:r>
-        <w:rPr>
-          <w:rFonts w:asciiTheme="majorHAnsi" w:hAnsiTheme="majorHAnsi" w:cstheme="majorHAnsi"/>
-          <w:color w:val="4472C4" w:themeColor="accent1"/>
-        </w:rPr>
-        <w:t>252</w:t>
-      </w:r>
-      <w:r>
-        <w:rPr>
-          <w:rFonts w:asciiTheme="majorHAnsi" w:hAnsiTheme="majorHAnsi" w:cstheme="majorHAnsi"/>
-          <w:color w:val="4472C4" w:themeColor="accent1"/>
-        </w:rPr>
-        <w:t>,</w:t>
-      </w:r>
-      <w:r>
-        <w:rPr>
-          <w:rFonts w:asciiTheme="majorHAnsi" w:hAnsiTheme="majorHAnsi" w:cstheme="majorHAnsi"/>
-          <w:color w:val="4472C4" w:themeColor="accent1"/>
-        </w:rPr>
-        <w:t>700</w:t>
-      </w:r>
-      <w:r>
-        <w:rPr>
-          <w:rFonts w:asciiTheme="majorHAnsi" w:hAnsiTheme="majorHAnsi" w:cstheme="majorHAnsi"/>
-          <w:color w:val="4472C4" w:themeColor="accent1"/>
-        </w:rPr>
-        <w:t xml:space="preserve"> </w:t>
-      </w:r>
-      <w:proofErr w:type="spellStart"/>
-      <w:r>
-        <w:rPr>
-          <w:rFonts w:asciiTheme="majorHAnsi" w:hAnsiTheme="majorHAnsi" w:cstheme="majorHAnsi"/>
-          <w:color w:val="4472C4" w:themeColor="accent1"/>
-        </w:rPr>
         <w:t>đồng</w:t>
       </w:r>
-      <w:proofErr w:type="spellEnd"/>
     </w:p>
     <w:p>
       <w:pPr>
@@ -4543,71 +3478,7 @@
           <w:rFonts w:asciiTheme="majorHAnsi" w:hAnsiTheme="majorHAnsi" w:cstheme="majorHAnsi"/>
           <w:color w:val="FF0000"/>
         </w:rPr>
-        <w:t xml:space="preserve">Mục đích: Vay thanh toán tiền còn lại tương đương 75% giá trị đối với số lượng xe mà Cty TNHH Kinh doanh Thương mại và Dịch vụ Vinfast (VINFAST) đã giao cho khách hàng và bộ hồ sơ xe tương ứng đã được giao cho BIDV Đồng Tháp, </w:t>
-      </w:r>
-      <w:proofErr w:type="spellStart"/>
-      <w:r>
-        <w:rPr>
-          <w:rFonts w:asciiTheme="majorHAnsi" w:hAnsiTheme="majorHAnsi" w:cstheme="majorHAnsi"/>
-          <w:color w:val="FF0000"/>
-        </w:rPr>
-        <w:t>cụ</w:t>
-      </w:r>
-      <w:proofErr w:type="spellEnd"/>
-      <w:r>
-        <w:rPr>
-          <w:rFonts w:asciiTheme="majorHAnsi" w:hAnsiTheme="majorHAnsi" w:cstheme="majorHAnsi"/>
-          <w:color w:val="FF0000"/>
-        </w:rPr>
-        <w:t xml:space="preserve"> </w:t>
-      </w:r>
-      <w:proofErr w:type="spellStart"/>
-      <w:r>
-        <w:rPr>
-          <w:rFonts w:asciiTheme="majorHAnsi" w:hAnsiTheme="majorHAnsi" w:cstheme="majorHAnsi"/>
-          <w:color w:val="FF0000"/>
-        </w:rPr>
-        <w:t>thể</w:t>
-      </w:r>
-      <w:proofErr w:type="spellEnd"/>
-      <w:r>
-        <w:rPr>
-          <w:rFonts w:asciiTheme="majorHAnsi" w:hAnsiTheme="majorHAnsi" w:cstheme="majorHAnsi"/>
-          <w:color w:val="FF0000"/>
-        </w:rPr>
-        <w:t xml:space="preserve"> </w:t>
-      </w:r>
-      <w:proofErr w:type="spellStart"/>
-      <w:r>
-        <w:rPr>
-          <w:rFonts w:asciiTheme="majorHAnsi" w:hAnsiTheme="majorHAnsi" w:cstheme="majorHAnsi"/>
-          <w:color w:val="FF0000"/>
-        </w:rPr>
-        <w:t>như</w:t>
-      </w:r>
-      <w:proofErr w:type="spellEnd"/>
-      <w:r>
-        <w:rPr>
-          <w:rFonts w:asciiTheme="majorHAnsi" w:hAnsiTheme="majorHAnsi" w:cstheme="majorHAnsi"/>
-          <w:color w:val="FF0000"/>
-        </w:rPr>
-        <w:t xml:space="preserve"> </w:t>
-      </w:r>
-      <w:proofErr w:type="spellStart"/>
-      <w:r>
-        <w:rPr>
-          <w:rFonts w:asciiTheme="majorHAnsi" w:hAnsiTheme="majorHAnsi" w:cstheme="majorHAnsi"/>
-          <w:color w:val="FF0000"/>
-        </w:rPr>
-        <w:t>sau</w:t>
-      </w:r>
-      <w:proofErr w:type="spellEnd"/>
-      <w:r>
-        <w:rPr>
-          <w:rFonts w:asciiTheme="majorHAnsi" w:hAnsiTheme="majorHAnsi" w:cstheme="majorHAnsi"/>
-          <w:color w:val="FF0000"/>
-        </w:rPr>
-        <w:t>:</w:t>
+        <w:t>Mục đích: Vay thanh toán tiền còn lại tương đương 75% giá trị đối với số lượng xe mà Cty TNHH Kinh doanh Thương mại và Dịch vụ Vinfast (VINFAST) đã giao cho khách hàng và bộ hồ sơ xe tương ứng đã được giao cho BIDV Đồng Tháp, cụ thể như sau:</w:t>
       </w:r>
     </w:p>
     <w:p>
@@ -4622,8 +3493,8 @@
     <w:tbl>
       <w:tblPr>
         <w:tblStyle w:val="TableGrid0"/>
-        <w:tblW w:w="8603" w:type="dxa"/>
-        <w:tblInd w:w="319" w:type="dxa"/>
+        <w:tblW w:w="9720" w:type="dxa"/>
+        <w:tblInd w:w="-459" w:type="dxa"/>
         <w:tblCellMar>
           <w:top w:w="106" w:type="dxa"/>
           <w:left w:w="35" w:type="dxa"/>
@@ -4631,10 +3502,10 @@
         <w:tblLook w:val="04A0" w:firstRow="1" w:lastRow="0" w:firstColumn="1" w:lastColumn="0" w:noHBand="0" w:noVBand="1"/>
       </w:tblPr>
       <w:tblGrid>
-        <w:gridCol w:w="356"/>
-        <w:gridCol w:w="2718"/>
+        <w:gridCol w:w="540"/>
+        <w:gridCol w:w="3312"/>
         <w:gridCol w:w="1701"/>
-        <w:gridCol w:w="3828"/>
+        <w:gridCol w:w="4167"/>
       </w:tblGrid>
       <w:tr>
         <w:trPr>
@@ -4642,7 +3513,7 @@
         </w:trPr>
         <w:tc>
           <w:tcPr>
-            <w:tcW w:w="356" w:type="dxa"/>
+            <w:tcW w:w="540" w:type="dxa"/>
             <w:tcBorders>
               <w:top w:val="single" w:sz="7" w:space="0" w:color="000000"/>
               <w:left w:val="single" w:sz="7" w:space="0" w:color="000000"/>
@@ -4668,7 +3539,7 @@
         </w:tc>
         <w:tc>
           <w:tcPr>
-            <w:tcW w:w="2718" w:type="dxa"/>
+            <w:tcW w:w="3312" w:type="dxa"/>
             <w:tcBorders>
               <w:top w:val="single" w:sz="7" w:space="0" w:color="000000"/>
               <w:left w:val="single" w:sz="7" w:space="0" w:color="000000"/>
@@ -4723,7 +3594,7 @@
         </w:tc>
         <w:tc>
           <w:tcPr>
-            <w:tcW w:w="3828" w:type="dxa"/>
+            <w:tcW w:w="4167" w:type="dxa"/>
             <w:tcBorders>
               <w:top w:val="single" w:sz="7" w:space="0" w:color="000000"/>
               <w:left w:val="single" w:sz="7" w:space="0" w:color="000000"/>
@@ -4756,7 +3627,7 @@
         </w:trPr>
         <w:tc>
           <w:tcPr>
-            <w:tcW w:w="356" w:type="dxa"/>
+            <w:tcW w:w="540" w:type="dxa"/>
             <w:tcBorders>
               <w:top w:val="single" w:sz="7" w:space="0" w:color="000000"/>
               <w:left w:val="single" w:sz="7" w:space="0" w:color="000000"/>
@@ -4784,7 +3655,7 @@
         </w:tc>
         <w:tc>
           <w:tcPr>
-            <w:tcW w:w="2718" w:type="dxa"/>
+            <w:tcW w:w="3312" w:type="dxa"/>
             <w:tcBorders>
               <w:top w:val="single" w:sz="7" w:space="0" w:color="000000"/>
               <w:left w:val="single" w:sz="7" w:space="0" w:color="000000"/>
@@ -4851,7 +3722,7 @@
         </w:tc>
         <w:tc>
           <w:tcPr>
-            <w:tcW w:w="3828" w:type="dxa"/>
+            <w:tcW w:w="4167" w:type="dxa"/>
             <w:tcBorders>
               <w:top w:val="single" w:sz="7" w:space="0" w:color="000000"/>
               <w:left w:val="single" w:sz="7" w:space="0" w:color="000000"/>
@@ -4908,7 +3779,7 @@
         </w:trPr>
         <w:tc>
           <w:tcPr>
-            <w:tcW w:w="356" w:type="dxa"/>
+            <w:tcW w:w="540" w:type="dxa"/>
             <w:tcBorders>
               <w:top w:val="single" w:sz="7" w:space="0" w:color="000000"/>
               <w:left w:val="single" w:sz="7" w:space="0" w:color="000000"/>
@@ -4936,7 +3807,7 @@
         </w:tc>
         <w:tc>
           <w:tcPr>
-            <w:tcW w:w="2718" w:type="dxa"/>
+            <w:tcW w:w="3312" w:type="dxa"/>
             <w:tcBorders>
               <w:top w:val="single" w:sz="7" w:space="0" w:color="000000"/>
               <w:left w:val="single" w:sz="7" w:space="0" w:color="000000"/>
@@ -5009,7 +3880,7 @@
         </w:tc>
         <w:tc>
           <w:tcPr>
-            <w:tcW w:w="3828" w:type="dxa"/>
+            <w:tcW w:w="4167" w:type="dxa"/>
             <w:tcBorders>
               <w:top w:val="single" w:sz="7" w:space="0" w:color="000000"/>
               <w:left w:val="single" w:sz="7" w:space="0" w:color="000000"/>
@@ -5051,23 +3922,7 @@
                 <w:rFonts w:asciiTheme="majorHAnsi" w:hAnsiTheme="majorHAnsi" w:cstheme="majorHAnsi"/>
                 <w:color w:val="FF0000"/>
               </w:rPr>
-              <w:t xml:space="preserve">UNC </w:t>
-            </w:r>
-            <w:proofErr w:type="spellStart"/>
-            <w:r>
-              <w:rPr>
-                <w:rFonts w:asciiTheme="majorHAnsi" w:hAnsiTheme="majorHAnsi" w:cstheme="majorHAnsi"/>
-                <w:color w:val="FF0000"/>
-              </w:rPr>
-              <w:t>ngày</w:t>
-            </w:r>
-            <w:proofErr w:type="spellEnd"/>
-            <w:r>
-              <w:rPr>
-                <w:rFonts w:asciiTheme="majorHAnsi" w:hAnsiTheme="majorHAnsi" w:cstheme="majorHAnsi"/>
-                <w:color w:val="FF0000"/>
-              </w:rPr>
-              <w:t xml:space="preserve"> 04/02/2026</w:t>
+              <w:t>UNC ngày 04/02/2026</w:t>
             </w:r>
           </w:p>
           <w:p>
@@ -5087,7 +3942,7 @@
         </w:trPr>
         <w:tc>
           <w:tcPr>
-            <w:tcW w:w="356" w:type="dxa"/>
+            <w:tcW w:w="540" w:type="dxa"/>
             <w:tcBorders>
               <w:top w:val="single" w:sz="7" w:space="0" w:color="000000"/>
               <w:left w:val="single" w:sz="7" w:space="0" w:color="000000"/>
@@ -5116,7 +3971,7 @@
         </w:tc>
         <w:tc>
           <w:tcPr>
-            <w:tcW w:w="2718" w:type="dxa"/>
+            <w:tcW w:w="3312" w:type="dxa"/>
             <w:tcBorders>
               <w:top w:val="single" w:sz="7" w:space="0" w:color="000000"/>
               <w:left w:val="single" w:sz="7" w:space="0" w:color="000000"/>
@@ -5136,287 +3991,7 @@
               <w:rPr>
                 <w:rFonts w:asciiTheme="majorHAnsi" w:hAnsiTheme="majorHAnsi" w:cstheme="majorHAnsi"/>
               </w:rPr>
-              <w:t xml:space="preserve">Thanh </w:t>
-            </w:r>
-            <w:proofErr w:type="spellStart"/>
-            <w:r>
-              <w:rPr>
-                <w:rFonts w:asciiTheme="majorHAnsi" w:hAnsiTheme="majorHAnsi" w:cstheme="majorHAnsi"/>
-              </w:rPr>
-              <w:t>toán</w:t>
-            </w:r>
-            <w:proofErr w:type="spellEnd"/>
-            <w:r>
-              <w:rPr>
-                <w:rFonts w:asciiTheme="majorHAnsi" w:hAnsiTheme="majorHAnsi" w:cstheme="majorHAnsi"/>
-              </w:rPr>
-              <w:t xml:space="preserve"> 75% </w:t>
-            </w:r>
-            <w:proofErr w:type="spellStart"/>
-            <w:r>
-              <w:rPr>
-                <w:rFonts w:asciiTheme="majorHAnsi" w:hAnsiTheme="majorHAnsi" w:cstheme="majorHAnsi"/>
-              </w:rPr>
-              <w:t>giá</w:t>
-            </w:r>
-            <w:proofErr w:type="spellEnd"/>
-            <w:r>
-              <w:rPr>
-                <w:rFonts w:asciiTheme="majorHAnsi" w:hAnsiTheme="majorHAnsi" w:cstheme="majorHAnsi"/>
-              </w:rPr>
-              <w:t xml:space="preserve"> </w:t>
-            </w:r>
-            <w:proofErr w:type="spellStart"/>
-            <w:r>
-              <w:rPr>
-                <w:rFonts w:asciiTheme="majorHAnsi" w:hAnsiTheme="majorHAnsi" w:cstheme="majorHAnsi"/>
-              </w:rPr>
-              <w:t>trị</w:t>
-            </w:r>
-            <w:proofErr w:type="spellEnd"/>
-            <w:r>
-              <w:rPr>
-                <w:rFonts w:asciiTheme="majorHAnsi" w:hAnsiTheme="majorHAnsi" w:cstheme="majorHAnsi"/>
-              </w:rPr>
-              <w:t xml:space="preserve"> </w:t>
-            </w:r>
-            <w:proofErr w:type="spellStart"/>
-            <w:r>
-              <w:rPr>
-                <w:rFonts w:asciiTheme="majorHAnsi" w:hAnsiTheme="majorHAnsi" w:cstheme="majorHAnsi"/>
-              </w:rPr>
-              <w:t>xe</w:t>
-            </w:r>
-            <w:proofErr w:type="spellEnd"/>
-            <w:r>
-              <w:rPr>
-                <w:rFonts w:asciiTheme="majorHAnsi" w:hAnsiTheme="majorHAnsi" w:cstheme="majorHAnsi"/>
-              </w:rPr>
-              <w:t xml:space="preserve"> </w:t>
-            </w:r>
-            <w:proofErr w:type="spellStart"/>
-            <w:r>
-              <w:rPr>
-                <w:rFonts w:asciiTheme="majorHAnsi" w:hAnsiTheme="majorHAnsi" w:cstheme="majorHAnsi"/>
-              </w:rPr>
-              <w:t>hoặc</w:t>
-            </w:r>
-            <w:proofErr w:type="spellEnd"/>
-            <w:r>
-              <w:rPr>
-                <w:rFonts w:asciiTheme="majorHAnsi" w:hAnsiTheme="majorHAnsi" w:cstheme="majorHAnsi"/>
-              </w:rPr>
-              <w:t xml:space="preserve"> </w:t>
-            </w:r>
-            <w:proofErr w:type="spellStart"/>
-            <w:r>
-              <w:rPr>
-                <w:rFonts w:asciiTheme="majorHAnsi" w:hAnsiTheme="majorHAnsi" w:cstheme="majorHAnsi"/>
-              </w:rPr>
-              <w:t>các</w:t>
-            </w:r>
-            <w:proofErr w:type="spellEnd"/>
-            <w:r>
-              <w:rPr>
-                <w:rFonts w:asciiTheme="majorHAnsi" w:hAnsiTheme="majorHAnsi" w:cstheme="majorHAnsi"/>
-              </w:rPr>
-              <w:t xml:space="preserve"> </w:t>
-            </w:r>
-            <w:proofErr w:type="spellStart"/>
-            <w:r>
-              <w:rPr>
-                <w:rFonts w:asciiTheme="majorHAnsi" w:hAnsiTheme="majorHAnsi" w:cstheme="majorHAnsi"/>
-              </w:rPr>
-              <w:t>xe</w:t>
-            </w:r>
-            <w:proofErr w:type="spellEnd"/>
-            <w:r>
-              <w:rPr>
-                <w:rFonts w:asciiTheme="majorHAnsi" w:hAnsiTheme="majorHAnsi" w:cstheme="majorHAnsi"/>
-              </w:rPr>
-              <w:t xml:space="preserve">: - Xe ô </w:t>
-            </w:r>
-            <w:proofErr w:type="spellStart"/>
-            <w:r>
-              <w:rPr>
-                <w:rFonts w:asciiTheme="majorHAnsi" w:hAnsiTheme="majorHAnsi" w:cstheme="majorHAnsi"/>
-              </w:rPr>
-              <w:t>tô</w:t>
-            </w:r>
-            <w:proofErr w:type="spellEnd"/>
-            <w:r>
-              <w:rPr>
-                <w:rFonts w:asciiTheme="majorHAnsi" w:hAnsiTheme="majorHAnsi" w:cstheme="majorHAnsi"/>
-              </w:rPr>
-              <w:t xml:space="preserve"> </w:t>
-            </w:r>
-            <w:proofErr w:type="spellStart"/>
-            <w:r>
-              <w:rPr>
-                <w:rFonts w:asciiTheme="majorHAnsi" w:hAnsiTheme="majorHAnsi" w:cstheme="majorHAnsi"/>
-              </w:rPr>
-              <w:t>chở</w:t>
-            </w:r>
-            <w:proofErr w:type="spellEnd"/>
-            <w:r>
-              <w:rPr>
-                <w:rFonts w:asciiTheme="majorHAnsi" w:hAnsiTheme="majorHAnsi" w:cstheme="majorHAnsi"/>
-              </w:rPr>
-              <w:t xml:space="preserve"> </w:t>
-            </w:r>
-            <w:proofErr w:type="spellStart"/>
-            <w:r>
-              <w:rPr>
-                <w:rFonts w:asciiTheme="majorHAnsi" w:hAnsiTheme="majorHAnsi" w:cstheme="majorHAnsi"/>
-              </w:rPr>
-              <w:t>người</w:t>
-            </w:r>
-            <w:proofErr w:type="spellEnd"/>
-            <w:r>
-              <w:rPr>
-                <w:rFonts w:asciiTheme="majorHAnsi" w:hAnsiTheme="majorHAnsi" w:cstheme="majorHAnsi"/>
-              </w:rPr>
-              <w:t xml:space="preserve">, </w:t>
-            </w:r>
-            <w:proofErr w:type="spellStart"/>
-            <w:r>
-              <w:rPr>
-                <w:rFonts w:asciiTheme="majorHAnsi" w:hAnsiTheme="majorHAnsi" w:cstheme="majorHAnsi"/>
-              </w:rPr>
-              <w:t>nhãn</w:t>
-            </w:r>
-            <w:proofErr w:type="spellEnd"/>
-            <w:r>
-              <w:rPr>
-                <w:rFonts w:asciiTheme="majorHAnsi" w:hAnsiTheme="majorHAnsi" w:cstheme="majorHAnsi"/>
-              </w:rPr>
-              <w:t xml:space="preserve"> </w:t>
-            </w:r>
-            <w:proofErr w:type="spellStart"/>
-            <w:r>
-              <w:rPr>
-                <w:rFonts w:asciiTheme="majorHAnsi" w:hAnsiTheme="majorHAnsi" w:cstheme="majorHAnsi"/>
-              </w:rPr>
-              <w:t>hiệu</w:t>
-            </w:r>
-            <w:proofErr w:type="spellEnd"/>
-            <w:r>
-              <w:rPr>
-                <w:rFonts w:asciiTheme="majorHAnsi" w:hAnsiTheme="majorHAnsi" w:cstheme="majorHAnsi"/>
-              </w:rPr>
-              <w:t xml:space="preserve"> </w:t>
-            </w:r>
-            <w:proofErr w:type="spellStart"/>
-            <w:r>
-              <w:rPr>
-                <w:rFonts w:asciiTheme="majorHAnsi" w:hAnsiTheme="majorHAnsi" w:cstheme="majorHAnsi"/>
-              </w:rPr>
-              <w:t>Vinfast</w:t>
-            </w:r>
-            <w:proofErr w:type="spellEnd"/>
-            <w:r>
-              <w:rPr>
-                <w:rFonts w:asciiTheme="majorHAnsi" w:hAnsiTheme="majorHAnsi" w:cstheme="majorHAnsi"/>
-              </w:rPr>
-              <w:t xml:space="preserve"> LIMO GREEN (</w:t>
-            </w:r>
-            <w:proofErr w:type="spellStart"/>
-            <w:r>
-              <w:rPr>
-                <w:rFonts w:asciiTheme="majorHAnsi" w:hAnsiTheme="majorHAnsi" w:cstheme="majorHAnsi"/>
-              </w:rPr>
-              <w:t>xe</w:t>
-            </w:r>
-            <w:proofErr w:type="spellEnd"/>
-            <w:r>
-              <w:rPr>
-                <w:rFonts w:asciiTheme="majorHAnsi" w:hAnsiTheme="majorHAnsi" w:cstheme="majorHAnsi"/>
-              </w:rPr>
-              <w:t xml:space="preserve"> </w:t>
-            </w:r>
-            <w:proofErr w:type="spellStart"/>
-            <w:r>
-              <w:rPr>
-                <w:rFonts w:asciiTheme="majorHAnsi" w:hAnsiTheme="majorHAnsi" w:cstheme="majorHAnsi"/>
-              </w:rPr>
-              <w:t>điện</w:t>
-            </w:r>
-            <w:proofErr w:type="spellEnd"/>
-            <w:r>
-              <w:rPr>
-                <w:rFonts w:asciiTheme="majorHAnsi" w:hAnsiTheme="majorHAnsi" w:cstheme="majorHAnsi"/>
-              </w:rPr>
-              <w:t xml:space="preserve">), </w:t>
-            </w:r>
-            <w:proofErr w:type="spellStart"/>
-            <w:r>
-              <w:rPr>
-                <w:rFonts w:asciiTheme="majorHAnsi" w:hAnsiTheme="majorHAnsi" w:cstheme="majorHAnsi"/>
-              </w:rPr>
-              <w:t>mới</w:t>
-            </w:r>
-            <w:proofErr w:type="spellEnd"/>
-            <w:r>
-              <w:rPr>
-                <w:rFonts w:asciiTheme="majorHAnsi" w:hAnsiTheme="majorHAnsi" w:cstheme="majorHAnsi"/>
-              </w:rPr>
-              <w:t xml:space="preserve"> 100%, </w:t>
-            </w:r>
-            <w:proofErr w:type="spellStart"/>
-            <w:r>
-              <w:rPr>
-                <w:rFonts w:asciiTheme="majorHAnsi" w:hAnsiTheme="majorHAnsi" w:cstheme="majorHAnsi"/>
-              </w:rPr>
-              <w:t>xuất</w:t>
-            </w:r>
-            <w:proofErr w:type="spellEnd"/>
-            <w:r>
-              <w:rPr>
-                <w:rFonts w:asciiTheme="majorHAnsi" w:hAnsiTheme="majorHAnsi" w:cstheme="majorHAnsi"/>
-              </w:rPr>
-              <w:t xml:space="preserve"> </w:t>
-            </w:r>
-            <w:proofErr w:type="spellStart"/>
-            <w:r>
-              <w:rPr>
-                <w:rFonts w:asciiTheme="majorHAnsi" w:hAnsiTheme="majorHAnsi" w:cstheme="majorHAnsi"/>
-              </w:rPr>
-              <w:t>xứ</w:t>
-            </w:r>
-            <w:proofErr w:type="spellEnd"/>
-            <w:r>
-              <w:rPr>
-                <w:rFonts w:asciiTheme="majorHAnsi" w:hAnsiTheme="majorHAnsi" w:cstheme="majorHAnsi"/>
-              </w:rPr>
-              <w:t xml:space="preserve">: Việt Nam, </w:t>
-            </w:r>
-            <w:proofErr w:type="spellStart"/>
-            <w:r>
-              <w:rPr>
-                <w:rFonts w:asciiTheme="majorHAnsi" w:hAnsiTheme="majorHAnsi" w:cstheme="majorHAnsi"/>
-              </w:rPr>
-              <w:t>số</w:t>
-            </w:r>
-            <w:proofErr w:type="spellEnd"/>
-            <w:r>
-              <w:rPr>
-                <w:rFonts w:asciiTheme="majorHAnsi" w:hAnsiTheme="majorHAnsi" w:cstheme="majorHAnsi"/>
-              </w:rPr>
-              <w:t xml:space="preserve"> </w:t>
-            </w:r>
-            <w:proofErr w:type="spellStart"/>
-            <w:r>
-              <w:rPr>
-                <w:rFonts w:asciiTheme="majorHAnsi" w:hAnsiTheme="majorHAnsi" w:cstheme="majorHAnsi"/>
-              </w:rPr>
-              <w:t>khung</w:t>
-            </w:r>
-            <w:proofErr w:type="spellEnd"/>
-            <w:r>
-              <w:rPr>
-                <w:rFonts w:asciiTheme="majorHAnsi" w:hAnsiTheme="majorHAnsi" w:cstheme="majorHAnsi"/>
-              </w:rPr>
-              <w:t xml:space="preserve">: </w:t>
+              <w:t xml:space="preserve">Thanh toán 75% giá trị xe hoặc các xe: - Xe ô tô chở người, nhãn hiệu Vinfast LIMO GREEN (xe điện), mới 100%, xuất xứ: Việt Nam, số khung: </w:t>
             </w:r>
           </w:p>
           <w:p>
@@ -5430,35 +4005,7 @@
               <w:rPr>
                 <w:rFonts w:asciiTheme="majorHAnsi" w:hAnsiTheme="majorHAnsi" w:cstheme="majorHAnsi"/>
               </w:rPr>
-              <w:t xml:space="preserve">RLLVFPNT7TH703980, </w:t>
-            </w:r>
-            <w:proofErr w:type="spellStart"/>
-            <w:r>
-              <w:rPr>
-                <w:rFonts w:asciiTheme="majorHAnsi" w:hAnsiTheme="majorHAnsi" w:cstheme="majorHAnsi"/>
-              </w:rPr>
-              <w:t>số</w:t>
-            </w:r>
-            <w:proofErr w:type="spellEnd"/>
-            <w:r>
-              <w:rPr>
-                <w:rFonts w:asciiTheme="majorHAnsi" w:hAnsiTheme="majorHAnsi" w:cstheme="majorHAnsi"/>
-              </w:rPr>
-              <w:t xml:space="preserve"> </w:t>
-            </w:r>
-            <w:proofErr w:type="spellStart"/>
-            <w:r>
-              <w:rPr>
-                <w:rFonts w:asciiTheme="majorHAnsi" w:hAnsiTheme="majorHAnsi" w:cstheme="majorHAnsi"/>
-              </w:rPr>
-              <w:t>máy</w:t>
-            </w:r>
-            <w:proofErr w:type="spellEnd"/>
-            <w:r>
-              <w:rPr>
-                <w:rFonts w:asciiTheme="majorHAnsi" w:hAnsiTheme="majorHAnsi" w:cstheme="majorHAnsi"/>
-              </w:rPr>
-              <w:t>: ENBALB25C110270</w:t>
+              <w:t>RLLVFPNT7TH703980, số máy: ENBALB25C110270</w:t>
             </w:r>
           </w:p>
         </w:tc>
@@ -5497,7 +4044,7 @@
         </w:tc>
         <w:tc>
           <w:tcPr>
-            <w:tcW w:w="3828" w:type="dxa"/>
+            <w:tcW w:w="4167" w:type="dxa"/>
             <w:tcBorders>
               <w:top w:val="single" w:sz="7" w:space="0" w:color="000000"/>
               <w:left w:val="single" w:sz="7" w:space="0" w:color="000000"/>
@@ -5518,188 +4065,28 @@
                 <w:rFonts w:asciiTheme="majorHAnsi" w:hAnsiTheme="majorHAnsi" w:cstheme="majorHAnsi"/>
               </w:rPr>
             </w:pPr>
-            <w:proofErr w:type="spellStart"/>
             <w:r>
               <w:rPr>
                 <w:rFonts w:asciiTheme="majorHAnsi" w:hAnsiTheme="majorHAnsi" w:cstheme="majorHAnsi"/>
                 <w:color w:val="FF0000"/>
               </w:rPr>
-              <w:t>Hồ</w:t>
-            </w:r>
-            <w:proofErr w:type="spellEnd"/>
-            <w:r>
+              <w:t>Hồ sơ xe và các đề nghị có liên quan.</w:t>
+            </w:r>
+          </w:p>
+          <w:p>
+            <w:pPr>
+              <w:spacing w:after="1" w:line="259" w:lineRule="auto"/>
               <w:rPr>
                 <w:rFonts w:asciiTheme="majorHAnsi" w:hAnsiTheme="majorHAnsi" w:cstheme="majorHAnsi"/>
                 <w:color w:val="FF0000"/>
               </w:rPr>
-              <w:t xml:space="preserve"> </w:t>
-            </w:r>
-            <w:proofErr w:type="spellStart"/>
+            </w:pPr>
             <w:r>
               <w:rPr>
                 <w:rFonts w:asciiTheme="majorHAnsi" w:hAnsiTheme="majorHAnsi" w:cstheme="majorHAnsi"/>
                 <w:color w:val="FF0000"/>
               </w:rPr>
-              <w:t>sơ</w:t>
-            </w:r>
-            <w:proofErr w:type="spellEnd"/>
-            <w:r>
-              <w:rPr>
-                <w:rFonts w:asciiTheme="majorHAnsi" w:hAnsiTheme="majorHAnsi" w:cstheme="majorHAnsi"/>
-                <w:color w:val="FF0000"/>
-              </w:rPr>
-              <w:t xml:space="preserve"> </w:t>
-            </w:r>
-            <w:proofErr w:type="spellStart"/>
-            <w:r>
-              <w:rPr>
-                <w:rFonts w:asciiTheme="majorHAnsi" w:hAnsiTheme="majorHAnsi" w:cstheme="majorHAnsi"/>
-                <w:color w:val="FF0000"/>
-              </w:rPr>
-              <w:t>xe</w:t>
-            </w:r>
-            <w:proofErr w:type="spellEnd"/>
-            <w:r>
-              <w:rPr>
-                <w:rFonts w:asciiTheme="majorHAnsi" w:hAnsiTheme="majorHAnsi" w:cstheme="majorHAnsi"/>
-                <w:color w:val="FF0000"/>
-              </w:rPr>
-              <w:t xml:space="preserve"> </w:t>
-            </w:r>
-            <w:proofErr w:type="spellStart"/>
-            <w:r>
-              <w:rPr>
-                <w:rFonts w:asciiTheme="majorHAnsi" w:hAnsiTheme="majorHAnsi" w:cstheme="majorHAnsi"/>
-                <w:color w:val="FF0000"/>
-              </w:rPr>
-              <w:t>và</w:t>
-            </w:r>
-            <w:proofErr w:type="spellEnd"/>
-            <w:r>
-              <w:rPr>
-                <w:rFonts w:asciiTheme="majorHAnsi" w:hAnsiTheme="majorHAnsi" w:cstheme="majorHAnsi"/>
-                <w:color w:val="FF0000"/>
-              </w:rPr>
-              <w:t xml:space="preserve"> </w:t>
-            </w:r>
-            <w:proofErr w:type="spellStart"/>
-            <w:r>
-              <w:rPr>
-                <w:rFonts w:asciiTheme="majorHAnsi" w:hAnsiTheme="majorHAnsi" w:cstheme="majorHAnsi"/>
-                <w:color w:val="FF0000"/>
-              </w:rPr>
-              <w:t>các</w:t>
-            </w:r>
-            <w:proofErr w:type="spellEnd"/>
-            <w:r>
-              <w:rPr>
-                <w:rFonts w:asciiTheme="majorHAnsi" w:hAnsiTheme="majorHAnsi" w:cstheme="majorHAnsi"/>
-                <w:color w:val="FF0000"/>
-              </w:rPr>
-              <w:t xml:space="preserve"> </w:t>
-            </w:r>
-            <w:proofErr w:type="spellStart"/>
-            <w:r>
-              <w:rPr>
-                <w:rFonts w:asciiTheme="majorHAnsi" w:hAnsiTheme="majorHAnsi" w:cstheme="majorHAnsi"/>
-                <w:color w:val="FF0000"/>
-              </w:rPr>
-              <w:t>đề</w:t>
-            </w:r>
-            <w:proofErr w:type="spellEnd"/>
-            <w:r>
-              <w:rPr>
-                <w:rFonts w:asciiTheme="majorHAnsi" w:hAnsiTheme="majorHAnsi" w:cstheme="majorHAnsi"/>
-                <w:color w:val="FF0000"/>
-              </w:rPr>
-              <w:t xml:space="preserve"> </w:t>
-            </w:r>
-            <w:proofErr w:type="spellStart"/>
-            <w:r>
-              <w:rPr>
-                <w:rFonts w:asciiTheme="majorHAnsi" w:hAnsiTheme="majorHAnsi" w:cstheme="majorHAnsi"/>
-                <w:color w:val="FF0000"/>
-              </w:rPr>
-              <w:t>nghị</w:t>
-            </w:r>
-            <w:proofErr w:type="spellEnd"/>
-            <w:r>
-              <w:rPr>
-                <w:rFonts w:asciiTheme="majorHAnsi" w:hAnsiTheme="majorHAnsi" w:cstheme="majorHAnsi"/>
-                <w:color w:val="FF0000"/>
-              </w:rPr>
-              <w:t xml:space="preserve"> </w:t>
-            </w:r>
-            <w:proofErr w:type="spellStart"/>
-            <w:r>
-              <w:rPr>
-                <w:rFonts w:asciiTheme="majorHAnsi" w:hAnsiTheme="majorHAnsi" w:cstheme="majorHAnsi"/>
-                <w:color w:val="FF0000"/>
-              </w:rPr>
-              <w:t>có</w:t>
-            </w:r>
-            <w:proofErr w:type="spellEnd"/>
-            <w:r>
-              <w:rPr>
-                <w:rFonts w:asciiTheme="majorHAnsi" w:hAnsiTheme="majorHAnsi" w:cstheme="majorHAnsi"/>
-                <w:color w:val="FF0000"/>
-              </w:rPr>
-              <w:t xml:space="preserve"> </w:t>
-            </w:r>
-            <w:proofErr w:type="spellStart"/>
-            <w:r>
-              <w:rPr>
-                <w:rFonts w:asciiTheme="majorHAnsi" w:hAnsiTheme="majorHAnsi" w:cstheme="majorHAnsi"/>
-                <w:color w:val="FF0000"/>
-              </w:rPr>
-              <w:t>liên</w:t>
-            </w:r>
-            <w:proofErr w:type="spellEnd"/>
-            <w:r>
-              <w:rPr>
-                <w:rFonts w:asciiTheme="majorHAnsi" w:hAnsiTheme="majorHAnsi" w:cstheme="majorHAnsi"/>
-                <w:color w:val="FF0000"/>
-              </w:rPr>
-              <w:t xml:space="preserve"> </w:t>
-            </w:r>
-            <w:proofErr w:type="spellStart"/>
-            <w:r>
-              <w:rPr>
-                <w:rFonts w:asciiTheme="majorHAnsi" w:hAnsiTheme="majorHAnsi" w:cstheme="majorHAnsi"/>
-                <w:color w:val="FF0000"/>
-              </w:rPr>
-              <w:t>quan</w:t>
-            </w:r>
-            <w:proofErr w:type="spellEnd"/>
-            <w:r>
-              <w:rPr>
-                <w:rFonts w:asciiTheme="majorHAnsi" w:hAnsiTheme="majorHAnsi" w:cstheme="majorHAnsi"/>
-                <w:color w:val="FF0000"/>
-              </w:rPr>
-              <w:t>.</w:t>
-            </w:r>
-          </w:p>
-          <w:p>
-            <w:pPr>
-              <w:spacing w:after="1" w:line="259" w:lineRule="auto"/>
-              <w:rPr>
-                <w:rFonts w:asciiTheme="majorHAnsi" w:hAnsiTheme="majorHAnsi" w:cstheme="majorHAnsi"/>
-                <w:color w:val="FF0000"/>
-              </w:rPr>
-            </w:pPr>
-            <w:r>
-              <w:rPr>
-                <w:rFonts w:asciiTheme="majorHAnsi" w:hAnsiTheme="majorHAnsi" w:cstheme="majorHAnsi"/>
-                <w:color w:val="FF0000"/>
-              </w:rPr>
-              <w:t>-</w:t>
-            </w:r>
-            <w:r>
-              <w:rPr>
-                <w:rFonts w:asciiTheme="majorHAnsi" w:hAnsiTheme="majorHAnsi" w:cstheme="majorHAnsi"/>
-                <w:color w:val="FF0000"/>
-              </w:rPr>
-              <w:t>UNC ngày 04/02/2026</w:t>
+              <w:t>-UNC ngày 04/02/2026</w:t>
             </w:r>
           </w:p>
         </w:tc>
@@ -5710,7 +4097,7 @@
         </w:trPr>
         <w:tc>
           <w:tcPr>
-            <w:tcW w:w="356" w:type="dxa"/>
+            <w:tcW w:w="540" w:type="dxa"/>
             <w:tcBorders>
               <w:top w:val="single" w:sz="7" w:space="0" w:color="000000"/>
               <w:left w:val="single" w:sz="7" w:space="0" w:color="000000"/>
@@ -5738,7 +4125,7 @@
         </w:tc>
         <w:tc>
           <w:tcPr>
-            <w:tcW w:w="2718" w:type="dxa"/>
+            <w:tcW w:w="3312" w:type="dxa"/>
             <w:tcBorders>
               <w:top w:val="single" w:sz="7" w:space="0" w:color="000000"/>
               <w:left w:val="single" w:sz="7" w:space="0" w:color="000000"/>
@@ -5758,287 +4145,7 @@
               <w:rPr>
                 <w:rFonts w:asciiTheme="majorHAnsi" w:hAnsiTheme="majorHAnsi" w:cstheme="majorHAnsi"/>
               </w:rPr>
-              <w:t xml:space="preserve">Thanh </w:t>
-            </w:r>
-            <w:proofErr w:type="spellStart"/>
-            <w:r>
-              <w:rPr>
-                <w:rFonts w:asciiTheme="majorHAnsi" w:hAnsiTheme="majorHAnsi" w:cstheme="majorHAnsi"/>
-              </w:rPr>
-              <w:t>toán</w:t>
-            </w:r>
-            <w:proofErr w:type="spellEnd"/>
-            <w:r>
-              <w:rPr>
-                <w:rFonts w:asciiTheme="majorHAnsi" w:hAnsiTheme="majorHAnsi" w:cstheme="majorHAnsi"/>
-              </w:rPr>
-              <w:t xml:space="preserve"> 75% </w:t>
-            </w:r>
-            <w:proofErr w:type="spellStart"/>
-            <w:r>
-              <w:rPr>
-                <w:rFonts w:asciiTheme="majorHAnsi" w:hAnsiTheme="majorHAnsi" w:cstheme="majorHAnsi"/>
-              </w:rPr>
-              <w:t>giá</w:t>
-            </w:r>
-            <w:proofErr w:type="spellEnd"/>
-            <w:r>
-              <w:rPr>
-                <w:rFonts w:asciiTheme="majorHAnsi" w:hAnsiTheme="majorHAnsi" w:cstheme="majorHAnsi"/>
-              </w:rPr>
-              <w:t xml:space="preserve"> </w:t>
-            </w:r>
-            <w:proofErr w:type="spellStart"/>
-            <w:r>
-              <w:rPr>
-                <w:rFonts w:asciiTheme="majorHAnsi" w:hAnsiTheme="majorHAnsi" w:cstheme="majorHAnsi"/>
-              </w:rPr>
-              <w:t>trị</w:t>
-            </w:r>
-            <w:proofErr w:type="spellEnd"/>
-            <w:r>
-              <w:rPr>
-                <w:rFonts w:asciiTheme="majorHAnsi" w:hAnsiTheme="majorHAnsi" w:cstheme="majorHAnsi"/>
-              </w:rPr>
-              <w:t xml:space="preserve"> </w:t>
-            </w:r>
-            <w:proofErr w:type="spellStart"/>
-            <w:r>
-              <w:rPr>
-                <w:rFonts w:asciiTheme="majorHAnsi" w:hAnsiTheme="majorHAnsi" w:cstheme="majorHAnsi"/>
-              </w:rPr>
-              <w:t>xe</w:t>
-            </w:r>
-            <w:proofErr w:type="spellEnd"/>
-            <w:r>
-              <w:rPr>
-                <w:rFonts w:asciiTheme="majorHAnsi" w:hAnsiTheme="majorHAnsi" w:cstheme="majorHAnsi"/>
-              </w:rPr>
-              <w:t xml:space="preserve"> </w:t>
-            </w:r>
-            <w:proofErr w:type="spellStart"/>
-            <w:r>
-              <w:rPr>
-                <w:rFonts w:asciiTheme="majorHAnsi" w:hAnsiTheme="majorHAnsi" w:cstheme="majorHAnsi"/>
-              </w:rPr>
-              <w:t>hoặc</w:t>
-            </w:r>
-            <w:proofErr w:type="spellEnd"/>
-            <w:r>
-              <w:rPr>
-                <w:rFonts w:asciiTheme="majorHAnsi" w:hAnsiTheme="majorHAnsi" w:cstheme="majorHAnsi"/>
-              </w:rPr>
-              <w:t xml:space="preserve"> </w:t>
-            </w:r>
-            <w:proofErr w:type="spellStart"/>
-            <w:r>
-              <w:rPr>
-                <w:rFonts w:asciiTheme="majorHAnsi" w:hAnsiTheme="majorHAnsi" w:cstheme="majorHAnsi"/>
-              </w:rPr>
-              <w:t>các</w:t>
-            </w:r>
-            <w:proofErr w:type="spellEnd"/>
-            <w:r>
-              <w:rPr>
-                <w:rFonts w:asciiTheme="majorHAnsi" w:hAnsiTheme="majorHAnsi" w:cstheme="majorHAnsi"/>
-              </w:rPr>
-              <w:t xml:space="preserve"> </w:t>
-            </w:r>
-            <w:proofErr w:type="spellStart"/>
-            <w:r>
-              <w:rPr>
-                <w:rFonts w:asciiTheme="majorHAnsi" w:hAnsiTheme="majorHAnsi" w:cstheme="majorHAnsi"/>
-              </w:rPr>
-              <w:t>xe</w:t>
-            </w:r>
-            <w:proofErr w:type="spellEnd"/>
-            <w:r>
-              <w:rPr>
-                <w:rFonts w:asciiTheme="majorHAnsi" w:hAnsiTheme="majorHAnsi" w:cstheme="majorHAnsi"/>
-              </w:rPr>
-              <w:t xml:space="preserve">: - Xe ô </w:t>
-            </w:r>
-            <w:proofErr w:type="spellStart"/>
-            <w:r>
-              <w:rPr>
-                <w:rFonts w:asciiTheme="majorHAnsi" w:hAnsiTheme="majorHAnsi" w:cstheme="majorHAnsi"/>
-              </w:rPr>
-              <w:t>tô</w:t>
-            </w:r>
-            <w:proofErr w:type="spellEnd"/>
-            <w:r>
-              <w:rPr>
-                <w:rFonts w:asciiTheme="majorHAnsi" w:hAnsiTheme="majorHAnsi" w:cstheme="majorHAnsi"/>
-              </w:rPr>
-              <w:t xml:space="preserve"> </w:t>
-            </w:r>
-            <w:proofErr w:type="spellStart"/>
-            <w:r>
-              <w:rPr>
-                <w:rFonts w:asciiTheme="majorHAnsi" w:hAnsiTheme="majorHAnsi" w:cstheme="majorHAnsi"/>
-              </w:rPr>
-              <w:t>chở</w:t>
-            </w:r>
-            <w:proofErr w:type="spellEnd"/>
-            <w:r>
-              <w:rPr>
-                <w:rFonts w:asciiTheme="majorHAnsi" w:hAnsiTheme="majorHAnsi" w:cstheme="majorHAnsi"/>
-              </w:rPr>
-              <w:t xml:space="preserve"> </w:t>
-            </w:r>
-            <w:proofErr w:type="spellStart"/>
-            <w:r>
-              <w:rPr>
-                <w:rFonts w:asciiTheme="majorHAnsi" w:hAnsiTheme="majorHAnsi" w:cstheme="majorHAnsi"/>
-              </w:rPr>
-              <w:t>người</w:t>
-            </w:r>
-            <w:proofErr w:type="spellEnd"/>
-            <w:r>
-              <w:rPr>
-                <w:rFonts w:asciiTheme="majorHAnsi" w:hAnsiTheme="majorHAnsi" w:cstheme="majorHAnsi"/>
-              </w:rPr>
-              <w:t xml:space="preserve">, </w:t>
-            </w:r>
-            <w:proofErr w:type="spellStart"/>
-            <w:r>
-              <w:rPr>
-                <w:rFonts w:asciiTheme="majorHAnsi" w:hAnsiTheme="majorHAnsi" w:cstheme="majorHAnsi"/>
-              </w:rPr>
-              <w:t>nhãn</w:t>
-            </w:r>
-            <w:proofErr w:type="spellEnd"/>
-            <w:r>
-              <w:rPr>
-                <w:rFonts w:asciiTheme="majorHAnsi" w:hAnsiTheme="majorHAnsi" w:cstheme="majorHAnsi"/>
-              </w:rPr>
-              <w:t xml:space="preserve"> </w:t>
-            </w:r>
-            <w:proofErr w:type="spellStart"/>
-            <w:r>
-              <w:rPr>
-                <w:rFonts w:asciiTheme="majorHAnsi" w:hAnsiTheme="majorHAnsi" w:cstheme="majorHAnsi"/>
-              </w:rPr>
-              <w:t>hiệu</w:t>
-            </w:r>
-            <w:proofErr w:type="spellEnd"/>
-            <w:r>
-              <w:rPr>
-                <w:rFonts w:asciiTheme="majorHAnsi" w:hAnsiTheme="majorHAnsi" w:cstheme="majorHAnsi"/>
-              </w:rPr>
-              <w:t xml:space="preserve"> </w:t>
-            </w:r>
-            <w:proofErr w:type="spellStart"/>
-            <w:r>
-              <w:rPr>
-                <w:rFonts w:asciiTheme="majorHAnsi" w:hAnsiTheme="majorHAnsi" w:cstheme="majorHAnsi"/>
-              </w:rPr>
-              <w:t>Vinfast</w:t>
-            </w:r>
-            <w:proofErr w:type="spellEnd"/>
-            <w:r>
-              <w:rPr>
-                <w:rFonts w:asciiTheme="majorHAnsi" w:hAnsiTheme="majorHAnsi" w:cstheme="majorHAnsi"/>
-              </w:rPr>
-              <w:t xml:space="preserve"> LIMO GREEN (</w:t>
-            </w:r>
-            <w:proofErr w:type="spellStart"/>
-            <w:r>
-              <w:rPr>
-                <w:rFonts w:asciiTheme="majorHAnsi" w:hAnsiTheme="majorHAnsi" w:cstheme="majorHAnsi"/>
-              </w:rPr>
-              <w:t>xe</w:t>
-            </w:r>
-            <w:proofErr w:type="spellEnd"/>
-            <w:r>
-              <w:rPr>
-                <w:rFonts w:asciiTheme="majorHAnsi" w:hAnsiTheme="majorHAnsi" w:cstheme="majorHAnsi"/>
-              </w:rPr>
-              <w:t xml:space="preserve"> </w:t>
-            </w:r>
-            <w:proofErr w:type="spellStart"/>
-            <w:r>
-              <w:rPr>
-                <w:rFonts w:asciiTheme="majorHAnsi" w:hAnsiTheme="majorHAnsi" w:cstheme="majorHAnsi"/>
-              </w:rPr>
-              <w:t>điện</w:t>
-            </w:r>
-            <w:proofErr w:type="spellEnd"/>
-            <w:r>
-              <w:rPr>
-                <w:rFonts w:asciiTheme="majorHAnsi" w:hAnsiTheme="majorHAnsi" w:cstheme="majorHAnsi"/>
-              </w:rPr>
-              <w:t xml:space="preserve">), </w:t>
-            </w:r>
-            <w:proofErr w:type="spellStart"/>
-            <w:r>
-              <w:rPr>
-                <w:rFonts w:asciiTheme="majorHAnsi" w:hAnsiTheme="majorHAnsi" w:cstheme="majorHAnsi"/>
-              </w:rPr>
-              <w:t>mới</w:t>
-            </w:r>
-            <w:proofErr w:type="spellEnd"/>
-            <w:r>
-              <w:rPr>
-                <w:rFonts w:asciiTheme="majorHAnsi" w:hAnsiTheme="majorHAnsi" w:cstheme="majorHAnsi"/>
-              </w:rPr>
-              <w:t xml:space="preserve"> 100%, </w:t>
-            </w:r>
-            <w:proofErr w:type="spellStart"/>
-            <w:r>
-              <w:rPr>
-                <w:rFonts w:asciiTheme="majorHAnsi" w:hAnsiTheme="majorHAnsi" w:cstheme="majorHAnsi"/>
-              </w:rPr>
-              <w:t>xuất</w:t>
-            </w:r>
-            <w:proofErr w:type="spellEnd"/>
-            <w:r>
-              <w:rPr>
-                <w:rFonts w:asciiTheme="majorHAnsi" w:hAnsiTheme="majorHAnsi" w:cstheme="majorHAnsi"/>
-              </w:rPr>
-              <w:t xml:space="preserve"> </w:t>
-            </w:r>
-            <w:proofErr w:type="spellStart"/>
-            <w:r>
-              <w:rPr>
-                <w:rFonts w:asciiTheme="majorHAnsi" w:hAnsiTheme="majorHAnsi" w:cstheme="majorHAnsi"/>
-              </w:rPr>
-              <w:t>xứ</w:t>
-            </w:r>
-            <w:proofErr w:type="spellEnd"/>
-            <w:r>
-              <w:rPr>
-                <w:rFonts w:asciiTheme="majorHAnsi" w:hAnsiTheme="majorHAnsi" w:cstheme="majorHAnsi"/>
-              </w:rPr>
-              <w:t xml:space="preserve">: Việt Nam, </w:t>
-            </w:r>
-            <w:proofErr w:type="spellStart"/>
-            <w:r>
-              <w:rPr>
-                <w:rFonts w:asciiTheme="majorHAnsi" w:hAnsiTheme="majorHAnsi" w:cstheme="majorHAnsi"/>
-              </w:rPr>
-              <w:t>số</w:t>
-            </w:r>
-            <w:proofErr w:type="spellEnd"/>
-            <w:r>
-              <w:rPr>
-                <w:rFonts w:asciiTheme="majorHAnsi" w:hAnsiTheme="majorHAnsi" w:cstheme="majorHAnsi"/>
-              </w:rPr>
-              <w:t xml:space="preserve"> </w:t>
-            </w:r>
-            <w:proofErr w:type="spellStart"/>
-            <w:r>
-              <w:rPr>
-                <w:rFonts w:asciiTheme="majorHAnsi" w:hAnsiTheme="majorHAnsi" w:cstheme="majorHAnsi"/>
-              </w:rPr>
-              <w:t>khung</w:t>
-            </w:r>
-            <w:proofErr w:type="spellEnd"/>
-            <w:r>
-              <w:rPr>
-                <w:rFonts w:asciiTheme="majorHAnsi" w:hAnsiTheme="majorHAnsi" w:cstheme="majorHAnsi"/>
-              </w:rPr>
-              <w:t xml:space="preserve">: </w:t>
+              <w:t xml:space="preserve">Thanh toán 75% giá trị xe hoặc các xe: - Xe ô tô chở người, nhãn hiệu Vinfast LIMO GREEN (xe điện), mới 100%, xuất xứ: Việt Nam, số khung: </w:t>
             </w:r>
           </w:p>
           <w:p>
@@ -6052,35 +4159,7 @@
               <w:rPr>
                 <w:rFonts w:asciiTheme="majorHAnsi" w:hAnsiTheme="majorHAnsi" w:cstheme="majorHAnsi"/>
               </w:rPr>
-              <w:t xml:space="preserve">RLLVFPNT7TH713229, </w:t>
-            </w:r>
-            <w:proofErr w:type="spellStart"/>
-            <w:r>
-              <w:rPr>
-                <w:rFonts w:asciiTheme="majorHAnsi" w:hAnsiTheme="majorHAnsi" w:cstheme="majorHAnsi"/>
-              </w:rPr>
-              <w:t>số</w:t>
-            </w:r>
-            <w:proofErr w:type="spellEnd"/>
-            <w:r>
-              <w:rPr>
-                <w:rFonts w:asciiTheme="majorHAnsi" w:hAnsiTheme="majorHAnsi" w:cstheme="majorHAnsi"/>
-              </w:rPr>
-              <w:t xml:space="preserve"> </w:t>
-            </w:r>
-            <w:proofErr w:type="spellStart"/>
-            <w:r>
-              <w:rPr>
-                <w:rFonts w:asciiTheme="majorHAnsi" w:hAnsiTheme="majorHAnsi" w:cstheme="majorHAnsi"/>
-              </w:rPr>
-              <w:t>máy</w:t>
-            </w:r>
-            <w:proofErr w:type="spellEnd"/>
-            <w:r>
-              <w:rPr>
-                <w:rFonts w:asciiTheme="majorHAnsi" w:hAnsiTheme="majorHAnsi" w:cstheme="majorHAnsi"/>
-              </w:rPr>
-              <w:t>: ENBALB25C200032</w:t>
+              <w:t>RLLVFPNT7TH713229, số máy: ENBALB25C200032</w:t>
             </w:r>
           </w:p>
         </w:tc>
@@ -6113,7 +4192,7 @@
         </w:tc>
         <w:tc>
           <w:tcPr>
-            <w:tcW w:w="3828" w:type="dxa"/>
+            <w:tcW w:w="4167" w:type="dxa"/>
             <w:tcBorders>
               <w:top w:val="single" w:sz="7" w:space="0" w:color="000000"/>
               <w:left w:val="single" w:sz="7" w:space="0" w:color="000000"/>
@@ -6134,165 +4213,12 @@
                 <w:rFonts w:asciiTheme="majorHAnsi" w:hAnsiTheme="majorHAnsi" w:cstheme="majorHAnsi"/>
               </w:rPr>
             </w:pPr>
-            <w:proofErr w:type="spellStart"/>
             <w:r>
               <w:rPr>
                 <w:rFonts w:asciiTheme="majorHAnsi" w:hAnsiTheme="majorHAnsi" w:cstheme="majorHAnsi"/>
                 <w:color w:val="FF0000"/>
               </w:rPr>
-              <w:t>Hồ</w:t>
-            </w:r>
-            <w:proofErr w:type="spellEnd"/>
-            <w:r>
-              <w:rPr>
-                <w:rFonts w:asciiTheme="majorHAnsi" w:hAnsiTheme="majorHAnsi" w:cstheme="majorHAnsi"/>
-                <w:color w:val="FF0000"/>
-              </w:rPr>
-              <w:t xml:space="preserve"> </w:t>
-            </w:r>
-            <w:proofErr w:type="spellStart"/>
-            <w:r>
-              <w:rPr>
-                <w:rFonts w:asciiTheme="majorHAnsi" w:hAnsiTheme="majorHAnsi" w:cstheme="majorHAnsi"/>
-                <w:color w:val="FF0000"/>
-              </w:rPr>
-              <w:t>sơ</w:t>
-            </w:r>
-            <w:proofErr w:type="spellEnd"/>
-            <w:r>
-              <w:rPr>
-                <w:rFonts w:asciiTheme="majorHAnsi" w:hAnsiTheme="majorHAnsi" w:cstheme="majorHAnsi"/>
-                <w:color w:val="FF0000"/>
-              </w:rPr>
-              <w:t xml:space="preserve"> </w:t>
-            </w:r>
-            <w:proofErr w:type="spellStart"/>
-            <w:r>
-              <w:rPr>
-                <w:rFonts w:asciiTheme="majorHAnsi" w:hAnsiTheme="majorHAnsi" w:cstheme="majorHAnsi"/>
-                <w:color w:val="FF0000"/>
-              </w:rPr>
-              <w:t>xe</w:t>
-            </w:r>
-            <w:proofErr w:type="spellEnd"/>
-            <w:r>
-              <w:rPr>
-                <w:rFonts w:asciiTheme="majorHAnsi" w:hAnsiTheme="majorHAnsi" w:cstheme="majorHAnsi"/>
-                <w:color w:val="FF0000"/>
-              </w:rPr>
-              <w:t xml:space="preserve"> </w:t>
-            </w:r>
-            <w:proofErr w:type="spellStart"/>
-            <w:r>
-              <w:rPr>
-                <w:rFonts w:asciiTheme="majorHAnsi" w:hAnsiTheme="majorHAnsi" w:cstheme="majorHAnsi"/>
-                <w:color w:val="FF0000"/>
-              </w:rPr>
-              <w:t>và</w:t>
-            </w:r>
-            <w:proofErr w:type="spellEnd"/>
-            <w:r>
-              <w:rPr>
-                <w:rFonts w:asciiTheme="majorHAnsi" w:hAnsiTheme="majorHAnsi" w:cstheme="majorHAnsi"/>
-                <w:color w:val="FF0000"/>
-              </w:rPr>
-              <w:t xml:space="preserve"> </w:t>
-            </w:r>
-            <w:proofErr w:type="spellStart"/>
-            <w:r>
-              <w:rPr>
-                <w:rFonts w:asciiTheme="majorHAnsi" w:hAnsiTheme="majorHAnsi" w:cstheme="majorHAnsi"/>
-                <w:color w:val="FF0000"/>
-              </w:rPr>
-              <w:t>các</w:t>
-            </w:r>
-            <w:proofErr w:type="spellEnd"/>
-            <w:r>
-              <w:rPr>
-                <w:rFonts w:asciiTheme="majorHAnsi" w:hAnsiTheme="majorHAnsi" w:cstheme="majorHAnsi"/>
-                <w:color w:val="FF0000"/>
-              </w:rPr>
-              <w:t xml:space="preserve"> </w:t>
-            </w:r>
-            <w:proofErr w:type="spellStart"/>
-            <w:r>
-              <w:rPr>
-                <w:rFonts w:asciiTheme="majorHAnsi" w:hAnsiTheme="majorHAnsi" w:cstheme="majorHAnsi"/>
-                <w:color w:val="FF0000"/>
-              </w:rPr>
-              <w:t>đề</w:t>
-            </w:r>
-            <w:proofErr w:type="spellEnd"/>
-            <w:r>
-              <w:rPr>
-                <w:rFonts w:asciiTheme="majorHAnsi" w:hAnsiTheme="majorHAnsi" w:cstheme="majorHAnsi"/>
-                <w:color w:val="FF0000"/>
-              </w:rPr>
-              <w:t xml:space="preserve"> </w:t>
-            </w:r>
-            <w:proofErr w:type="spellStart"/>
-            <w:r>
-              <w:rPr>
-                <w:rFonts w:asciiTheme="majorHAnsi" w:hAnsiTheme="majorHAnsi" w:cstheme="majorHAnsi"/>
-                <w:color w:val="FF0000"/>
-              </w:rPr>
-              <w:t>nghị</w:t>
-            </w:r>
-            <w:proofErr w:type="spellEnd"/>
-            <w:r>
-              <w:rPr>
-                <w:rFonts w:asciiTheme="majorHAnsi" w:hAnsiTheme="majorHAnsi" w:cstheme="majorHAnsi"/>
-                <w:color w:val="FF0000"/>
-              </w:rPr>
-              <w:t xml:space="preserve"> </w:t>
-            </w:r>
-            <w:proofErr w:type="spellStart"/>
-            <w:r>
-              <w:rPr>
-                <w:rFonts w:asciiTheme="majorHAnsi" w:hAnsiTheme="majorHAnsi" w:cstheme="majorHAnsi"/>
-                <w:color w:val="FF0000"/>
-              </w:rPr>
-              <w:t>có</w:t>
-            </w:r>
-            <w:proofErr w:type="spellEnd"/>
-            <w:r>
-              <w:rPr>
-                <w:rFonts w:asciiTheme="majorHAnsi" w:hAnsiTheme="majorHAnsi" w:cstheme="majorHAnsi"/>
-                <w:color w:val="FF0000"/>
-              </w:rPr>
-              <w:t xml:space="preserve"> </w:t>
-            </w:r>
-            <w:proofErr w:type="spellStart"/>
-            <w:r>
-              <w:rPr>
-                <w:rFonts w:asciiTheme="majorHAnsi" w:hAnsiTheme="majorHAnsi" w:cstheme="majorHAnsi"/>
-                <w:color w:val="FF0000"/>
-              </w:rPr>
-              <w:t>liên</w:t>
-            </w:r>
-            <w:proofErr w:type="spellEnd"/>
-            <w:r>
-              <w:rPr>
-                <w:rFonts w:asciiTheme="majorHAnsi" w:hAnsiTheme="majorHAnsi" w:cstheme="majorHAnsi"/>
-                <w:color w:val="FF0000"/>
-              </w:rPr>
-              <w:t xml:space="preserve"> </w:t>
-            </w:r>
-            <w:proofErr w:type="spellStart"/>
-            <w:r>
-              <w:rPr>
-                <w:rFonts w:asciiTheme="majorHAnsi" w:hAnsiTheme="majorHAnsi" w:cstheme="majorHAnsi"/>
-                <w:color w:val="FF0000"/>
-              </w:rPr>
-              <w:t>quan</w:t>
-            </w:r>
-            <w:proofErr w:type="spellEnd"/>
-            <w:r>
-              <w:rPr>
-                <w:rFonts w:asciiTheme="majorHAnsi" w:hAnsiTheme="majorHAnsi" w:cstheme="majorHAnsi"/>
-                <w:color w:val="FF0000"/>
-              </w:rPr>
-              <w:t>.</w:t>
+              <w:t>Hồ sơ xe và các đề nghị có liên quan.</w:t>
             </w:r>
           </w:p>
           <w:p>
@@ -6313,23 +4239,7 @@
                 <w:rFonts w:asciiTheme="majorHAnsi" w:hAnsiTheme="majorHAnsi" w:cstheme="majorHAnsi"/>
                 <w:color w:val="FF0000"/>
               </w:rPr>
-              <w:t xml:space="preserve">UNC </w:t>
-            </w:r>
-            <w:proofErr w:type="spellStart"/>
-            <w:r>
-              <w:rPr>
-                <w:rFonts w:asciiTheme="majorHAnsi" w:hAnsiTheme="majorHAnsi" w:cstheme="majorHAnsi"/>
-                <w:color w:val="FF0000"/>
-              </w:rPr>
-              <w:t>ngày</w:t>
-            </w:r>
-            <w:proofErr w:type="spellEnd"/>
-            <w:r>
-              <w:rPr>
-                <w:rFonts w:asciiTheme="majorHAnsi" w:hAnsiTheme="majorHAnsi" w:cstheme="majorHAnsi"/>
-                <w:color w:val="FF0000"/>
-              </w:rPr>
-              <w:t xml:space="preserve"> 04/02/2026</w:t>
+              <w:t>UNC ngày 04/02/2026</w:t>
             </w:r>
           </w:p>
         </w:tc>
@@ -6340,7 +4250,7 @@
         </w:trPr>
         <w:tc>
           <w:tcPr>
-            <w:tcW w:w="356" w:type="dxa"/>
+            <w:tcW w:w="540" w:type="dxa"/>
             <w:tcBorders>
               <w:top w:val="single" w:sz="7" w:space="0" w:color="000000"/>
               <w:left w:val="single" w:sz="7" w:space="0" w:color="000000"/>
@@ -6368,7 +4278,7 @@
         </w:tc>
         <w:tc>
           <w:tcPr>
-            <w:tcW w:w="2718" w:type="dxa"/>
+            <w:tcW w:w="3312" w:type="dxa"/>
             <w:tcBorders>
               <w:top w:val="single" w:sz="7" w:space="0" w:color="000000"/>
               <w:left w:val="single" w:sz="7" w:space="0" w:color="000000"/>
@@ -6388,287 +4298,7 @@
               <w:rPr>
                 <w:rFonts w:asciiTheme="majorHAnsi" w:hAnsiTheme="majorHAnsi" w:cstheme="majorHAnsi"/>
               </w:rPr>
-              <w:t xml:space="preserve">Thanh </w:t>
-            </w:r>
-            <w:proofErr w:type="spellStart"/>
-            <w:r>
-              <w:rPr>
-                <w:rFonts w:asciiTheme="majorHAnsi" w:hAnsiTheme="majorHAnsi" w:cstheme="majorHAnsi"/>
-              </w:rPr>
-              <w:t>toán</w:t>
-            </w:r>
-            <w:proofErr w:type="spellEnd"/>
-            <w:r>
-              <w:rPr>
-                <w:rFonts w:asciiTheme="majorHAnsi" w:hAnsiTheme="majorHAnsi" w:cstheme="majorHAnsi"/>
-              </w:rPr>
-              <w:t xml:space="preserve"> 75% </w:t>
-            </w:r>
-            <w:proofErr w:type="spellStart"/>
-            <w:r>
-              <w:rPr>
-                <w:rFonts w:asciiTheme="majorHAnsi" w:hAnsiTheme="majorHAnsi" w:cstheme="majorHAnsi"/>
-              </w:rPr>
-              <w:t>giá</w:t>
-            </w:r>
-            <w:proofErr w:type="spellEnd"/>
-            <w:r>
-              <w:rPr>
-                <w:rFonts w:asciiTheme="majorHAnsi" w:hAnsiTheme="majorHAnsi" w:cstheme="majorHAnsi"/>
-              </w:rPr>
-              <w:t xml:space="preserve"> </w:t>
-            </w:r>
-            <w:proofErr w:type="spellStart"/>
-            <w:r>
-              <w:rPr>
-                <w:rFonts w:asciiTheme="majorHAnsi" w:hAnsiTheme="majorHAnsi" w:cstheme="majorHAnsi"/>
-              </w:rPr>
-              <w:t>trị</w:t>
-            </w:r>
-            <w:proofErr w:type="spellEnd"/>
-            <w:r>
-              <w:rPr>
-                <w:rFonts w:asciiTheme="majorHAnsi" w:hAnsiTheme="majorHAnsi" w:cstheme="majorHAnsi"/>
-              </w:rPr>
-              <w:t xml:space="preserve"> </w:t>
-            </w:r>
-            <w:proofErr w:type="spellStart"/>
-            <w:r>
-              <w:rPr>
-                <w:rFonts w:asciiTheme="majorHAnsi" w:hAnsiTheme="majorHAnsi" w:cstheme="majorHAnsi"/>
-              </w:rPr>
-              <w:t>xe</w:t>
-            </w:r>
-            <w:proofErr w:type="spellEnd"/>
-            <w:r>
-              <w:rPr>
-                <w:rFonts w:asciiTheme="majorHAnsi" w:hAnsiTheme="majorHAnsi" w:cstheme="majorHAnsi"/>
-              </w:rPr>
-              <w:t xml:space="preserve"> </w:t>
-            </w:r>
-            <w:proofErr w:type="spellStart"/>
-            <w:r>
-              <w:rPr>
-                <w:rFonts w:asciiTheme="majorHAnsi" w:hAnsiTheme="majorHAnsi" w:cstheme="majorHAnsi"/>
-              </w:rPr>
-              <w:t>hoặc</w:t>
-            </w:r>
-            <w:proofErr w:type="spellEnd"/>
-            <w:r>
-              <w:rPr>
-                <w:rFonts w:asciiTheme="majorHAnsi" w:hAnsiTheme="majorHAnsi" w:cstheme="majorHAnsi"/>
-              </w:rPr>
-              <w:t xml:space="preserve"> </w:t>
-            </w:r>
-            <w:proofErr w:type="spellStart"/>
-            <w:r>
-              <w:rPr>
-                <w:rFonts w:asciiTheme="majorHAnsi" w:hAnsiTheme="majorHAnsi" w:cstheme="majorHAnsi"/>
-              </w:rPr>
-              <w:t>các</w:t>
-            </w:r>
-            <w:proofErr w:type="spellEnd"/>
-            <w:r>
-              <w:rPr>
-                <w:rFonts w:asciiTheme="majorHAnsi" w:hAnsiTheme="majorHAnsi" w:cstheme="majorHAnsi"/>
-              </w:rPr>
-              <w:t xml:space="preserve"> </w:t>
-            </w:r>
-            <w:proofErr w:type="spellStart"/>
-            <w:r>
-              <w:rPr>
-                <w:rFonts w:asciiTheme="majorHAnsi" w:hAnsiTheme="majorHAnsi" w:cstheme="majorHAnsi"/>
-              </w:rPr>
-              <w:t>xe</w:t>
-            </w:r>
-            <w:proofErr w:type="spellEnd"/>
-            <w:r>
-              <w:rPr>
-                <w:rFonts w:asciiTheme="majorHAnsi" w:hAnsiTheme="majorHAnsi" w:cstheme="majorHAnsi"/>
-              </w:rPr>
-              <w:t xml:space="preserve">: - Xe ô </w:t>
-            </w:r>
-            <w:proofErr w:type="spellStart"/>
-            <w:r>
-              <w:rPr>
-                <w:rFonts w:asciiTheme="majorHAnsi" w:hAnsiTheme="majorHAnsi" w:cstheme="majorHAnsi"/>
-              </w:rPr>
-              <w:t>tô</w:t>
-            </w:r>
-            <w:proofErr w:type="spellEnd"/>
-            <w:r>
-              <w:rPr>
-                <w:rFonts w:asciiTheme="majorHAnsi" w:hAnsiTheme="majorHAnsi" w:cstheme="majorHAnsi"/>
-              </w:rPr>
-              <w:t xml:space="preserve"> </w:t>
-            </w:r>
-            <w:proofErr w:type="spellStart"/>
-            <w:r>
-              <w:rPr>
-                <w:rFonts w:asciiTheme="majorHAnsi" w:hAnsiTheme="majorHAnsi" w:cstheme="majorHAnsi"/>
-              </w:rPr>
-              <w:t>chở</w:t>
-            </w:r>
-            <w:proofErr w:type="spellEnd"/>
-            <w:r>
-              <w:rPr>
-                <w:rFonts w:asciiTheme="majorHAnsi" w:hAnsiTheme="majorHAnsi" w:cstheme="majorHAnsi"/>
-              </w:rPr>
-              <w:t xml:space="preserve"> </w:t>
-            </w:r>
-            <w:proofErr w:type="spellStart"/>
-            <w:r>
-              <w:rPr>
-                <w:rFonts w:asciiTheme="majorHAnsi" w:hAnsiTheme="majorHAnsi" w:cstheme="majorHAnsi"/>
-              </w:rPr>
-              <w:t>người</w:t>
-            </w:r>
-            <w:proofErr w:type="spellEnd"/>
-            <w:r>
-              <w:rPr>
-                <w:rFonts w:asciiTheme="majorHAnsi" w:hAnsiTheme="majorHAnsi" w:cstheme="majorHAnsi"/>
-              </w:rPr>
-              <w:t xml:space="preserve">, </w:t>
-            </w:r>
-            <w:proofErr w:type="spellStart"/>
-            <w:r>
-              <w:rPr>
-                <w:rFonts w:asciiTheme="majorHAnsi" w:hAnsiTheme="majorHAnsi" w:cstheme="majorHAnsi"/>
-              </w:rPr>
-              <w:t>nhãn</w:t>
-            </w:r>
-            <w:proofErr w:type="spellEnd"/>
-            <w:r>
-              <w:rPr>
-                <w:rFonts w:asciiTheme="majorHAnsi" w:hAnsiTheme="majorHAnsi" w:cstheme="majorHAnsi"/>
-              </w:rPr>
-              <w:t xml:space="preserve"> </w:t>
-            </w:r>
-            <w:proofErr w:type="spellStart"/>
-            <w:r>
-              <w:rPr>
-                <w:rFonts w:asciiTheme="majorHAnsi" w:hAnsiTheme="majorHAnsi" w:cstheme="majorHAnsi"/>
-              </w:rPr>
-              <w:t>hiệu</w:t>
-            </w:r>
-            <w:proofErr w:type="spellEnd"/>
-            <w:r>
-              <w:rPr>
-                <w:rFonts w:asciiTheme="majorHAnsi" w:hAnsiTheme="majorHAnsi" w:cstheme="majorHAnsi"/>
-              </w:rPr>
-              <w:t xml:space="preserve"> </w:t>
-            </w:r>
-            <w:proofErr w:type="spellStart"/>
-            <w:r>
-              <w:rPr>
-                <w:rFonts w:asciiTheme="majorHAnsi" w:hAnsiTheme="majorHAnsi" w:cstheme="majorHAnsi"/>
-              </w:rPr>
-              <w:t>Vinfast</w:t>
-            </w:r>
-            <w:proofErr w:type="spellEnd"/>
-            <w:r>
-              <w:rPr>
-                <w:rFonts w:asciiTheme="majorHAnsi" w:hAnsiTheme="majorHAnsi" w:cstheme="majorHAnsi"/>
-              </w:rPr>
-              <w:t xml:space="preserve"> LIMO GREEN (</w:t>
-            </w:r>
-            <w:proofErr w:type="spellStart"/>
-            <w:r>
-              <w:rPr>
-                <w:rFonts w:asciiTheme="majorHAnsi" w:hAnsiTheme="majorHAnsi" w:cstheme="majorHAnsi"/>
-              </w:rPr>
-              <w:t>xe</w:t>
-            </w:r>
-            <w:proofErr w:type="spellEnd"/>
-            <w:r>
-              <w:rPr>
-                <w:rFonts w:asciiTheme="majorHAnsi" w:hAnsiTheme="majorHAnsi" w:cstheme="majorHAnsi"/>
-              </w:rPr>
-              <w:t xml:space="preserve"> </w:t>
-            </w:r>
-            <w:proofErr w:type="spellStart"/>
-            <w:r>
-              <w:rPr>
-                <w:rFonts w:asciiTheme="majorHAnsi" w:hAnsiTheme="majorHAnsi" w:cstheme="majorHAnsi"/>
-              </w:rPr>
-              <w:t>điện</w:t>
-            </w:r>
-            <w:proofErr w:type="spellEnd"/>
-            <w:r>
-              <w:rPr>
-                <w:rFonts w:asciiTheme="majorHAnsi" w:hAnsiTheme="majorHAnsi" w:cstheme="majorHAnsi"/>
-              </w:rPr>
-              <w:t xml:space="preserve">), </w:t>
-            </w:r>
-            <w:proofErr w:type="spellStart"/>
-            <w:r>
-              <w:rPr>
-                <w:rFonts w:asciiTheme="majorHAnsi" w:hAnsiTheme="majorHAnsi" w:cstheme="majorHAnsi"/>
-              </w:rPr>
-              <w:t>mới</w:t>
-            </w:r>
-            <w:proofErr w:type="spellEnd"/>
-            <w:r>
-              <w:rPr>
-                <w:rFonts w:asciiTheme="majorHAnsi" w:hAnsiTheme="majorHAnsi" w:cstheme="majorHAnsi"/>
-              </w:rPr>
-              <w:t xml:space="preserve"> 100%, </w:t>
-            </w:r>
-            <w:proofErr w:type="spellStart"/>
-            <w:r>
-              <w:rPr>
-                <w:rFonts w:asciiTheme="majorHAnsi" w:hAnsiTheme="majorHAnsi" w:cstheme="majorHAnsi"/>
-              </w:rPr>
-              <w:t>xuất</w:t>
-            </w:r>
-            <w:proofErr w:type="spellEnd"/>
-            <w:r>
-              <w:rPr>
-                <w:rFonts w:asciiTheme="majorHAnsi" w:hAnsiTheme="majorHAnsi" w:cstheme="majorHAnsi"/>
-              </w:rPr>
-              <w:t xml:space="preserve"> </w:t>
-            </w:r>
-            <w:proofErr w:type="spellStart"/>
-            <w:r>
-              <w:rPr>
-                <w:rFonts w:asciiTheme="majorHAnsi" w:hAnsiTheme="majorHAnsi" w:cstheme="majorHAnsi"/>
-              </w:rPr>
-              <w:t>xứ</w:t>
-            </w:r>
-            <w:proofErr w:type="spellEnd"/>
-            <w:r>
-              <w:rPr>
-                <w:rFonts w:asciiTheme="majorHAnsi" w:hAnsiTheme="majorHAnsi" w:cstheme="majorHAnsi"/>
-              </w:rPr>
-              <w:t xml:space="preserve">: Việt Nam, </w:t>
-            </w:r>
-            <w:proofErr w:type="spellStart"/>
-            <w:r>
-              <w:rPr>
-                <w:rFonts w:asciiTheme="majorHAnsi" w:hAnsiTheme="majorHAnsi" w:cstheme="majorHAnsi"/>
-              </w:rPr>
-              <w:t>số</w:t>
-            </w:r>
-            <w:proofErr w:type="spellEnd"/>
-            <w:r>
-              <w:rPr>
-                <w:rFonts w:asciiTheme="majorHAnsi" w:hAnsiTheme="majorHAnsi" w:cstheme="majorHAnsi"/>
-              </w:rPr>
-              <w:t xml:space="preserve"> </w:t>
-            </w:r>
-            <w:proofErr w:type="spellStart"/>
-            <w:r>
-              <w:rPr>
-                <w:rFonts w:asciiTheme="majorHAnsi" w:hAnsiTheme="majorHAnsi" w:cstheme="majorHAnsi"/>
-              </w:rPr>
-              <w:t>khung</w:t>
-            </w:r>
-            <w:proofErr w:type="spellEnd"/>
-            <w:r>
-              <w:rPr>
-                <w:rFonts w:asciiTheme="majorHAnsi" w:hAnsiTheme="majorHAnsi" w:cstheme="majorHAnsi"/>
-              </w:rPr>
-              <w:t xml:space="preserve">: </w:t>
+              <w:t xml:space="preserve">Thanh toán 75% giá trị xe hoặc các xe: - Xe ô tô chở người, nhãn hiệu Vinfast LIMO GREEN (xe điện), mới 100%, xuất xứ: Việt Nam, số khung: </w:t>
             </w:r>
           </w:p>
           <w:p>
@@ -6682,35 +4312,7 @@
               <w:rPr>
                 <w:rFonts w:asciiTheme="majorHAnsi" w:hAnsiTheme="majorHAnsi" w:cstheme="majorHAnsi"/>
               </w:rPr>
-              <w:t xml:space="preserve">RLLVFPNT0TH713508, </w:t>
-            </w:r>
-            <w:proofErr w:type="spellStart"/>
-            <w:r>
-              <w:rPr>
-                <w:rFonts w:asciiTheme="majorHAnsi" w:hAnsiTheme="majorHAnsi" w:cstheme="majorHAnsi"/>
-              </w:rPr>
-              <w:t>số</w:t>
-            </w:r>
-            <w:proofErr w:type="spellEnd"/>
-            <w:r>
-              <w:rPr>
-                <w:rFonts w:asciiTheme="majorHAnsi" w:hAnsiTheme="majorHAnsi" w:cstheme="majorHAnsi"/>
-              </w:rPr>
-              <w:t xml:space="preserve"> </w:t>
-            </w:r>
-            <w:proofErr w:type="spellStart"/>
-            <w:r>
-              <w:rPr>
-                <w:rFonts w:asciiTheme="majorHAnsi" w:hAnsiTheme="majorHAnsi" w:cstheme="majorHAnsi"/>
-              </w:rPr>
-              <w:t>máy</w:t>
-            </w:r>
-            <w:proofErr w:type="spellEnd"/>
-            <w:r>
-              <w:rPr>
-                <w:rFonts w:asciiTheme="majorHAnsi" w:hAnsiTheme="majorHAnsi" w:cstheme="majorHAnsi"/>
-              </w:rPr>
-              <w:t>: ENBALB25C280009</w:t>
+              <w:t>RLLVFPNT0TH713508, số máy: ENBALB25C280009</w:t>
             </w:r>
           </w:p>
         </w:tc>
@@ -6749,7 +4351,7 @@
         </w:tc>
         <w:tc>
           <w:tcPr>
-            <w:tcW w:w="3828" w:type="dxa"/>
+            <w:tcW w:w="4167" w:type="dxa"/>
             <w:tcBorders>
               <w:top w:val="single" w:sz="7" w:space="0" w:color="000000"/>
               <w:left w:val="single" w:sz="7" w:space="0" w:color="000000"/>
@@ -6770,165 +4372,12 @@
                 <w:rFonts w:asciiTheme="majorHAnsi" w:hAnsiTheme="majorHAnsi" w:cstheme="majorHAnsi"/>
               </w:rPr>
             </w:pPr>
-            <w:proofErr w:type="spellStart"/>
             <w:r>
               <w:rPr>
                 <w:rFonts w:asciiTheme="majorHAnsi" w:hAnsiTheme="majorHAnsi" w:cstheme="majorHAnsi"/>
                 <w:color w:val="FF0000"/>
               </w:rPr>
-              <w:t>Hồ</w:t>
-            </w:r>
-            <w:proofErr w:type="spellEnd"/>
-            <w:r>
-              <w:rPr>
-                <w:rFonts w:asciiTheme="majorHAnsi" w:hAnsiTheme="majorHAnsi" w:cstheme="majorHAnsi"/>
-                <w:color w:val="FF0000"/>
-              </w:rPr>
-              <w:t xml:space="preserve"> </w:t>
-            </w:r>
-            <w:proofErr w:type="spellStart"/>
-            <w:r>
-              <w:rPr>
-                <w:rFonts w:asciiTheme="majorHAnsi" w:hAnsiTheme="majorHAnsi" w:cstheme="majorHAnsi"/>
-                <w:color w:val="FF0000"/>
-              </w:rPr>
-              <w:t>sơ</w:t>
-            </w:r>
-            <w:proofErr w:type="spellEnd"/>
-            <w:r>
-              <w:rPr>
-                <w:rFonts w:asciiTheme="majorHAnsi" w:hAnsiTheme="majorHAnsi" w:cstheme="majorHAnsi"/>
-                <w:color w:val="FF0000"/>
-              </w:rPr>
-              <w:t xml:space="preserve"> </w:t>
-            </w:r>
-            <w:proofErr w:type="spellStart"/>
-            <w:r>
-              <w:rPr>
-                <w:rFonts w:asciiTheme="majorHAnsi" w:hAnsiTheme="majorHAnsi" w:cstheme="majorHAnsi"/>
-                <w:color w:val="FF0000"/>
-              </w:rPr>
-              <w:t>xe</w:t>
-            </w:r>
-            <w:proofErr w:type="spellEnd"/>
-            <w:r>
-              <w:rPr>
-                <w:rFonts w:asciiTheme="majorHAnsi" w:hAnsiTheme="majorHAnsi" w:cstheme="majorHAnsi"/>
-                <w:color w:val="FF0000"/>
-              </w:rPr>
-              <w:t xml:space="preserve"> </w:t>
-            </w:r>
-            <w:proofErr w:type="spellStart"/>
-            <w:r>
-              <w:rPr>
-                <w:rFonts w:asciiTheme="majorHAnsi" w:hAnsiTheme="majorHAnsi" w:cstheme="majorHAnsi"/>
-                <w:color w:val="FF0000"/>
-              </w:rPr>
-              <w:t>và</w:t>
-            </w:r>
-            <w:proofErr w:type="spellEnd"/>
-            <w:r>
-              <w:rPr>
-                <w:rFonts w:asciiTheme="majorHAnsi" w:hAnsiTheme="majorHAnsi" w:cstheme="majorHAnsi"/>
-                <w:color w:val="FF0000"/>
-              </w:rPr>
-              <w:t xml:space="preserve"> </w:t>
-            </w:r>
-            <w:proofErr w:type="spellStart"/>
-            <w:r>
-              <w:rPr>
-                <w:rFonts w:asciiTheme="majorHAnsi" w:hAnsiTheme="majorHAnsi" w:cstheme="majorHAnsi"/>
-                <w:color w:val="FF0000"/>
-              </w:rPr>
-              <w:t>các</w:t>
-            </w:r>
-            <w:proofErr w:type="spellEnd"/>
-            <w:r>
-              <w:rPr>
-                <w:rFonts w:asciiTheme="majorHAnsi" w:hAnsiTheme="majorHAnsi" w:cstheme="majorHAnsi"/>
-                <w:color w:val="FF0000"/>
-              </w:rPr>
-              <w:t xml:space="preserve"> </w:t>
-            </w:r>
-            <w:proofErr w:type="spellStart"/>
-            <w:r>
-              <w:rPr>
-                <w:rFonts w:asciiTheme="majorHAnsi" w:hAnsiTheme="majorHAnsi" w:cstheme="majorHAnsi"/>
-                <w:color w:val="FF0000"/>
-              </w:rPr>
-              <w:t>đề</w:t>
-            </w:r>
-            <w:proofErr w:type="spellEnd"/>
-            <w:r>
-              <w:rPr>
-                <w:rFonts w:asciiTheme="majorHAnsi" w:hAnsiTheme="majorHAnsi" w:cstheme="majorHAnsi"/>
-                <w:color w:val="FF0000"/>
-              </w:rPr>
-              <w:t xml:space="preserve"> </w:t>
-            </w:r>
-            <w:proofErr w:type="spellStart"/>
-            <w:r>
-              <w:rPr>
-                <w:rFonts w:asciiTheme="majorHAnsi" w:hAnsiTheme="majorHAnsi" w:cstheme="majorHAnsi"/>
-                <w:color w:val="FF0000"/>
-              </w:rPr>
-              <w:t>nghị</w:t>
-            </w:r>
-            <w:proofErr w:type="spellEnd"/>
-            <w:r>
-              <w:rPr>
-                <w:rFonts w:asciiTheme="majorHAnsi" w:hAnsiTheme="majorHAnsi" w:cstheme="majorHAnsi"/>
-                <w:color w:val="FF0000"/>
-              </w:rPr>
-              <w:t xml:space="preserve"> </w:t>
-            </w:r>
-            <w:proofErr w:type="spellStart"/>
-            <w:r>
-              <w:rPr>
-                <w:rFonts w:asciiTheme="majorHAnsi" w:hAnsiTheme="majorHAnsi" w:cstheme="majorHAnsi"/>
-                <w:color w:val="FF0000"/>
-              </w:rPr>
-              <w:t>có</w:t>
-            </w:r>
-            <w:proofErr w:type="spellEnd"/>
-            <w:r>
-              <w:rPr>
-                <w:rFonts w:asciiTheme="majorHAnsi" w:hAnsiTheme="majorHAnsi" w:cstheme="majorHAnsi"/>
-                <w:color w:val="FF0000"/>
-              </w:rPr>
-              <w:t xml:space="preserve"> </w:t>
-            </w:r>
-            <w:proofErr w:type="spellStart"/>
-            <w:r>
-              <w:rPr>
-                <w:rFonts w:asciiTheme="majorHAnsi" w:hAnsiTheme="majorHAnsi" w:cstheme="majorHAnsi"/>
-                <w:color w:val="FF0000"/>
-              </w:rPr>
-              <w:t>liên</w:t>
-            </w:r>
-            <w:proofErr w:type="spellEnd"/>
-            <w:r>
-              <w:rPr>
-                <w:rFonts w:asciiTheme="majorHAnsi" w:hAnsiTheme="majorHAnsi" w:cstheme="majorHAnsi"/>
-                <w:color w:val="FF0000"/>
-              </w:rPr>
-              <w:t xml:space="preserve"> </w:t>
-            </w:r>
-            <w:proofErr w:type="spellStart"/>
-            <w:r>
-              <w:rPr>
-                <w:rFonts w:asciiTheme="majorHAnsi" w:hAnsiTheme="majorHAnsi" w:cstheme="majorHAnsi"/>
-                <w:color w:val="FF0000"/>
-              </w:rPr>
-              <w:t>quan</w:t>
-            </w:r>
-            <w:proofErr w:type="spellEnd"/>
-            <w:r>
-              <w:rPr>
-                <w:rFonts w:asciiTheme="majorHAnsi" w:hAnsiTheme="majorHAnsi" w:cstheme="majorHAnsi"/>
-                <w:color w:val="FF0000"/>
-              </w:rPr>
-              <w:t>.</w:t>
+              <w:t>Hồ sơ xe và các đề nghị có liên quan.</w:t>
             </w:r>
           </w:p>
           <w:p>
@@ -6949,23 +4398,7 @@
                 <w:rFonts w:asciiTheme="majorHAnsi" w:hAnsiTheme="majorHAnsi" w:cstheme="majorHAnsi"/>
                 <w:color w:val="FF0000"/>
               </w:rPr>
-              <w:t xml:space="preserve">UNC </w:t>
-            </w:r>
-            <w:proofErr w:type="spellStart"/>
-            <w:r>
-              <w:rPr>
-                <w:rFonts w:asciiTheme="majorHAnsi" w:hAnsiTheme="majorHAnsi" w:cstheme="majorHAnsi"/>
-                <w:color w:val="FF0000"/>
-              </w:rPr>
-              <w:t>ngày</w:t>
-            </w:r>
-            <w:proofErr w:type="spellEnd"/>
-            <w:r>
-              <w:rPr>
-                <w:rFonts w:asciiTheme="majorHAnsi" w:hAnsiTheme="majorHAnsi" w:cstheme="majorHAnsi"/>
-                <w:color w:val="FF0000"/>
-              </w:rPr>
-              <w:t xml:space="preserve"> 04/02/2026</w:t>
+              <w:t>UNC ngày 04/02/2026</w:t>
             </w:r>
           </w:p>
         </w:tc>
@@ -7055,18 +4488,18 @@
     <w:tbl>
       <w:tblPr>
         <w:tblStyle w:val="TableGrid0"/>
-        <w:tblW w:w="8635" w:type="dxa"/>
-        <w:tblInd w:w="287" w:type="dxa"/>
+        <w:tblW w:w="9810" w:type="dxa"/>
+        <w:tblInd w:w="-459" w:type="dxa"/>
         <w:tblCellMar>
           <w:left w:w="35" w:type="dxa"/>
         </w:tblCellMar>
         <w:tblLook w:val="04A0" w:firstRow="1" w:lastRow="0" w:firstColumn="1" w:lastColumn="0" w:noHBand="0" w:noVBand="1"/>
       </w:tblPr>
       <w:tblGrid>
-        <w:gridCol w:w="322"/>
-        <w:gridCol w:w="2643"/>
+        <w:gridCol w:w="540"/>
+        <w:gridCol w:w="3171"/>
         <w:gridCol w:w="1805"/>
-        <w:gridCol w:w="3865"/>
+        <w:gridCol w:w="4294"/>
       </w:tblGrid>
       <w:tr>
         <w:trPr>
@@ -7074,7 +4507,7 @@
         </w:trPr>
         <w:tc>
           <w:tcPr>
-            <w:tcW w:w="322" w:type="dxa"/>
+            <w:tcW w:w="540" w:type="dxa"/>
             <w:tcBorders>
               <w:top w:val="single" w:sz="7" w:space="0" w:color="000000"/>
               <w:left w:val="single" w:sz="7" w:space="0" w:color="000000"/>
@@ -7103,7 +4536,7 @@
         </w:tc>
         <w:tc>
           <w:tcPr>
-            <w:tcW w:w="2643" w:type="dxa"/>
+            <w:tcW w:w="3171" w:type="dxa"/>
             <w:tcBorders>
               <w:top w:val="single" w:sz="7" w:space="0" w:color="000000"/>
               <w:left w:val="single" w:sz="7" w:space="0" w:color="000000"/>
@@ -7198,7 +4631,7 @@
         </w:tc>
         <w:tc>
           <w:tcPr>
-            <w:tcW w:w="3865" w:type="dxa"/>
+            <w:tcW w:w="4294" w:type="dxa"/>
             <w:tcBorders>
               <w:top w:val="single" w:sz="7" w:space="0" w:color="000000"/>
               <w:left w:val="single" w:sz="7" w:space="0" w:color="000000"/>
@@ -7255,7 +4688,7 @@
         </w:trPr>
         <w:tc>
           <w:tcPr>
-            <w:tcW w:w="322" w:type="dxa"/>
+            <w:tcW w:w="540" w:type="dxa"/>
             <w:tcBorders>
               <w:top w:val="single" w:sz="7" w:space="0" w:color="000000"/>
               <w:left w:val="single" w:sz="7" w:space="0" w:color="000000"/>
@@ -7283,7 +4716,7 @@
         </w:tc>
         <w:tc>
           <w:tcPr>
-            <w:tcW w:w="2643" w:type="dxa"/>
+            <w:tcW w:w="3171" w:type="dxa"/>
             <w:tcBorders>
               <w:top w:val="single" w:sz="7" w:space="0" w:color="000000"/>
               <w:left w:val="single" w:sz="7" w:space="0" w:color="000000"/>
@@ -7378,7 +4811,7 @@
         </w:tc>
         <w:tc>
           <w:tcPr>
-            <w:tcW w:w="3865" w:type="dxa"/>
+            <w:tcW w:w="4294" w:type="dxa"/>
             <w:tcBorders>
               <w:top w:val="single" w:sz="7" w:space="0" w:color="000000"/>
               <w:left w:val="single" w:sz="7" w:space="0" w:color="000000"/>
@@ -7435,7 +4868,7 @@
         </w:trPr>
         <w:tc>
           <w:tcPr>
-            <w:tcW w:w="322" w:type="dxa"/>
+            <w:tcW w:w="540" w:type="dxa"/>
             <w:tcBorders>
               <w:top w:val="single" w:sz="7" w:space="0" w:color="000000"/>
               <w:left w:val="single" w:sz="7" w:space="0" w:color="000000"/>
@@ -7463,7 +4896,7 @@
         </w:tc>
         <w:tc>
           <w:tcPr>
-            <w:tcW w:w="2643" w:type="dxa"/>
+            <w:tcW w:w="3171" w:type="dxa"/>
             <w:tcBorders>
               <w:top w:val="single" w:sz="7" w:space="0" w:color="000000"/>
               <w:left w:val="single" w:sz="7" w:space="0" w:color="000000"/>
@@ -7530,7 +4963,7 @@
         </w:tc>
         <w:tc>
           <w:tcPr>
-            <w:tcW w:w="3865" w:type="dxa"/>
+            <w:tcW w:w="4294" w:type="dxa"/>
             <w:tcBorders>
               <w:top w:val="single" w:sz="7" w:space="0" w:color="000000"/>
               <w:left w:val="single" w:sz="7" w:space="0" w:color="000000"/>
@@ -7587,7 +5020,7 @@
         </w:trPr>
         <w:tc>
           <w:tcPr>
-            <w:tcW w:w="322" w:type="dxa"/>
+            <w:tcW w:w="540" w:type="dxa"/>
             <w:tcBorders>
               <w:top w:val="single" w:sz="7" w:space="0" w:color="000000"/>
               <w:left w:val="single" w:sz="7" w:space="0" w:color="000000"/>
@@ -7606,7 +5039,7 @@
         </w:tc>
         <w:tc>
           <w:tcPr>
-            <w:tcW w:w="2643" w:type="dxa"/>
+            <w:tcW w:w="3171" w:type="dxa"/>
             <w:tcBorders>
               <w:top w:val="single" w:sz="7" w:space="0" w:color="000000"/>
               <w:left w:val="single" w:sz="7" w:space="0" w:color="000000"/>
@@ -7663,7 +5096,7 @@
         </w:tc>
         <w:tc>
           <w:tcPr>
-            <w:tcW w:w="3865" w:type="dxa"/>
+            <w:tcW w:w="4294" w:type="dxa"/>
             <w:tcBorders>
               <w:top w:val="single" w:sz="7" w:space="0" w:color="000000"/>
               <w:left w:val="single" w:sz="7" w:space="0" w:color="000000"/>
@@ -7711,35 +5144,7 @@
         <w:rPr>
           <w:rFonts w:asciiTheme="majorHAnsi" w:hAnsiTheme="majorHAnsi" w:cstheme="majorHAnsi"/>
         </w:rPr>
-        <w:t xml:space="preserve">- </w:t>
-      </w:r>
-      <w:proofErr w:type="spellStart"/>
-      <w:r>
-        <w:rPr>
-          <w:rFonts w:asciiTheme="majorHAnsi" w:hAnsiTheme="majorHAnsi" w:cstheme="majorHAnsi"/>
-        </w:rPr>
-        <w:t>Lãi</w:t>
-      </w:r>
-      <w:proofErr w:type="spellEnd"/>
-      <w:r>
-        <w:rPr>
-          <w:rFonts w:asciiTheme="majorHAnsi" w:hAnsiTheme="majorHAnsi" w:cstheme="majorHAnsi"/>
-        </w:rPr>
-        <w:t xml:space="preserve"> </w:t>
-      </w:r>
-      <w:proofErr w:type="spellStart"/>
-      <w:r>
-        <w:rPr>
-          <w:rFonts w:asciiTheme="majorHAnsi" w:hAnsiTheme="majorHAnsi" w:cstheme="majorHAnsi"/>
-        </w:rPr>
-        <w:t>suất</w:t>
-      </w:r>
-      <w:proofErr w:type="spellEnd"/>
-      <w:r>
-        <w:rPr>
-          <w:rFonts w:asciiTheme="majorHAnsi" w:hAnsiTheme="majorHAnsi" w:cstheme="majorHAnsi"/>
-        </w:rPr>
-        <w:t>:</w:t>
+        <w:t>- Lãi suất:</w:t>
       </w:r>
       <w:r>
         <w:rPr>
@@ -7752,17 +5157,8 @@
           <w:rFonts w:asciiTheme="majorHAnsi" w:hAnsiTheme="majorHAnsi" w:cstheme="majorHAnsi"/>
           <w:b/>
         </w:rPr>
-        <w:t>7.0%/</w:t>
-      </w:r>
-      <w:proofErr w:type="spellStart"/>
-      <w:r>
-        <w:rPr>
-          <w:rFonts w:asciiTheme="majorHAnsi" w:hAnsiTheme="majorHAnsi" w:cstheme="majorHAnsi"/>
-          <w:b/>
-        </w:rPr>
-        <w:t>năm</w:t>
-      </w:r>
-      <w:proofErr w:type="spellEnd"/>
+        <w:t>7.0%/năm</w:t>
+      </w:r>
     </w:p>
     <w:p>
       <w:pPr>
@@ -7792,47 +5188,11 @@
           <w:rFonts w:asciiTheme="majorHAnsi" w:hAnsiTheme="majorHAnsi" w:cstheme="majorHAnsi"/>
         </w:rPr>
       </w:pPr>
-      <w:proofErr w:type="spellStart"/>
-      <w:r>
-        <w:rPr>
-          <w:rFonts w:asciiTheme="majorHAnsi" w:hAnsiTheme="majorHAnsi" w:cstheme="majorHAnsi"/>
-        </w:rPr>
-        <w:t>Phí</w:t>
-      </w:r>
-      <w:proofErr w:type="spellEnd"/>
-      <w:r>
-        <w:rPr>
-          <w:rFonts w:asciiTheme="majorHAnsi" w:hAnsiTheme="majorHAnsi" w:cstheme="majorHAnsi"/>
-        </w:rPr>
-        <w:t xml:space="preserve">: Theo </w:t>
-      </w:r>
-      <w:proofErr w:type="spellStart"/>
-      <w:r>
-        <w:rPr>
-          <w:rFonts w:asciiTheme="majorHAnsi" w:hAnsiTheme="majorHAnsi" w:cstheme="majorHAnsi"/>
-        </w:rPr>
-        <w:t>quy</w:t>
-      </w:r>
-      <w:proofErr w:type="spellEnd"/>
-      <w:r>
-        <w:rPr>
-          <w:rFonts w:asciiTheme="majorHAnsi" w:hAnsiTheme="majorHAnsi" w:cstheme="majorHAnsi"/>
-        </w:rPr>
-        <w:t xml:space="preserve"> </w:t>
-      </w:r>
-      <w:proofErr w:type="spellStart"/>
-      <w:r>
-        <w:rPr>
-          <w:rFonts w:asciiTheme="majorHAnsi" w:hAnsiTheme="majorHAnsi" w:cstheme="majorHAnsi"/>
-        </w:rPr>
-        <w:t>định</w:t>
-      </w:r>
-      <w:proofErr w:type="spellEnd"/>
-      <w:r>
-        <w:rPr>
-          <w:rFonts w:asciiTheme="majorHAnsi" w:hAnsiTheme="majorHAnsi" w:cstheme="majorHAnsi"/>
-        </w:rPr>
-        <w:t xml:space="preserve"> BIDV</w:t>
+      <w:r>
+        <w:rPr>
+          <w:rFonts w:asciiTheme="majorHAnsi" w:hAnsiTheme="majorHAnsi" w:cstheme="majorHAnsi"/>
+        </w:rPr>
+        <w:t>Phí: Theo quy định BIDV</w:t>
       </w:r>
     </w:p>
     <w:p>
@@ -7943,35 +5303,7 @@
               <w:rPr>
                 <w:rFonts w:asciiTheme="majorHAnsi" w:hAnsiTheme="majorHAnsi" w:cstheme="majorHAnsi"/>
               </w:rPr>
-              <w:t>MỨC PHÍ (</w:t>
-            </w:r>
-            <w:proofErr w:type="spellStart"/>
-            <w:r>
-              <w:rPr>
-                <w:rFonts w:asciiTheme="majorHAnsi" w:hAnsiTheme="majorHAnsi" w:cstheme="majorHAnsi"/>
-              </w:rPr>
-              <w:t>chưa</w:t>
-            </w:r>
-            <w:proofErr w:type="spellEnd"/>
-            <w:r>
-              <w:rPr>
-                <w:rFonts w:asciiTheme="majorHAnsi" w:hAnsiTheme="majorHAnsi" w:cstheme="majorHAnsi"/>
-              </w:rPr>
-              <w:t xml:space="preserve"> bao </w:t>
-            </w:r>
-            <w:proofErr w:type="spellStart"/>
-            <w:r>
-              <w:rPr>
-                <w:rFonts w:asciiTheme="majorHAnsi" w:hAnsiTheme="majorHAnsi" w:cstheme="majorHAnsi"/>
-              </w:rPr>
-              <w:t>gồm</w:t>
-            </w:r>
-            <w:proofErr w:type="spellEnd"/>
-            <w:r>
-              <w:rPr>
-                <w:rFonts w:asciiTheme="majorHAnsi" w:hAnsiTheme="majorHAnsi" w:cstheme="majorHAnsi"/>
-              </w:rPr>
-              <w:t xml:space="preserve"> VAT)</w:t>
+              <w:t>MỨC PHÍ (chưa bao gồm VAT)</w:t>
             </w:r>
           </w:p>
         </w:tc>
@@ -7996,63 +5328,7 @@
               <w:rPr>
                 <w:rFonts w:asciiTheme="majorHAnsi" w:hAnsiTheme="majorHAnsi" w:cstheme="majorHAnsi"/>
               </w:rPr>
-              <w:t xml:space="preserve">Số tiền thu phí chuyển </w:t>
-            </w:r>
-            <w:proofErr w:type="spellStart"/>
-            <w:r>
-              <w:rPr>
-                <w:rFonts w:asciiTheme="majorHAnsi" w:hAnsiTheme="majorHAnsi" w:cstheme="majorHAnsi"/>
-              </w:rPr>
-              <w:t>tiền</w:t>
-            </w:r>
-            <w:proofErr w:type="spellEnd"/>
-            <w:r>
-              <w:rPr>
-                <w:rFonts w:asciiTheme="majorHAnsi" w:hAnsiTheme="majorHAnsi" w:cstheme="majorHAnsi"/>
-              </w:rPr>
-              <w:t xml:space="preserve"> </w:t>
-            </w:r>
-            <w:proofErr w:type="spellStart"/>
-            <w:r>
-              <w:rPr>
-                <w:rFonts w:asciiTheme="majorHAnsi" w:hAnsiTheme="majorHAnsi" w:cstheme="majorHAnsi"/>
-              </w:rPr>
-              <w:t>tại</w:t>
-            </w:r>
-            <w:proofErr w:type="spellEnd"/>
-            <w:r>
-              <w:rPr>
-                <w:rFonts w:asciiTheme="majorHAnsi" w:hAnsiTheme="majorHAnsi" w:cstheme="majorHAnsi"/>
-              </w:rPr>
-              <w:t xml:space="preserve"> </w:t>
-            </w:r>
-            <w:proofErr w:type="spellStart"/>
-            <w:r>
-              <w:rPr>
-                <w:rFonts w:asciiTheme="majorHAnsi" w:hAnsiTheme="majorHAnsi" w:cstheme="majorHAnsi"/>
-              </w:rPr>
-              <w:t>mục</w:t>
-            </w:r>
-            <w:proofErr w:type="spellEnd"/>
-            <w:r>
-              <w:rPr>
-                <w:rFonts w:asciiTheme="majorHAnsi" w:hAnsiTheme="majorHAnsi" w:cstheme="majorHAnsi"/>
-              </w:rPr>
-              <w:t xml:space="preserve"> 1 (</w:t>
-            </w:r>
-            <w:proofErr w:type="spellStart"/>
-            <w:r>
-              <w:rPr>
-                <w:rFonts w:asciiTheme="majorHAnsi" w:hAnsiTheme="majorHAnsi" w:cstheme="majorHAnsi"/>
-              </w:rPr>
-              <w:t>chưa</w:t>
-            </w:r>
-            <w:proofErr w:type="spellEnd"/>
-            <w:r>
-              <w:rPr>
-                <w:rFonts w:asciiTheme="majorHAnsi" w:hAnsiTheme="majorHAnsi" w:cstheme="majorHAnsi"/>
-              </w:rPr>
-              <w:t xml:space="preserve"> VAT)- </w:t>
+              <w:t xml:space="preserve">Số tiền thu phí chuyển tiền tại mục 1 (chưa VAT)- </w:t>
             </w:r>
           </w:p>
           <w:p>
@@ -8138,72 +5414,8 @@
               <w:rPr>
                 <w:rFonts w:asciiTheme="majorHAnsi" w:hAnsiTheme="majorHAnsi" w:cstheme="majorHAnsi"/>
               </w:rPr>
-              <w:t xml:space="preserve">Chuyển đi </w:t>
-            </w:r>
-            <w:proofErr w:type="spellStart"/>
-            <w:r>
-              <w:rPr>
-                <w:rFonts w:asciiTheme="majorHAnsi" w:hAnsiTheme="majorHAnsi" w:cstheme="majorHAnsi"/>
-              </w:rPr>
-              <w:t>cùng</w:t>
-            </w:r>
-            <w:proofErr w:type="spellEnd"/>
-            <w:r>
-              <w:rPr>
-                <w:rFonts w:asciiTheme="majorHAnsi" w:hAnsiTheme="majorHAnsi" w:cstheme="majorHAnsi"/>
-              </w:rPr>
-              <w:t xml:space="preserve"> </w:t>
-            </w:r>
-            <w:proofErr w:type="spellStart"/>
-            <w:r>
-              <w:rPr>
-                <w:rFonts w:asciiTheme="majorHAnsi" w:hAnsiTheme="majorHAnsi" w:cstheme="majorHAnsi"/>
-              </w:rPr>
-              <w:t>hệ</w:t>
-            </w:r>
-            <w:proofErr w:type="spellEnd"/>
-            <w:r>
-              <w:rPr>
-                <w:rFonts w:asciiTheme="majorHAnsi" w:hAnsiTheme="majorHAnsi" w:cstheme="majorHAnsi"/>
-              </w:rPr>
-              <w:t xml:space="preserve"> </w:t>
-            </w:r>
-            <w:proofErr w:type="spellStart"/>
-            <w:r>
-              <w:rPr>
-                <w:rFonts w:asciiTheme="majorHAnsi" w:hAnsiTheme="majorHAnsi" w:cstheme="majorHAnsi"/>
-              </w:rPr>
-              <w:t>thống</w:t>
-            </w:r>
-            <w:proofErr w:type="spellEnd"/>
-            <w:r>
-              <w:rPr>
-                <w:rFonts w:asciiTheme="majorHAnsi" w:hAnsiTheme="majorHAnsi" w:cstheme="majorHAnsi"/>
-              </w:rPr>
-              <w:t xml:space="preserve"> BIDV, </w:t>
-            </w:r>
-            <w:proofErr w:type="spellStart"/>
-            <w:r>
-              <w:rPr>
-                <w:rFonts w:asciiTheme="majorHAnsi" w:hAnsiTheme="majorHAnsi" w:cstheme="majorHAnsi"/>
-              </w:rPr>
-              <w:t>khác</w:t>
-            </w:r>
-            <w:proofErr w:type="spellEnd"/>
-            <w:r>
-              <w:rPr>
-                <w:rFonts w:asciiTheme="majorHAnsi" w:hAnsiTheme="majorHAnsi" w:cstheme="majorHAnsi"/>
-              </w:rPr>
-              <w:t xml:space="preserve"> chi </w:t>
-            </w:r>
-            <w:proofErr w:type="spellStart"/>
-            <w:r>
-              <w:rPr>
-                <w:rFonts w:asciiTheme="majorHAnsi" w:hAnsiTheme="majorHAnsi" w:cstheme="majorHAnsi"/>
-              </w:rPr>
-              <w:t>nhánh</w:t>
-            </w:r>
-            <w:proofErr w:type="spellEnd"/>
+              <w:t>Chuyển đi cùng hệ thống BIDV, khác chi nhánh</w:t>
+            </w:r>
           </w:p>
         </w:tc>
         <w:tc>
@@ -8239,33 +5451,11 @@
                 <w:rFonts w:asciiTheme="majorHAnsi" w:hAnsiTheme="majorHAnsi" w:cstheme="majorHAnsi"/>
               </w:rPr>
             </w:pPr>
-            <w:proofErr w:type="spellStart"/>
-            <w:r>
-              <w:rPr>
-                <w:rFonts w:asciiTheme="majorHAnsi" w:hAnsiTheme="majorHAnsi" w:cstheme="majorHAnsi"/>
-              </w:rPr>
-              <w:t>Tối</w:t>
-            </w:r>
-            <w:proofErr w:type="spellEnd"/>
-            <w:r>
-              <w:rPr>
-                <w:rFonts w:asciiTheme="majorHAnsi" w:hAnsiTheme="majorHAnsi" w:cstheme="majorHAnsi"/>
-              </w:rPr>
-              <w:t xml:space="preserve"> </w:t>
-            </w:r>
-            <w:proofErr w:type="spellStart"/>
-            <w:r>
-              <w:rPr>
-                <w:rFonts w:asciiTheme="majorHAnsi" w:hAnsiTheme="majorHAnsi" w:cstheme="majorHAnsi"/>
-              </w:rPr>
-              <w:t>thiểu</w:t>
-            </w:r>
-            <w:proofErr w:type="spellEnd"/>
-            <w:r>
-              <w:rPr>
-                <w:rFonts w:asciiTheme="majorHAnsi" w:hAnsiTheme="majorHAnsi" w:cstheme="majorHAnsi"/>
-              </w:rPr>
-              <w:t xml:space="preserve"> 10.000VND,</w:t>
+            <w:r>
+              <w:rPr>
+                <w:rFonts w:asciiTheme="majorHAnsi" w:hAnsiTheme="majorHAnsi" w:cstheme="majorHAnsi"/>
+              </w:rPr>
+              <w:t>Tối thiểu 10.000VND,</w:t>
             </w:r>
           </w:p>
           <w:p>
@@ -8280,35 +5470,7 @@
               <w:rPr>
                 <w:rFonts w:asciiTheme="majorHAnsi" w:hAnsiTheme="majorHAnsi" w:cstheme="majorHAnsi"/>
               </w:rPr>
-              <w:t xml:space="preserve"> </w:t>
-            </w:r>
-            <w:proofErr w:type="spellStart"/>
-            <w:r>
-              <w:rPr>
-                <w:rFonts w:asciiTheme="majorHAnsi" w:hAnsiTheme="majorHAnsi" w:cstheme="majorHAnsi"/>
-              </w:rPr>
-              <w:t>Tối</w:t>
-            </w:r>
-            <w:proofErr w:type="spellEnd"/>
-            <w:r>
-              <w:rPr>
-                <w:rFonts w:asciiTheme="majorHAnsi" w:hAnsiTheme="majorHAnsi" w:cstheme="majorHAnsi"/>
-              </w:rPr>
-              <w:t xml:space="preserve"> </w:t>
-            </w:r>
-            <w:proofErr w:type="spellStart"/>
-            <w:r>
-              <w:rPr>
-                <w:rFonts w:asciiTheme="majorHAnsi" w:hAnsiTheme="majorHAnsi" w:cstheme="majorHAnsi"/>
-              </w:rPr>
-              <w:t>đa</w:t>
-            </w:r>
-            <w:proofErr w:type="spellEnd"/>
-            <w:r>
-              <w:rPr>
-                <w:rFonts w:asciiTheme="majorHAnsi" w:hAnsiTheme="majorHAnsi" w:cstheme="majorHAnsi"/>
-              </w:rPr>
-              <w:t xml:space="preserve"> 500.000VND</w:t>
+              <w:t xml:space="preserve"> Tối đa 500.000VND</w:t>
             </w:r>
           </w:p>
         </w:tc>
@@ -8405,61 +5567,11 @@
           <w:rFonts w:asciiTheme="majorHAnsi" w:hAnsiTheme="majorHAnsi" w:cstheme="majorHAnsi"/>
         </w:rPr>
       </w:pPr>
-      <w:proofErr w:type="spellStart"/>
-      <w:r>
-        <w:rPr>
-          <w:rFonts w:asciiTheme="majorHAnsi" w:hAnsiTheme="majorHAnsi" w:cstheme="majorHAnsi"/>
-        </w:rPr>
-        <w:t>Số</w:t>
-      </w:r>
-      <w:proofErr w:type="spellEnd"/>
-      <w:r>
-        <w:rPr>
-          <w:rFonts w:asciiTheme="majorHAnsi" w:hAnsiTheme="majorHAnsi" w:cstheme="majorHAnsi"/>
-        </w:rPr>
-        <w:t xml:space="preserve"> </w:t>
-      </w:r>
-      <w:proofErr w:type="spellStart"/>
-      <w:r>
-        <w:rPr>
-          <w:rFonts w:asciiTheme="majorHAnsi" w:hAnsiTheme="majorHAnsi" w:cstheme="majorHAnsi"/>
-        </w:rPr>
-        <w:t>tài</w:t>
-      </w:r>
-      <w:proofErr w:type="spellEnd"/>
-      <w:r>
-        <w:rPr>
-          <w:rFonts w:asciiTheme="majorHAnsi" w:hAnsiTheme="majorHAnsi" w:cstheme="majorHAnsi"/>
-        </w:rPr>
-        <w:t xml:space="preserve"> </w:t>
-      </w:r>
-      <w:proofErr w:type="spellStart"/>
-      <w:r>
-        <w:rPr>
-          <w:rFonts w:asciiTheme="majorHAnsi" w:hAnsiTheme="majorHAnsi" w:cstheme="majorHAnsi"/>
-        </w:rPr>
-        <w:t>khoản</w:t>
-      </w:r>
-      <w:proofErr w:type="spellEnd"/>
-      <w:r>
-        <w:rPr>
-          <w:rFonts w:asciiTheme="majorHAnsi" w:hAnsiTheme="majorHAnsi" w:cstheme="majorHAnsi"/>
-        </w:rPr>
-        <w:t xml:space="preserve"> </w:t>
-      </w:r>
-      <w:proofErr w:type="spellStart"/>
-      <w:r>
-        <w:rPr>
-          <w:rFonts w:asciiTheme="majorHAnsi" w:hAnsiTheme="majorHAnsi" w:cstheme="majorHAnsi"/>
-        </w:rPr>
-        <w:t>thu</w:t>
-      </w:r>
-      <w:proofErr w:type="spellEnd"/>
-      <w:r>
-        <w:rPr>
-          <w:rFonts w:asciiTheme="majorHAnsi" w:hAnsiTheme="majorHAnsi" w:cstheme="majorHAnsi"/>
-        </w:rPr>
-        <w:t xml:space="preserve"> phí: 6910365441</w:t>
+      <w:r>
+        <w:rPr>
+          <w:rFonts w:asciiTheme="majorHAnsi" w:hAnsiTheme="majorHAnsi" w:cstheme="majorHAnsi"/>
+        </w:rPr>
+        <w:t>Số tài khoản thu phí: 6910365441</w:t>
       </w:r>
     </w:p>
     <w:p>
@@ -8712,16 +5824,8 @@
               <w:rPr>
                 <w:rFonts w:asciiTheme="majorHAnsi" w:hAnsiTheme="majorHAnsi" w:cstheme="majorHAnsi"/>
               </w:rPr>
-              <w:t xml:space="preserve">84 </w:t>
-            </w:r>
-            <w:proofErr w:type="spellStart"/>
-            <w:r>
-              <w:rPr>
-                <w:rFonts w:asciiTheme="majorHAnsi" w:hAnsiTheme="majorHAnsi" w:cstheme="majorHAnsi"/>
-              </w:rPr>
-              <w:t>ngày</w:t>
-            </w:r>
-            <w:proofErr w:type="spellEnd"/>
+              <w:t>84 ngày</w:t>
+            </w:r>
             <w:r>
               <w:rPr>
                 <w:rFonts w:asciiTheme="majorHAnsi" w:hAnsiTheme="majorHAnsi" w:cstheme="majorHAnsi"/>
@@ -8732,49 +5836,7 @@
               <w:rPr>
                 <w:rFonts w:asciiTheme="majorHAnsi" w:hAnsiTheme="majorHAnsi" w:cstheme="majorHAnsi"/>
               </w:rPr>
-              <w:t>(</w:t>
-            </w:r>
-            <w:proofErr w:type="spellStart"/>
-            <w:r>
-              <w:rPr>
-                <w:rFonts w:asciiTheme="majorHAnsi" w:hAnsiTheme="majorHAnsi" w:cstheme="majorHAnsi"/>
-              </w:rPr>
-              <w:t>Ngày</w:t>
-            </w:r>
-            <w:proofErr w:type="spellEnd"/>
-            <w:r>
-              <w:rPr>
-                <w:rFonts w:asciiTheme="majorHAnsi" w:hAnsiTheme="majorHAnsi" w:cstheme="majorHAnsi"/>
-              </w:rPr>
-              <w:t xml:space="preserve"> </w:t>
-            </w:r>
-            <w:proofErr w:type="spellStart"/>
-            <w:r>
-              <w:rPr>
-                <w:rFonts w:asciiTheme="majorHAnsi" w:hAnsiTheme="majorHAnsi" w:cstheme="majorHAnsi"/>
-              </w:rPr>
-              <w:t>giải</w:t>
-            </w:r>
-            <w:proofErr w:type="spellEnd"/>
-            <w:r>
-              <w:rPr>
-                <w:rFonts w:asciiTheme="majorHAnsi" w:hAnsiTheme="majorHAnsi" w:cstheme="majorHAnsi"/>
-              </w:rPr>
-              <w:t xml:space="preserve"> </w:t>
-            </w:r>
-            <w:proofErr w:type="spellStart"/>
-            <w:r>
-              <w:rPr>
-                <w:rFonts w:asciiTheme="majorHAnsi" w:hAnsiTheme="majorHAnsi" w:cstheme="majorHAnsi"/>
-              </w:rPr>
-              <w:t>ngân</w:t>
-            </w:r>
-            <w:proofErr w:type="spellEnd"/>
-            <w:r>
-              <w:rPr>
-                <w:rFonts w:asciiTheme="majorHAnsi" w:hAnsiTheme="majorHAnsi" w:cstheme="majorHAnsi"/>
-              </w:rPr>
-              <w:t>: 2/4/2026; Ngày thu nợ cuối cùng: 25/6/2026)</w:t>
+              <w:t>(Ngày giải ngân: 2/4/2026; Ngày thu nợ cuối cùng: 25/6/2026)</w:t>
             </w:r>
           </w:p>
         </w:tc>

</xml_diff>

<commit_message>
feat: Thêm chức năng quản lý khoản vay và giải ngân cùng các thực thể, dịch vụ và mẫu tài liệu liên quan.
</commit_message>
<xml_diff>
--- a/src/main/resources/templates/GiaiNgan/de-xuat-giai-ngan.docx
+++ b/src/main/resources/templates/GiaiNgan/de-xuat-giai-ngan.docx
@@ -17,7 +17,7 @@
           <w:b/>
           <w:bCs/>
         </w:rPr>
-        <w:t xml:space="preserve">PHÒNG KH DOANH NGHIỆP                                         </w:t>
+        <w:t xml:space="preserve">PHÒNG KH DOANH NGHIỆP                             </w:t>
       </w:r>
       <w:r>
         <w:rPr>
@@ -25,22 +25,27 @@
           <w:b/>
           <w:bCs/>
         </w:rPr>
-        <w:t xml:space="preserve">               </w:t>
-      </w:r>
-      <w:r>
-        <w:rPr>
-          <w:rFonts w:asciiTheme="majorHAnsi" w:hAnsiTheme="majorHAnsi" w:cstheme="majorHAnsi"/>
-        </w:rPr>
-        <w:t xml:space="preserve">P. Cao Lãnh, </w:t>
-      </w:r>
-      <w:proofErr w:type="gramStart"/>
+        <w:t xml:space="preserve">    </w:t>
+      </w:r>
+      <w:r>
+        <w:rPr>
+          <w:rFonts w:asciiTheme="majorHAnsi" w:hAnsiTheme="majorHAnsi" w:cstheme="majorHAnsi"/>
+        </w:rPr>
+        <w:t>P. Cao Lãnh</w:t>
+      </w:r>
+      <w:r>
+        <w:rPr>
+          <w:rFonts w:asciiTheme="majorHAnsi" w:hAnsiTheme="majorHAnsi" w:cstheme="majorHAnsi"/>
+        </w:rPr>
+        <w:t xml:space="preserve"> </w:t>
+      </w:r>
       <w:r>
         <w:rPr>
           <w:rFonts w:asciiTheme="majorHAnsi" w:hAnsiTheme="majorHAnsi" w:cstheme="majorHAnsi"/>
           <w:i/>
           <w:color w:val="4472C4" w:themeColor="accent1"/>
         </w:rPr>
-        <w:t>{{</w:t>
+        <w:t>{</w:t>
       </w:r>
       <w:r>
         <w:rPr>
@@ -48,7 +53,7 @@
           <w:i/>
           <w:color w:val="4472C4" w:themeColor="accent1"/>
         </w:rPr>
-        <w:t xml:space="preserve"> </w:t>
+        <w:t>{</w:t>
       </w:r>
       <w:r>
         <w:rPr>
@@ -58,14 +63,21 @@
         </w:rPr>
         <w:t>CURRENT</w:t>
       </w:r>
-      <w:proofErr w:type="gramEnd"/>
       <w:r>
         <w:rPr>
           <w:rFonts w:asciiTheme="majorHAnsi" w:hAnsiTheme="majorHAnsi" w:cstheme="majorHAnsi"/>
           <w:i/>
           <w:color w:val="4472C4" w:themeColor="accent1"/>
         </w:rPr>
-        <w:t>_DATE_TITLE}}</w:t>
+        <w:t>_</w:t>
+      </w:r>
+      <w:r>
+        <w:rPr>
+          <w:rFonts w:asciiTheme="majorHAnsi" w:hAnsiTheme="majorHAnsi" w:cstheme="majorHAnsi"/>
+          <w:i/>
+          <w:color w:val="4472C4" w:themeColor="accent1"/>
+        </w:rPr>
+        <w:t>DATE_TITLE}}</w:t>
       </w:r>
     </w:p>
     <w:p>
@@ -358,13 +370,31 @@
         <w:rPr>
           <w:rFonts w:asciiTheme="majorHAnsi" w:hAnsiTheme="majorHAnsi" w:cstheme="majorHAnsi"/>
         </w:rPr>
-        <w:t xml:space="preserve">{{HDTD_DATE} </w:t>
+        <w:t>{{HDTD_DATE}</w:t>
+      </w:r>
+      <w:r>
+        <w:rPr>
+          <w:rFonts w:asciiTheme="majorHAnsi" w:hAnsiTheme="majorHAnsi" w:cstheme="majorHAnsi"/>
+        </w:rPr>
+        <w:t>}</w:t>
+      </w:r>
+      <w:r>
+        <w:rPr>
+          <w:rFonts w:asciiTheme="majorHAnsi" w:hAnsiTheme="majorHAnsi" w:cstheme="majorHAnsi"/>
+        </w:rPr>
+        <w:t xml:space="preserve"> </w:t>
       </w:r>
       <w:r>
         <w:rPr>
           <w:rFonts w:asciiTheme="majorHAnsi" w:hAnsiTheme="majorHAnsi" w:cstheme="majorHAnsi"/>
         </w:rPr>
         <w:t>đến hết ngày</w:t>
+      </w:r>
+      <w:r>
+        <w:rPr>
+          <w:rFonts w:asciiTheme="majorHAnsi" w:hAnsiTheme="majorHAnsi" w:cstheme="majorHAnsi"/>
+        </w:rPr>
+        <w:t xml:space="preserve"> </w:t>
       </w:r>
       <w:r>
         <w:rPr>
@@ -740,16 +770,15 @@
           <w:i/>
           <w:iCs/>
         </w:rPr>
-        <w:t xml:space="preserve">(để kinh doanh xe ô tô khác, phụ tùng và các bộ phận phụ trợ xe ô tô từ HTC-VN và Vinfast, các nhu cầu vốn lưu động </w:t>
-      </w:r>
-      <w:proofErr w:type="gramStart"/>
+        <w:t>(để kinh doanh xe ô tô khác, phụ tùng và các bộ phận phụ trợ xe ô tô từ HTC-VN và Vinfast, các nhu cầu vốn lưu động khác,</w:t>
+      </w:r>
       <w:r>
         <w:rPr>
           <w:rFonts w:asciiTheme="majorHAnsi" w:hAnsiTheme="majorHAnsi" w:cstheme="majorHAnsi"/>
           <w:i/>
           <w:iCs/>
         </w:rPr>
-        <w:t>khác,</w:t>
+        <w:t>…</w:t>
       </w:r>
       <w:r>
         <w:rPr>
@@ -757,28 +786,13 @@
           <w:i/>
           <w:iCs/>
         </w:rPr>
-        <w:t>…</w:t>
-      </w:r>
-      <w:r>
-        <w:rPr>
-          <w:rFonts w:asciiTheme="majorHAnsi" w:hAnsiTheme="majorHAnsi" w:cstheme="majorHAnsi"/>
-          <w:i/>
-          <w:iCs/>
-        </w:rPr>
         <w:t>)</w:t>
       </w:r>
       <w:r>
         <w:rPr>
           <w:rFonts w:asciiTheme="majorHAnsi" w:hAnsiTheme="majorHAnsi" w:cstheme="majorHAnsi"/>
         </w:rPr>
-        <w:t>:Tài</w:t>
-      </w:r>
-      <w:proofErr w:type="gramEnd"/>
-      <w:r>
-        <w:rPr>
-          <w:rFonts w:asciiTheme="majorHAnsi" w:hAnsiTheme="majorHAnsi" w:cstheme="majorHAnsi"/>
-        </w:rPr>
-        <w:t xml:space="preserve"> sản bảo đảm là bất động sản/tiền gửi và đáp ứng tỷ lệ tài sản bảo đảm bằng bất động sản/tiền gửi tối thiểu là 78%.</w:t>
+        <w:t>:Tài sản bảo đảm là bất động sản/tiền gửi và đáp ứng tỷ lệ tài sản bảo đảm bằng bất động sản/tiền gửi tối thiểu là 78%.</w:t>
       </w:r>
       <w:r>
         <w:rPr>
@@ -978,8 +992,6 @@
               <w:jc w:val="right"/>
               <w:rPr>
                 <w:rFonts w:asciiTheme="majorHAnsi" w:hAnsiTheme="majorHAnsi" w:cstheme="majorHAnsi"/>
-                <w:b/>
-                <w:bCs/>
                 <w:color w:val="EE0000"/>
               </w:rPr>
             </w:pPr>
@@ -988,7 +1000,21 @@
                 <w:rFonts w:asciiTheme="majorHAnsi" w:hAnsiTheme="majorHAnsi" w:cstheme="majorHAnsi"/>
                 <w:color w:val="EE0000"/>
               </w:rPr>
-              <w:t>{{TONG_XE}}</w:t>
+              <w:t>{{</w:t>
+            </w:r>
+            <w:r>
+              <w:rPr>
+                <w:rFonts w:asciiTheme="majorHAnsi" w:hAnsiTheme="majorHAnsi" w:cstheme="majorHAnsi"/>
+                <w:color w:val="EE0000"/>
+              </w:rPr>
+              <w:t>totalCollateral</w:t>
+            </w:r>
+            <w:r>
+              <w:rPr>
+                <w:rFonts w:asciiTheme="majorHAnsi" w:hAnsiTheme="majorHAnsi" w:cstheme="majorHAnsi"/>
+                <w:color w:val="EE0000"/>
+              </w:rPr>
+              <w:t>}}</w:t>
             </w:r>
           </w:p>
         </w:tc>
@@ -1031,7 +1057,21 @@
                 <w:rFonts w:asciiTheme="majorHAnsi" w:hAnsiTheme="majorHAnsi" w:cstheme="majorHAnsi"/>
                 <w:color w:val="EE0000"/>
               </w:rPr>
-              <w:t>{{TONGBDS}}</w:t>
+              <w:t>{{</w:t>
+            </w:r>
+            <w:r>
+              <w:rPr>
+                <w:rFonts w:asciiTheme="majorHAnsi" w:hAnsiTheme="majorHAnsi" w:cstheme="majorHAnsi"/>
+                <w:color w:val="EE0000"/>
+              </w:rPr>
+              <w:t>realEstate</w:t>
+            </w:r>
+            <w:r>
+              <w:rPr>
+                <w:rFonts w:asciiTheme="majorHAnsi" w:hAnsiTheme="majorHAnsi" w:cstheme="majorHAnsi"/>
+                <w:color w:val="EE0000"/>
+              </w:rPr>
+              <w:t>}}</w:t>
             </w:r>
           </w:p>
         </w:tc>
@@ -1172,7 +1212,21 @@
                 <w:rFonts w:asciiTheme="majorHAnsi" w:hAnsiTheme="majorHAnsi" w:cstheme="majorHAnsi"/>
                 <w:color w:val="EE0000"/>
               </w:rPr>
-              <w:t>{{TONG_XE_0.85}}</w:t>
+              <w:t>{{</w:t>
+            </w:r>
+            <w:r>
+              <w:rPr>
+                <w:rFonts w:asciiTheme="majorHAnsi" w:hAnsiTheme="majorHAnsi" w:cstheme="majorHAnsi"/>
+                <w:color w:val="EE0000"/>
+              </w:rPr>
+              <w:t>realEstateFactor</w:t>
+            </w:r>
+            <w:r>
+              <w:rPr>
+                <w:rFonts w:asciiTheme="majorHAnsi" w:hAnsiTheme="majorHAnsi" w:cstheme="majorHAnsi"/>
+                <w:color w:val="EE0000"/>
+              </w:rPr>
+              <w:t>}}</w:t>
             </w:r>
           </w:p>
         </w:tc>
@@ -1215,7 +1269,21 @@
                 <w:rFonts w:asciiTheme="majorHAnsi" w:hAnsiTheme="majorHAnsi" w:cstheme="majorHAnsi"/>
                 <w:color w:val="EE0000"/>
               </w:rPr>
-              <w:t>{{TONGBDS_0.80}}</w:t>
+              <w:t>{{</w:t>
+            </w:r>
+            <w:r>
+              <w:rPr>
+                <w:rFonts w:asciiTheme="majorHAnsi" w:hAnsiTheme="majorHAnsi" w:cstheme="majorHAnsi"/>
+                <w:color w:val="EE0000"/>
+              </w:rPr>
+              <w:t>collateralFactor</w:t>
+            </w:r>
+            <w:r>
+              <w:rPr>
+                <w:rFonts w:asciiTheme="majorHAnsi" w:hAnsiTheme="majorHAnsi" w:cstheme="majorHAnsi"/>
+                <w:color w:val="EE0000"/>
+              </w:rPr>
+              <w:t>}}</w:t>
             </w:r>
           </w:p>
         </w:tc>
@@ -1249,14 +1317,6 @@
           <w:p>
             <w:pPr>
               <w:jc w:val="right"/>
-              <w:rPr>
-                <w:rFonts w:asciiTheme="majorHAnsi" w:hAnsiTheme="majorHAnsi" w:cstheme="majorHAnsi"/>
-                <w:b/>
-                <w:bCs/>
-                <w:color w:val="EE0000"/>
-              </w:rPr>
-            </w:pPr>
-            <w:r>
               <w:rPr>
                 <w:rFonts w:ascii="Times New Roman" w:hAnsi="Times New Roman" w:cs="Times New Roman"/>
                 <w:b/>
@@ -1264,45 +1324,6 @@
                 <w:sz w:val="26"/>
                 <w:szCs w:val="26"/>
               </w:rPr>
-              <w:t>{{GHTD}}</w:t>
-            </w:r>
-          </w:p>
-        </w:tc>
-      </w:tr>
-      <w:tr>
-        <w:tc>
-          <w:tcPr>
-            <w:tcW w:w="5766" w:type="dxa"/>
-            <w:gridSpan w:val="2"/>
-          </w:tcPr>
-          <w:p>
-            <w:pPr>
-              <w:spacing w:after="66"/>
-              <w:rPr>
-                <w:rFonts w:asciiTheme="majorHAnsi" w:hAnsiTheme="majorHAnsi" w:cstheme="majorHAnsi"/>
-              </w:rPr>
-            </w:pPr>
-            <w:r>
-              <w:rPr>
-                <w:rFonts w:ascii="Times New Roman" w:hAnsi="Times New Roman" w:cs="Times New Roman"/>
-                <w:sz w:val="26"/>
-                <w:szCs w:val="26"/>
-              </w:rPr>
-              <w:t>- GHTD đã sử dụng</w:t>
-            </w:r>
-          </w:p>
-        </w:tc>
-        <w:tc>
-          <w:tcPr>
-            <w:tcW w:w="3502" w:type="dxa"/>
-          </w:tcPr>
-          <w:p>
-            <w:pPr>
-              <w:jc w:val="right"/>
-              <w:rPr>
-                <w:rFonts w:asciiTheme="majorHAnsi" w:hAnsiTheme="majorHAnsi" w:cstheme="majorHAnsi"/>
-                <w:color w:val="EE0000"/>
-              </w:rPr>
             </w:pPr>
             <w:r>
               <w:rPr>
@@ -1312,7 +1333,27 @@
                 <w:sz w:val="26"/>
                 <w:szCs w:val="26"/>
               </w:rPr>
-              <w:t>{{GHTDaSuDung}}</w:t>
+              <w:t>{{</w:t>
+            </w:r>
+            <w:r>
+              <w:rPr>
+                <w:rFonts w:ascii="Times New Roman" w:hAnsi="Times New Roman" w:cs="Times New Roman"/>
+                <w:b/>
+                <w:bCs/>
+                <w:sz w:val="26"/>
+                <w:szCs w:val="26"/>
+              </w:rPr>
+              <w:t>creditLimit</w:t>
+            </w:r>
+            <w:r>
+              <w:rPr>
+                <w:rFonts w:ascii="Times New Roman" w:hAnsi="Times New Roman" w:cs="Times New Roman"/>
+                <w:b/>
+                <w:bCs/>
+                <w:sz w:val="26"/>
+                <w:szCs w:val="26"/>
+              </w:rPr>
+              <w:t>}}</w:t>
             </w:r>
           </w:p>
         </w:tc>
@@ -1325,19 +1366,90 @@
           </w:tcPr>
           <w:p>
             <w:pPr>
-              <w:jc w:val="both"/>
+              <w:spacing w:after="66"/>
+              <w:rPr>
+                <w:rFonts w:asciiTheme="majorHAnsi" w:hAnsiTheme="majorHAnsi" w:cstheme="majorHAnsi"/>
+              </w:rPr>
+            </w:pPr>
+            <w:r>
               <w:rPr>
                 <w:rFonts w:ascii="Times New Roman" w:hAnsi="Times New Roman" w:cs="Times New Roman"/>
                 <w:sz w:val="26"/>
                 <w:szCs w:val="26"/>
               </w:rPr>
-            </w:pPr>
-            <w:r>
+              <w:t>- GHTD đã sử dụng</w:t>
+            </w:r>
+          </w:p>
+        </w:tc>
+        <w:tc>
+          <w:tcPr>
+            <w:tcW w:w="3502" w:type="dxa"/>
+          </w:tcPr>
+          <w:p>
+            <w:pPr>
+              <w:jc w:val="right"/>
+              <w:rPr>
+                <w:rFonts w:ascii="Times New Roman" w:hAnsi="Times New Roman" w:cs="Times New Roman"/>
+                <w:b/>
+                <w:bCs/>
+                <w:sz w:val="26"/>
+                <w:szCs w:val="26"/>
+              </w:rPr>
+            </w:pPr>
+            <w:r>
+              <w:rPr>
+                <w:rFonts w:ascii="Times New Roman" w:hAnsi="Times New Roman" w:cs="Times New Roman"/>
+                <w:b/>
+                <w:bCs/>
+                <w:sz w:val="26"/>
+                <w:szCs w:val="26"/>
+              </w:rPr>
+              <w:t>{{</w:t>
+            </w:r>
+            <w:r>
+              <w:rPr>
+                <w:rFonts w:ascii="Times New Roman" w:hAnsi="Times New Roman" w:cs="Times New Roman"/>
+                <w:b/>
+                <w:bCs/>
+                <w:sz w:val="26"/>
+                <w:szCs w:val="26"/>
+              </w:rPr>
+              <w:t>usedLimit</w:t>
+            </w:r>
+            <w:r>
+              <w:rPr>
+                <w:rFonts w:ascii="Times New Roman" w:hAnsi="Times New Roman" w:cs="Times New Roman"/>
+                <w:b/>
+                <w:bCs/>
+                <w:sz w:val="26"/>
+                <w:szCs w:val="26"/>
+              </w:rPr>
+              <w:t>}}</w:t>
+            </w:r>
+          </w:p>
+        </w:tc>
+      </w:tr>
+      <w:tr>
+        <w:tc>
+          <w:tcPr>
+            <w:tcW w:w="5766" w:type="dxa"/>
+            <w:gridSpan w:val="2"/>
+          </w:tcPr>
+          <w:p>
+            <w:pPr>
+              <w:jc w:val="both"/>
               <w:rPr>
                 <w:rFonts w:ascii="Times New Roman" w:hAnsi="Times New Roman" w:cs="Times New Roman"/>
                 <w:sz w:val="26"/>
                 <w:szCs w:val="26"/>
               </w:rPr>
+            </w:pPr>
+            <w:r>
+              <w:rPr>
+                <w:rFonts w:ascii="Times New Roman" w:hAnsi="Times New Roman" w:cs="Times New Roman"/>
+                <w:sz w:val="26"/>
+                <w:szCs w:val="26"/>
+              </w:rPr>
               <w:t>+ Dư nợ vay tiền còn lại (TSBĐ là xe ô tô):</w:t>
             </w:r>
           </w:p>
@@ -1349,20 +1461,13 @@
           <w:p>
             <w:pPr>
               <w:jc w:val="right"/>
-              <w:rPr>
-                <w:rFonts w:asciiTheme="majorHAnsi" w:hAnsiTheme="majorHAnsi" w:cstheme="majorHAnsi"/>
-                <w:color w:val="EE0000"/>
-              </w:rPr>
-            </w:pPr>
-            <w:r>
               <w:rPr>
                 <w:rFonts w:ascii="Times New Roman" w:hAnsi="Times New Roman" w:cs="Times New Roman"/>
                 <w:color w:val="0070C0"/>
                 <w:sz w:val="26"/>
                 <w:szCs w:val="26"/>
               </w:rPr>
-              <w:t>{{</w:t>
-            </w:r>
+            </w:pPr>
             <w:r>
               <w:rPr>
                 <w:rFonts w:ascii="Times New Roman" w:hAnsi="Times New Roman" w:cs="Times New Roman"/>
@@ -1370,7 +1475,7 @@
                 <w:sz w:val="26"/>
                 <w:szCs w:val="26"/>
               </w:rPr>
-              <w:t>DuNoVay</w:t>
+              <w:t>{{</w:t>
             </w:r>
             <w:r>
               <w:rPr>
@@ -1379,46 +1484,8 @@
                 <w:sz w:val="26"/>
                 <w:szCs w:val="26"/>
               </w:rPr>
-              <w:t>}}</w:t>
-            </w:r>
-          </w:p>
-        </w:tc>
-      </w:tr>
-      <w:tr>
-        <w:tc>
-          <w:tcPr>
-            <w:tcW w:w="5766" w:type="dxa"/>
-            <w:gridSpan w:val="2"/>
-          </w:tcPr>
-          <w:p>
-            <w:pPr>
-              <w:spacing w:after="59"/>
-              <w:rPr>
-                <w:rFonts w:asciiTheme="majorHAnsi" w:hAnsiTheme="majorHAnsi" w:cstheme="majorHAnsi"/>
-              </w:rPr>
-            </w:pPr>
-            <w:r>
-              <w:rPr>
-                <w:rFonts w:ascii="Times New Roman" w:hAnsi="Times New Roman" w:cs="Times New Roman"/>
-                <w:sz w:val="26"/>
-                <w:szCs w:val="26"/>
-              </w:rPr>
-              <w:t>+ Số dư cấp bảo lãnh (TSBĐ hình thành từ vốn vay):</w:t>
-            </w:r>
-          </w:p>
-        </w:tc>
-        <w:tc>
-          <w:tcPr>
-            <w:tcW w:w="3502" w:type="dxa"/>
-          </w:tcPr>
-          <w:p>
-            <w:pPr>
-              <w:jc w:val="right"/>
-              <w:rPr>
-                <w:rFonts w:asciiTheme="majorHAnsi" w:hAnsiTheme="majorHAnsi" w:cstheme="majorHAnsi"/>
-                <w:color w:val="EE0000"/>
-              </w:rPr>
-            </w:pPr>
+              <w:t>vehicleLoanBalance</w:t>
+            </w:r>
             <w:r>
               <w:rPr>
                 <w:rFonts w:ascii="Times New Roman" w:hAnsi="Times New Roman" w:cs="Times New Roman"/>
@@ -1426,17 +1493,48 @@
                 <w:sz w:val="26"/>
                 <w:szCs w:val="26"/>
               </w:rPr>
-              <w:t>{{</w:t>
-            </w:r>
-            <w:r>
+              <w:t>}}</w:t>
+            </w:r>
+          </w:p>
+        </w:tc>
+      </w:tr>
+      <w:tr>
+        <w:tc>
+          <w:tcPr>
+            <w:tcW w:w="5766" w:type="dxa"/>
+            <w:gridSpan w:val="2"/>
+          </w:tcPr>
+          <w:p>
+            <w:pPr>
+              <w:spacing w:after="59"/>
+              <w:rPr>
+                <w:rFonts w:asciiTheme="majorHAnsi" w:hAnsiTheme="majorHAnsi" w:cstheme="majorHAnsi"/>
+              </w:rPr>
+            </w:pPr>
+            <w:r>
+              <w:rPr>
+                <w:rFonts w:ascii="Times New Roman" w:hAnsi="Times New Roman" w:cs="Times New Roman"/>
+                <w:sz w:val="26"/>
+                <w:szCs w:val="26"/>
+              </w:rPr>
+              <w:t>+ Số dư cấp bảo lãnh (TSBĐ hình thành từ vốn vay):</w:t>
+            </w:r>
+          </w:p>
+        </w:tc>
+        <w:tc>
+          <w:tcPr>
+            <w:tcW w:w="3502" w:type="dxa"/>
+          </w:tcPr>
+          <w:p>
+            <w:pPr>
+              <w:jc w:val="right"/>
               <w:rPr>
                 <w:rFonts w:ascii="Times New Roman" w:hAnsi="Times New Roman" w:cs="Times New Roman"/>
                 <w:color w:val="0070C0"/>
                 <w:sz w:val="26"/>
                 <w:szCs w:val="26"/>
               </w:rPr>
-              <w:t>SoDuCap</w:t>
-            </w:r>
+            </w:pPr>
             <w:r>
               <w:rPr>
                 <w:rFonts w:ascii="Times New Roman" w:hAnsi="Times New Roman" w:cs="Times New Roman"/>
@@ -1444,50 +1542,17 @@
                 <w:sz w:val="26"/>
                 <w:szCs w:val="26"/>
               </w:rPr>
-              <w:t>}}</w:t>
-            </w:r>
-          </w:p>
-        </w:tc>
-      </w:tr>
-      <w:tr>
-        <w:tc>
-          <w:tcPr>
-            <w:tcW w:w="5766" w:type="dxa"/>
-            <w:gridSpan w:val="2"/>
-          </w:tcPr>
-          <w:p>
-            <w:pPr>
-              <w:spacing w:after="59"/>
-              <w:rPr>
-                <w:rFonts w:ascii="Times New Roman" w:hAnsi="Times New Roman" w:cs="Times New Roman"/>
-                <w:sz w:val="26"/>
-                <w:szCs w:val="26"/>
-              </w:rPr>
-            </w:pPr>
-            <w:r>
-              <w:rPr>
-                <w:rFonts w:ascii="Times New Roman" w:hAnsi="Times New Roman" w:cs="Times New Roman"/>
-                <w:sz w:val="26"/>
-                <w:szCs w:val="26"/>
-              </w:rPr>
-              <w:t>+ Số dư vay ngắn hạn khác (TSBĐ là BĐS):</w:t>
-            </w:r>
-          </w:p>
-        </w:tc>
-        <w:tc>
-          <w:tcPr>
-            <w:tcW w:w="3502" w:type="dxa"/>
-          </w:tcPr>
-          <w:p>
-            <w:pPr>
-              <w:jc w:val="right"/>
+              <w:t>{{</w:t>
+            </w:r>
+            <w:r>
               <w:rPr>
                 <w:rFonts w:ascii="Times New Roman" w:hAnsi="Times New Roman" w:cs="Times New Roman"/>
                 <w:color w:val="0070C0"/>
                 <w:sz w:val="26"/>
                 <w:szCs w:val="26"/>
               </w:rPr>
-            </w:pPr>
+              <w:t>issuedGuaranteeBalance</w:t>
+            </w:r>
             <w:r>
               <w:rPr>
                 <w:rFonts w:ascii="Times New Roman" w:hAnsi="Times New Roman" w:cs="Times New Roman"/>
@@ -1495,17 +1560,50 @@
                 <w:sz w:val="26"/>
                 <w:szCs w:val="26"/>
               </w:rPr>
-              <w:t>{{</w:t>
-            </w:r>
-            <w:r>
+              <w:t>}}</w:t>
+            </w:r>
+          </w:p>
+        </w:tc>
+      </w:tr>
+      <w:tr>
+        <w:tc>
+          <w:tcPr>
+            <w:tcW w:w="5766" w:type="dxa"/>
+            <w:gridSpan w:val="2"/>
+          </w:tcPr>
+          <w:p>
+            <w:pPr>
+              <w:spacing w:after="59"/>
+              <w:rPr>
+                <w:rFonts w:ascii="Times New Roman" w:hAnsi="Times New Roman" w:cs="Times New Roman"/>
+                <w:sz w:val="26"/>
+                <w:szCs w:val="26"/>
+              </w:rPr>
+            </w:pPr>
+            <w:r>
+              <w:rPr>
+                <w:rFonts w:ascii="Times New Roman" w:hAnsi="Times New Roman" w:cs="Times New Roman"/>
+                <w:sz w:val="26"/>
+                <w:szCs w:val="26"/>
+              </w:rPr>
+              <w:t>+ Số dư vay ngắn hạn khác (TSBĐ là BĐS):</w:t>
+            </w:r>
+          </w:p>
+        </w:tc>
+        <w:tc>
+          <w:tcPr>
+            <w:tcW w:w="3502" w:type="dxa"/>
+          </w:tcPr>
+          <w:p>
+            <w:pPr>
+              <w:jc w:val="right"/>
               <w:rPr>
                 <w:rFonts w:ascii="Times New Roman" w:hAnsi="Times New Roman" w:cs="Times New Roman"/>
                 <w:color w:val="0070C0"/>
                 <w:sz w:val="26"/>
                 <w:szCs w:val="26"/>
               </w:rPr>
-              <w:t>SoDuVay</w:t>
-            </w:r>
+            </w:pPr>
             <w:r>
               <w:rPr>
                 <w:rFonts w:ascii="Times New Roman" w:hAnsi="Times New Roman" w:cs="Times New Roman"/>
@@ -1513,50 +1611,17 @@
                 <w:sz w:val="26"/>
                 <w:szCs w:val="26"/>
               </w:rPr>
-              <w:t>}}</w:t>
-            </w:r>
-          </w:p>
-        </w:tc>
-      </w:tr>
-      <w:tr>
-        <w:tc>
-          <w:tcPr>
-            <w:tcW w:w="5766" w:type="dxa"/>
-            <w:gridSpan w:val="2"/>
-          </w:tcPr>
-          <w:p>
-            <w:pPr>
-              <w:spacing w:after="59"/>
-              <w:rPr>
-                <w:rFonts w:ascii="Times New Roman" w:hAnsi="Times New Roman" w:cs="Times New Roman"/>
-                <w:sz w:val="26"/>
-                <w:szCs w:val="26"/>
-              </w:rPr>
-            </w:pPr>
-            <w:r>
-              <w:rPr>
-                <w:rFonts w:ascii="Times New Roman" w:hAnsi="Times New Roman" w:cs="Times New Roman"/>
-                <w:sz w:val="26"/>
-                <w:szCs w:val="26"/>
-              </w:rPr>
-              <w:t>- GHTD còn được sử dụng</w:t>
-            </w:r>
-          </w:p>
-        </w:tc>
-        <w:tc>
-          <w:tcPr>
-            <w:tcW w:w="3502" w:type="dxa"/>
-          </w:tcPr>
-          <w:p>
-            <w:pPr>
-              <w:jc w:val="right"/>
+              <w:t>{{</w:t>
+            </w:r>
+            <w:r>
               <w:rPr>
                 <w:rFonts w:ascii="Times New Roman" w:hAnsi="Times New Roman" w:cs="Times New Roman"/>
                 <w:color w:val="0070C0"/>
                 <w:sz w:val="26"/>
                 <w:szCs w:val="26"/>
               </w:rPr>
-            </w:pPr>
+              <w:t>realEstateLoanBalance</w:t>
+            </w:r>
             <w:r>
               <w:rPr>
                 <w:rFonts w:ascii="Times New Roman" w:hAnsi="Times New Roman" w:cs="Times New Roman"/>
@@ -1564,17 +1629,50 @@
                 <w:sz w:val="26"/>
                 <w:szCs w:val="26"/>
               </w:rPr>
-              <w:t>{{GHTD</w:t>
-            </w:r>
-            <w:r>
+              <w:t>}}</w:t>
+            </w:r>
+          </w:p>
+        </w:tc>
+      </w:tr>
+      <w:tr>
+        <w:tc>
+          <w:tcPr>
+            <w:tcW w:w="5766" w:type="dxa"/>
+            <w:gridSpan w:val="2"/>
+          </w:tcPr>
+          <w:p>
+            <w:pPr>
+              <w:spacing w:after="59"/>
+              <w:rPr>
+                <w:rFonts w:ascii="Times New Roman" w:hAnsi="Times New Roman" w:cs="Times New Roman"/>
+                <w:sz w:val="26"/>
+                <w:szCs w:val="26"/>
+              </w:rPr>
+            </w:pPr>
+            <w:r>
+              <w:rPr>
+                <w:rFonts w:ascii="Times New Roman" w:hAnsi="Times New Roman" w:cs="Times New Roman"/>
+                <w:sz w:val="26"/>
+                <w:szCs w:val="26"/>
+              </w:rPr>
+              <w:t>- GHTD còn được sử dụng</w:t>
+            </w:r>
+          </w:p>
+        </w:tc>
+        <w:tc>
+          <w:tcPr>
+            <w:tcW w:w="3502" w:type="dxa"/>
+          </w:tcPr>
+          <w:p>
+            <w:pPr>
+              <w:jc w:val="right"/>
               <w:rPr>
                 <w:rFonts w:ascii="Times New Roman" w:hAnsi="Times New Roman" w:cs="Times New Roman"/>
                 <w:color w:val="0070C0"/>
                 <w:sz w:val="26"/>
                 <w:szCs w:val="26"/>
               </w:rPr>
-              <w:t>ConSD</w:t>
-            </w:r>
+            </w:pPr>
             <w:r>
               <w:rPr>
                 <w:rFonts w:ascii="Times New Roman" w:hAnsi="Times New Roman" w:cs="Times New Roman"/>
@@ -1582,6 +1680,24 @@
                 <w:sz w:val="26"/>
                 <w:szCs w:val="26"/>
               </w:rPr>
+              <w:t>{{</w:t>
+            </w:r>
+            <w:r>
+              <w:rPr>
+                <w:rFonts w:ascii="Times New Roman" w:hAnsi="Times New Roman" w:cs="Times New Roman"/>
+                <w:color w:val="0070C0"/>
+                <w:sz w:val="26"/>
+                <w:szCs w:val="26"/>
+              </w:rPr>
+              <w:t>remainingLimit</w:t>
+            </w:r>
+            <w:r>
+              <w:rPr>
+                <w:rFonts w:ascii="Times New Roman" w:hAnsi="Times New Roman" w:cs="Times New Roman"/>
+                <w:color w:val="0070C0"/>
+                <w:sz w:val="26"/>
+                <w:szCs w:val="26"/>
+              </w:rPr>
               <w:t>}}</w:t>
             </w:r>
           </w:p>
@@ -1711,17 +1827,16 @@
           <w:i/>
           <w:color w:val="4472C4" w:themeColor="accent1"/>
         </w:rPr>
-        <w:t>{{GUARANTEE_DATE}}</w:t>
-      </w:r>
-    </w:p>
-    <w:p>
-      <w:pPr>
-        <w:spacing w:line="240" w:lineRule="auto"/>
-        <w:ind w:right="440"/>
-        <w:rPr>
-          <w:rFonts w:asciiTheme="majorHAnsi" w:hAnsiTheme="majorHAnsi" w:cstheme="majorHAnsi"/>
-        </w:rPr>
-      </w:pPr>
+        <w:t>25/2/2026</w:t>
+      </w:r>
+      <w:r>
+        <w:rPr>
+          <w:rFonts w:asciiTheme="majorHAnsi" w:hAnsiTheme="majorHAnsi" w:cstheme="majorHAnsi"/>
+          <w:b/>
+          <w:bCs/>
+        </w:rPr>
+        <w:t xml:space="preserve"> </w:t>
+      </w:r>
       <w:r>
         <w:rPr>
           <w:rFonts w:asciiTheme="majorHAnsi" w:hAnsiTheme="majorHAnsi" w:cstheme="majorHAnsi"/>
@@ -1733,7 +1848,7 @@
           <w:rFonts w:asciiTheme="majorHAnsi" w:hAnsiTheme="majorHAnsi" w:cstheme="majorHAnsi"/>
           <w:color w:val="4472C4" w:themeColor="accent1"/>
         </w:rPr>
-        <w:t xml:space="preserve">38,731,972,700 đồng </w:t>
+        <w:t>38,731,972,700 đồng</w:t>
       </w:r>
     </w:p>
     <w:p>
@@ -1930,7 +2045,6 @@
               <w:rPr>
                 <w:rFonts w:asciiTheme="majorHAnsi" w:hAnsiTheme="majorHAnsi" w:cstheme="majorHAnsi"/>
               </w:rPr>
-              <w:lastRenderedPageBreak/>
               <w:t>- Giá vốn tăng bán:</w:t>
             </w:r>
           </w:p>
@@ -2033,6 +2147,7 @@
               <w:rPr>
                 <w:rFonts w:asciiTheme="majorHAnsi" w:hAnsiTheme="majorHAnsi" w:cstheme="majorHAnsi"/>
               </w:rPr>
+              <w:lastRenderedPageBreak/>
               <w:t>- Chi phí quản lý kinh doanh:</w:t>
             </w:r>
           </w:p>
@@ -2852,8 +2967,8 @@
         <w:tblLook w:val="04A0" w:firstRow="1" w:lastRow="0" w:firstColumn="1" w:lastColumn="0" w:noHBand="0" w:noVBand="1"/>
       </w:tblPr>
       <w:tblGrid>
-        <w:gridCol w:w="3021"/>
-        <w:gridCol w:w="6332"/>
+        <w:gridCol w:w="3020"/>
+        <w:gridCol w:w="6333"/>
       </w:tblGrid>
       <w:tr>
         <w:tc>
@@ -2900,7 +3015,23 @@
                 <w:i/>
                 <w:color w:val="4472C4" w:themeColor="accent1"/>
               </w:rPr>
-              <w:t>{{GUARANTEE_DATE}}</w:t>
+              <w:t>{{</w:t>
+            </w:r>
+            <w:r>
+              <w:rPr>
+                <w:rFonts w:asciiTheme="majorHAnsi" w:hAnsiTheme="majorHAnsi" w:cstheme="majorHAnsi"/>
+                <w:i/>
+                <w:color w:val="4472C4" w:themeColor="accent1"/>
+              </w:rPr>
+              <w:t>CURRENT</w:t>
+            </w:r>
+            <w:r>
+              <w:rPr>
+                <w:rFonts w:asciiTheme="majorHAnsi" w:hAnsiTheme="majorHAnsi" w:cstheme="majorHAnsi"/>
+                <w:i/>
+                <w:color w:val="4472C4" w:themeColor="accent1"/>
+              </w:rPr>
+              <w:t>_DATE}}</w:t>
             </w:r>
           </w:p>
         </w:tc>
@@ -2946,7 +3077,21 @@
                 <w:rFonts w:asciiTheme="majorHAnsi" w:hAnsiTheme="majorHAnsi" w:cstheme="majorHAnsi"/>
                 <w:color w:val="4472C4" w:themeColor="accent1"/>
               </w:rPr>
-              <w:t>{{TONG}}</w:t>
+              <w:t>{{</w:t>
+            </w:r>
+            <w:r>
+              <w:rPr>
+                <w:rFonts w:asciiTheme="majorHAnsi" w:hAnsiTheme="majorHAnsi" w:cstheme="majorHAnsi"/>
+                <w:color w:val="4472C4" w:themeColor="accent1"/>
+              </w:rPr>
+              <w:t>disbursementAmount</w:t>
+            </w:r>
+            <w:r>
+              <w:rPr>
+                <w:rFonts w:asciiTheme="majorHAnsi" w:hAnsiTheme="majorHAnsi" w:cstheme="majorHAnsi"/>
+                <w:color w:val="4472C4" w:themeColor="accent1"/>
+              </w:rPr>
+              <w:t>}}</w:t>
             </w:r>
           </w:p>
         </w:tc>
@@ -3497,14 +3642,7 @@
               <w:rPr>
                 <w:rFonts w:asciiTheme="majorHAnsi" w:hAnsiTheme="majorHAnsi" w:cstheme="majorHAnsi"/>
               </w:rPr>
-              <w:t xml:space="preserve"> thông thường, </w:t>
-            </w:r>
-            <w:r>
-              <w:rPr>
-                <w:rFonts w:asciiTheme="majorHAnsi" w:hAnsiTheme="majorHAnsi" w:cstheme="majorHAnsi"/>
-              </w:rPr>
-              <w:lastRenderedPageBreak/>
-              <w:t>đảm bảo NIM tối thiểu theo tờ trình được phê duyệt).</w:t>
+              <w:t xml:space="preserve"> thông thường, đảm bảo NIM tối thiểu theo tờ trình được phê duyệt).</w:t>
             </w:r>
           </w:p>
         </w:tc>
@@ -3600,6 +3738,7 @@
               <w:rPr>
                 <w:rFonts w:asciiTheme="majorHAnsi" w:hAnsiTheme="majorHAnsi" w:cstheme="majorHAnsi"/>
               </w:rPr>
+              <w:lastRenderedPageBreak/>
               <w:t>(FTPbvcs: 5,86%; Điều chỉnh tỷ lệ chi phí VTC theo HSRRTD 90 là: 0%)</w:t>
             </w:r>
           </w:p>
@@ -3681,13 +3820,55 @@
               <w:rPr>
                 <w:rFonts w:asciiTheme="majorHAnsi" w:hAnsiTheme="majorHAnsi" w:cstheme="majorHAnsi"/>
               </w:rPr>
-              <w:t>{{TONG}}</w:t>
-            </w:r>
-            <w:r>
-              <w:rPr>
-                <w:rFonts w:asciiTheme="majorHAnsi" w:hAnsiTheme="majorHAnsi" w:cstheme="majorHAnsi"/>
-              </w:rPr>
-              <w:t xml:space="preserve"> x (7% - 5,86%)/365 x 84 = </w:t>
+              <w:t>{{</w:t>
+            </w:r>
+            <w:r>
+              <w:rPr>
+                <w:rFonts w:asciiTheme="majorHAnsi" w:hAnsiTheme="majorHAnsi" w:cstheme="majorHAnsi"/>
+              </w:rPr>
+              <w:t>disbursementAmount</w:t>
+            </w:r>
+            <w:r>
+              <w:rPr>
+                <w:rFonts w:asciiTheme="majorHAnsi" w:hAnsiTheme="majorHAnsi" w:cstheme="majorHAnsi"/>
+              </w:rPr>
+              <w:t>}}</w:t>
+            </w:r>
+            <w:r>
+              <w:rPr>
+                <w:rFonts w:asciiTheme="majorHAnsi" w:hAnsiTheme="majorHAnsi" w:cstheme="majorHAnsi"/>
+              </w:rPr>
+              <w:t xml:space="preserve"> x (7% - 5,86%)/365 x </w:t>
+            </w:r>
+            <w:r>
+              <w:rPr>
+                <w:rFonts w:asciiTheme="majorHAnsi" w:hAnsiTheme="majorHAnsi" w:cstheme="majorHAnsi"/>
+              </w:rPr>
+              <w:t>{{</w:t>
+            </w:r>
+            <w:r>
+              <w:rPr>
+                <w:rFonts w:asciiTheme="majorHAnsi" w:hAnsiTheme="majorHAnsi" w:cstheme="majorHAnsi"/>
+              </w:rPr>
+              <w:t>loan_term</w:t>
+            </w:r>
+            <w:r>
+              <w:rPr>
+                <w:rFonts w:asciiTheme="majorHAnsi" w:hAnsiTheme="majorHAnsi" w:cstheme="majorHAnsi"/>
+              </w:rPr>
+              <w:t>}}</w:t>
+            </w:r>
+            <w:r>
+              <w:rPr>
+                <w:rFonts w:asciiTheme="majorHAnsi" w:hAnsiTheme="majorHAnsi" w:cstheme="majorHAnsi"/>
+              </w:rPr>
+              <w:t xml:space="preserve"> </w:t>
+            </w:r>
+            <w:r>
+              <w:rPr>
+                <w:rFonts w:asciiTheme="majorHAnsi" w:hAnsiTheme="majorHAnsi" w:cstheme="majorHAnsi"/>
+              </w:rPr>
+              <w:t xml:space="preserve">= </w:t>
             </w:r>
             <w:r>
               <w:rPr>
@@ -3699,7 +3880,7 @@
               <w:rPr>
                 <w:rFonts w:asciiTheme="majorHAnsi" w:hAnsiTheme="majorHAnsi" w:cstheme="majorHAnsi"/>
               </w:rPr>
-              <w:t xml:space="preserve"> đ</w:t>
+              <w:t xml:space="preserve"> </w:t>
             </w:r>
           </w:p>
         </w:tc>
@@ -3745,18 +3926,48 @@
     </w:p>
     <w:p>
       <w:pPr>
-        <w:spacing w:line="240" w:lineRule="auto"/>
+        <w:rPr>
+          <w:rFonts w:ascii="JetBrains Mono" w:eastAsia="Times New Roman" w:hAnsi="JetBrains Mono" w:cs="Courier New"/>
+          <w:color w:val="6AAB73"/>
+          <w:kern w:val="0"/>
+          <w:lang w:eastAsia="en-US"/>
+          <w14:ligatures w14:val="none"/>
+        </w:rPr>
+      </w:pPr>
+      <w:r>
         <w:rPr>
           <w:rFonts w:asciiTheme="majorHAnsi" w:hAnsiTheme="majorHAnsi" w:cstheme="majorHAnsi"/>
           <w:color w:val="007BB8"/>
         </w:rPr>
-      </w:pPr>
+        <w:t>Đề nghị cho vay số tiền: {{</w:t>
+      </w:r>
       <w:r>
         <w:rPr>
           <w:rFonts w:asciiTheme="majorHAnsi" w:hAnsiTheme="majorHAnsi" w:cstheme="majorHAnsi"/>
           <w:color w:val="007BB8"/>
         </w:rPr>
-        <w:t>Đề nghị cho vay số tiền: {{TONG}} (Bằng chữ: {{TONG_TEXT}}</w:t>
+        <w:t>disbursementAmount</w:t>
+      </w:r>
+      <w:r>
+        <w:rPr>
+          <w:rFonts w:asciiTheme="majorHAnsi" w:hAnsiTheme="majorHAnsi" w:cstheme="majorHAnsi"/>
+          <w:color w:val="007BB8"/>
+        </w:rPr>
+        <w:t>}} (Bằng chữ: {{</w:t>
+      </w:r>
+      <w:r>
+        <w:rPr>
+          <w:rFonts w:asciiTheme="majorHAnsi" w:hAnsiTheme="majorHAnsi" w:cstheme="majorHAnsi"/>
+          <w:color w:val="007BB8"/>
+        </w:rPr>
+        <w:t>disbursementAmountText</w:t>
+      </w:r>
+      <w:r>
+        <w:rPr>
+          <w:rFonts w:asciiTheme="majorHAnsi" w:hAnsiTheme="majorHAnsi" w:cstheme="majorHAnsi"/>
+          <w:color w:val="007BB8"/>
+        </w:rPr>
+        <w:t>}}</w:t>
       </w:r>
     </w:p>
     <w:p>
@@ -3838,13 +4049,14 @@
         <w:jc w:val="both"/>
         <w:rPr>
           <w:rFonts w:asciiTheme="majorHAnsi" w:hAnsiTheme="majorHAnsi" w:cstheme="majorHAnsi"/>
-        </w:rPr>
-      </w:pPr>
-      <w:r>
-        <w:rPr>
-          <w:rFonts w:asciiTheme="majorHAnsi" w:hAnsiTheme="majorHAnsi" w:cstheme="majorHAnsi"/>
           <w:color w:val="FF0000"/>
         </w:rPr>
+      </w:pPr>
+      <w:r>
+        <w:rPr>
+          <w:rFonts w:asciiTheme="majorHAnsi" w:hAnsiTheme="majorHAnsi" w:cstheme="majorHAnsi"/>
+          <w:color w:val="FF0000"/>
+        </w:rPr>
         <w:t xml:space="preserve">Mục đích: Vay thanh toán tiền còn lại tương đương </w:t>
       </w:r>
       <w:r>
@@ -3852,43 +4064,48 @@
           <w:rFonts w:asciiTheme="majorHAnsi" w:hAnsiTheme="majorHAnsi" w:cstheme="majorHAnsi"/>
           <w:color w:val="FF0000"/>
         </w:rPr>
-        <w:t>{{gate</w:t>
-      </w:r>
-      <w:proofErr w:type="gramStart"/>
+        <w:t>{{gate}}</w:t>
+      </w:r>
       <w:r>
         <w:rPr>
           <w:rFonts w:asciiTheme="majorHAnsi" w:hAnsiTheme="majorHAnsi" w:cstheme="majorHAnsi"/>
           <w:color w:val="FF0000"/>
         </w:rPr>
-        <w:t>}}</w:t>
+        <w:t xml:space="preserve">% giá trị đối với số lượng xe mà </w:t>
       </w:r>
       <w:r>
         <w:rPr>
           <w:rFonts w:asciiTheme="majorHAnsi" w:hAnsiTheme="majorHAnsi" w:cstheme="majorHAnsi"/>
           <w:color w:val="FF0000"/>
         </w:rPr>
-        <w:t>%</w:t>
-      </w:r>
-      <w:proofErr w:type="gramEnd"/>
+        <w:t>{{</w:t>
+      </w:r>
       <w:r>
         <w:rPr>
           <w:rFonts w:asciiTheme="majorHAnsi" w:hAnsiTheme="majorHAnsi" w:cstheme="majorHAnsi"/>
           <w:color w:val="FF0000"/>
         </w:rPr>
-        <w:t xml:space="preserve"> giá trị đối với số lượng xe mà </w:t>
+        <w:t>manufacturer</w:t>
       </w:r>
       <w:r>
         <w:rPr>
           <w:rFonts w:asciiTheme="majorHAnsi" w:hAnsiTheme="majorHAnsi" w:cstheme="majorHAnsi"/>
           <w:color w:val="FF0000"/>
         </w:rPr>
-        <w:t>{{name}}</w:t>
+        <w:t>_</w:t>
       </w:r>
       <w:r>
         <w:rPr>
           <w:rFonts w:asciiTheme="majorHAnsi" w:hAnsiTheme="majorHAnsi" w:cstheme="majorHAnsi"/>
           <w:color w:val="FF0000"/>
         </w:rPr>
+        <w:t>name}}</w:t>
+      </w:r>
+      <w:r>
+        <w:rPr>
+          <w:rFonts w:asciiTheme="majorHAnsi" w:hAnsiTheme="majorHAnsi" w:cstheme="majorHAnsi"/>
+          <w:color w:val="FF0000"/>
+        </w:rPr>
         <w:t xml:space="preserve"> (</w:t>
       </w:r>
       <w:r>
@@ -3896,7 +4113,21 @@
           <w:rFonts w:asciiTheme="majorHAnsi" w:hAnsiTheme="majorHAnsi" w:cstheme="majorHAnsi"/>
           <w:color w:val="FF0000"/>
         </w:rPr>
-        <w:t>{{code}}</w:t>
+        <w:t>{{</w:t>
+      </w:r>
+      <w:r>
+        <w:rPr>
+          <w:rFonts w:asciiTheme="majorHAnsi" w:hAnsiTheme="majorHAnsi" w:cstheme="majorHAnsi"/>
+          <w:color w:val="FF0000"/>
+        </w:rPr>
+        <w:t>manufacturer_</w:t>
+      </w:r>
+      <w:r>
+        <w:rPr>
+          <w:rFonts w:asciiTheme="majorHAnsi" w:hAnsiTheme="majorHAnsi" w:cstheme="majorHAnsi"/>
+          <w:color w:val="FF0000"/>
+        </w:rPr>
+        <w:t>code}}</w:t>
       </w:r>
       <w:r>
         <w:rPr>
@@ -3927,10 +4158,10 @@
         <w:tblLook w:val="04A0" w:firstRow="1" w:lastRow="0" w:firstColumn="1" w:lastColumn="0" w:noHBand="0" w:noVBand="1"/>
       </w:tblPr>
       <w:tblGrid>
-        <w:gridCol w:w="540"/>
-        <w:gridCol w:w="3150"/>
-        <w:gridCol w:w="1890"/>
-        <w:gridCol w:w="4140"/>
+        <w:gridCol w:w="760"/>
+        <w:gridCol w:w="3067"/>
+        <w:gridCol w:w="3013"/>
+        <w:gridCol w:w="2880"/>
       </w:tblGrid>
       <w:tr>
         <w:trPr>
@@ -3938,7 +4169,7 @@
         </w:trPr>
         <w:tc>
           <w:tcPr>
-            <w:tcW w:w="540" w:type="dxa"/>
+            <w:tcW w:w="760" w:type="dxa"/>
             <w:tcBorders>
               <w:top w:val="single" w:sz="7" w:space="0" w:color="000000"/>
               <w:left w:val="single" w:sz="7" w:space="0" w:color="000000"/>
@@ -3964,7 +4195,7 @@
         </w:tc>
         <w:tc>
           <w:tcPr>
-            <w:tcW w:w="3150" w:type="dxa"/>
+            <w:tcW w:w="3067" w:type="dxa"/>
             <w:tcBorders>
               <w:top w:val="single" w:sz="7" w:space="0" w:color="000000"/>
               <w:left w:val="single" w:sz="7" w:space="0" w:color="000000"/>
@@ -3992,7 +4223,7 @@
         </w:tc>
         <w:tc>
           <w:tcPr>
-            <w:tcW w:w="1890" w:type="dxa"/>
+            <w:tcW w:w="3013" w:type="dxa"/>
             <w:tcBorders>
               <w:top w:val="single" w:sz="7" w:space="0" w:color="000000"/>
               <w:left w:val="single" w:sz="7" w:space="0" w:color="000000"/>
@@ -4019,7 +4250,7 @@
         </w:tc>
         <w:tc>
           <w:tcPr>
-            <w:tcW w:w="4140" w:type="dxa"/>
+            <w:tcW w:w="2880" w:type="dxa"/>
             <w:tcBorders>
               <w:top w:val="single" w:sz="7" w:space="0" w:color="000000"/>
               <w:left w:val="single" w:sz="7" w:space="0" w:color="000000"/>
@@ -4052,7 +4283,7 @@
         </w:trPr>
         <w:tc>
           <w:tcPr>
-            <w:tcW w:w="540" w:type="dxa"/>
+            <w:tcW w:w="760" w:type="dxa"/>
             <w:tcBorders>
               <w:top w:val="single" w:sz="7" w:space="0" w:color="000000"/>
               <w:left w:val="single" w:sz="7" w:space="0" w:color="000000"/>
@@ -4074,13 +4305,13 @@
               <w:rPr>
                 <w:rFonts w:asciiTheme="majorHAnsi" w:hAnsiTheme="majorHAnsi" w:cstheme="majorHAnsi"/>
               </w:rPr>
-              <w:t>1</w:t>
-            </w:r>
-          </w:p>
-        </w:tc>
-        <w:tc>
-          <w:tcPr>
-            <w:tcW w:w="3150" w:type="dxa"/>
+              <w:t>{{stt}}</w:t>
+            </w:r>
+          </w:p>
+        </w:tc>
+        <w:tc>
+          <w:tcPr>
+            <w:tcW w:w="3067" w:type="dxa"/>
             <w:tcBorders>
               <w:top w:val="single" w:sz="7" w:space="0" w:color="000000"/>
               <w:left w:val="single" w:sz="7" w:space="0" w:color="000000"/>
@@ -4112,16 +4343,15 @@
                 <w:sz w:val="20"/>
                 <w:szCs w:val="20"/>
               </w:rPr>
-              <w:t>{{gate</w:t>
-            </w:r>
-            <w:proofErr w:type="gramStart"/>
+              <w:t>{{gate}}</w:t>
+            </w:r>
             <w:r>
               <w:rPr>
                 <w:rFonts w:asciiTheme="majorHAnsi" w:hAnsiTheme="majorHAnsi" w:cstheme="majorHAnsi"/>
                 <w:sz w:val="20"/>
                 <w:szCs w:val="20"/>
               </w:rPr>
-              <w:t>}}</w:t>
+              <w:t>% giá trị xe hoặc các xe</w:t>
             </w:r>
             <w:r>
               <w:rPr>
@@ -4129,24 +4359,31 @@
                 <w:sz w:val="20"/>
                 <w:szCs w:val="20"/>
               </w:rPr>
-              <w:t>%</w:t>
-            </w:r>
-            <w:proofErr w:type="gramEnd"/>
+              <w:t xml:space="preserve"> {{description}}</w:t>
+            </w:r>
             <w:r>
               <w:rPr>
                 <w:rFonts w:asciiTheme="majorHAnsi" w:hAnsiTheme="majorHAnsi" w:cstheme="majorHAnsi"/>
                 <w:sz w:val="20"/>
                 <w:szCs w:val="20"/>
               </w:rPr>
-              <w:t xml:space="preserve"> giá trị xe hoặc các xe</w:t>
-            </w:r>
+              <w:t xml:space="preserve">, số khung: </w:t>
+            </w:r>
+          </w:p>
+          <w:p>
+            <w:pPr>
+              <w:spacing w:line="259" w:lineRule="auto"/>
+              <w:rPr>
+                <w:rFonts w:asciiTheme="majorHAnsi" w:hAnsiTheme="majorHAnsi" w:cstheme="majorHAnsi"/>
+              </w:rPr>
+            </w:pPr>
             <w:r>
               <w:rPr>
                 <w:rFonts w:asciiTheme="majorHAnsi" w:hAnsiTheme="majorHAnsi" w:cstheme="majorHAnsi"/>
                 <w:sz w:val="20"/>
                 <w:szCs w:val="20"/>
               </w:rPr>
-              <w:t xml:space="preserve"> {{description}}</w:t>
+              <w:t>{{chassis}}</w:t>
             </w:r>
             <w:r>
               <w:rPr>
@@ -4154,55 +4391,21 @@
                 <w:sz w:val="20"/>
                 <w:szCs w:val="20"/>
               </w:rPr>
-              <w:t xml:space="preserve">, số khung: </w:t>
-            </w:r>
-          </w:p>
-          <w:p>
-            <w:pPr>
-              <w:spacing w:line="259" w:lineRule="auto"/>
-              <w:rPr>
-                <w:rFonts w:asciiTheme="majorHAnsi" w:hAnsiTheme="majorHAnsi" w:cstheme="majorHAnsi"/>
-              </w:rPr>
-            </w:pPr>
-            <w:proofErr w:type="gramStart"/>
+              <w:t>, số máy:</w:t>
+            </w:r>
             <w:r>
               <w:rPr>
                 <w:rFonts w:asciiTheme="majorHAnsi" w:hAnsiTheme="majorHAnsi" w:cstheme="majorHAnsi"/>
                 <w:sz w:val="20"/>
                 <w:szCs w:val="20"/>
               </w:rPr>
-              <w:t>{{chassis}}</w:t>
-            </w:r>
-            <w:r>
-              <w:rPr>
-                <w:rFonts w:asciiTheme="majorHAnsi" w:hAnsiTheme="majorHAnsi" w:cstheme="majorHAnsi"/>
-                <w:sz w:val="20"/>
-                <w:szCs w:val="20"/>
-              </w:rPr>
-              <w:t>,</w:t>
-            </w:r>
-            <w:proofErr w:type="gramEnd"/>
-            <w:r>
-              <w:rPr>
-                <w:rFonts w:asciiTheme="majorHAnsi" w:hAnsiTheme="majorHAnsi" w:cstheme="majorHAnsi"/>
-                <w:sz w:val="20"/>
-                <w:szCs w:val="20"/>
-              </w:rPr>
-              <w:t xml:space="preserve"> số máy:</w:t>
-            </w:r>
-            <w:r>
-              <w:rPr>
-                <w:rFonts w:asciiTheme="majorHAnsi" w:hAnsiTheme="majorHAnsi" w:cstheme="majorHAnsi"/>
-                <w:sz w:val="20"/>
-                <w:szCs w:val="20"/>
-              </w:rPr>
               <w:t xml:space="preserve"> {{engine}}</w:t>
             </w:r>
           </w:p>
         </w:tc>
         <w:tc>
           <w:tcPr>
-            <w:tcW w:w="1890" w:type="dxa"/>
+            <w:tcW w:w="3013" w:type="dxa"/>
             <w:tcBorders>
               <w:top w:val="single" w:sz="7" w:space="0" w:color="000000"/>
               <w:left w:val="single" w:sz="7" w:space="0" w:color="000000"/>
@@ -4234,7 +4437,7 @@
         </w:tc>
         <w:tc>
           <w:tcPr>
-            <w:tcW w:w="4140" w:type="dxa"/>
+            <w:tcW w:w="2880" w:type="dxa"/>
             <w:tcBorders>
               <w:top w:val="single" w:sz="7" w:space="0" w:color="000000"/>
               <w:left w:val="single" w:sz="7" w:space="0" w:color="000000"/>
@@ -4284,7 +4487,23 @@
                 <w:i/>
                 <w:color w:val="4472C4" w:themeColor="accent1"/>
               </w:rPr>
-              <w:t>{{GUARANTEE_DATE}}</w:t>
+              <w:t>{{</w:t>
+            </w:r>
+            <w:r>
+              <w:rPr>
+                <w:rFonts w:asciiTheme="majorHAnsi" w:hAnsiTheme="majorHAnsi" w:cstheme="majorHAnsi"/>
+                <w:i/>
+                <w:color w:val="4472C4" w:themeColor="accent1"/>
+              </w:rPr>
+              <w:t>CURRENT</w:t>
+            </w:r>
+            <w:r>
+              <w:rPr>
+                <w:rFonts w:asciiTheme="majorHAnsi" w:hAnsiTheme="majorHAnsi" w:cstheme="majorHAnsi"/>
+                <w:i/>
+                <w:color w:val="4472C4" w:themeColor="accent1"/>
+              </w:rPr>
+              <w:t>_DATE}}</w:t>
             </w:r>
           </w:p>
           <w:p>
@@ -4308,7 +4527,7 @@
         </w:trPr>
         <w:tc>
           <w:tcPr>
-            <w:tcW w:w="540" w:type="dxa"/>
+            <w:tcW w:w="760" w:type="dxa"/>
             <w:tcBorders>
               <w:top w:val="single" w:sz="7" w:space="0" w:color="000000"/>
               <w:left w:val="single" w:sz="7" w:space="0" w:color="000000"/>
@@ -4326,7 +4545,7 @@
         </w:tc>
         <w:tc>
           <w:tcPr>
-            <w:tcW w:w="3150" w:type="dxa"/>
+            <w:tcW w:w="3067" w:type="dxa"/>
             <w:tcBorders>
               <w:top w:val="single" w:sz="7" w:space="0" w:color="000000"/>
               <w:left w:val="single" w:sz="7" w:space="0" w:color="000000"/>
@@ -4355,7 +4574,7 @@
         </w:tc>
         <w:tc>
           <w:tcPr>
-            <w:tcW w:w="1890" w:type="dxa"/>
+            <w:tcW w:w="3013" w:type="dxa"/>
             <w:tcBorders>
               <w:top w:val="single" w:sz="7" w:space="0" w:color="000000"/>
               <w:left w:val="single" w:sz="7" w:space="0" w:color="000000"/>
@@ -4370,21 +4589,39 @@
               <w:jc w:val="center"/>
               <w:rPr>
                 <w:rFonts w:asciiTheme="majorHAnsi" w:hAnsiTheme="majorHAnsi" w:cstheme="majorHAnsi"/>
-              </w:rPr>
-            </w:pPr>
-            <w:r>
-              <w:rPr>
-                <w:rFonts w:asciiTheme="majorHAnsi" w:hAnsiTheme="majorHAnsi" w:cstheme="majorHAnsi"/>
                 <w:b/>
                 <w:color w:val="0000CC"/>
               </w:rPr>
-              <w:t>{{TONG}}</w:t>
-            </w:r>
-          </w:p>
-        </w:tc>
-        <w:tc>
-          <w:tcPr>
-            <w:tcW w:w="4140" w:type="dxa"/>
+            </w:pPr>
+            <w:r>
+              <w:rPr>
+                <w:rFonts w:asciiTheme="majorHAnsi" w:hAnsiTheme="majorHAnsi" w:cstheme="majorHAnsi"/>
+                <w:b/>
+                <w:color w:val="0000CC"/>
+              </w:rPr>
+              <w:t>{{</w:t>
+            </w:r>
+            <w:r>
+              <w:rPr>
+                <w:rFonts w:asciiTheme="majorHAnsi" w:hAnsiTheme="majorHAnsi" w:cstheme="majorHAnsi"/>
+                <w:b/>
+                <w:color w:val="0000CC"/>
+              </w:rPr>
+              <w:t>total_vehicle</w:t>
+            </w:r>
+            <w:r>
+              <w:rPr>
+                <w:rFonts w:asciiTheme="majorHAnsi" w:hAnsiTheme="majorHAnsi" w:cstheme="majorHAnsi"/>
+                <w:b/>
+                <w:color w:val="0000CC"/>
+              </w:rPr>
+              <w:t>}}</w:t>
+            </w:r>
+          </w:p>
+        </w:tc>
+        <w:tc>
+          <w:tcPr>
+            <w:tcW w:w="2880" w:type="dxa"/>
             <w:tcBorders>
               <w:top w:val="single" w:sz="7" w:space="0" w:color="000000"/>
               <w:left w:val="single" w:sz="7" w:space="0" w:color="000000"/>
@@ -4418,7 +4655,23 @@
           <w:i/>
           <w:color w:val="FF0000"/>
         </w:rPr>
-        <w:t>(Bằng chữ: {{TONG_TEXT}}</w:t>
+        <w:t>(Bằng chữ: {{</w:t>
+      </w:r>
+      <w:r>
+        <w:rPr>
+          <w:rFonts w:asciiTheme="majorHAnsi" w:hAnsiTheme="majorHAnsi" w:cstheme="majorHAnsi"/>
+          <w:i/>
+          <w:color w:val="FF0000"/>
+        </w:rPr>
+        <w:t>total_vehicle_text</w:t>
+      </w:r>
+      <w:r>
+        <w:rPr>
+          <w:rFonts w:asciiTheme="majorHAnsi" w:hAnsiTheme="majorHAnsi" w:cstheme="majorHAnsi"/>
+          <w:i/>
+          <w:color w:val="FF0000"/>
+        </w:rPr>
+        <w:t>}}</w:t>
       </w:r>
     </w:p>
     <w:p>
@@ -4917,8 +5170,8 @@
         <w:tblLook w:val="04A0" w:firstRow="1" w:lastRow="0" w:firstColumn="1" w:lastColumn="0" w:noHBand="0" w:noVBand="1"/>
       </w:tblPr>
       <w:tblGrid>
-        <w:gridCol w:w="4611"/>
-        <w:gridCol w:w="4652"/>
+        <w:gridCol w:w="4616"/>
+        <w:gridCol w:w="4647"/>
       </w:tblGrid>
       <w:tr>
         <w:tc>
@@ -5105,8 +5358,6 @@
             <w:pPr>
               <w:rPr>
                 <w:rFonts w:asciiTheme="majorHAnsi" w:hAnsiTheme="majorHAnsi" w:cstheme="majorHAnsi"/>
-                <w:b/>
-                <w:bCs/>
               </w:rPr>
             </w:pPr>
             <w:r>
@@ -5119,7 +5370,7 @@
               <w:rPr>
                 <w:rFonts w:asciiTheme="majorHAnsi" w:hAnsiTheme="majorHAnsi" w:cstheme="majorHAnsi"/>
               </w:rPr>
-              <w:t>expiry</w:t>
+              <w:t>loan_term</w:t>
             </w:r>
             <w:r>
               <w:rPr>
@@ -5151,7 +5402,23 @@
                 <w:i/>
                 <w:color w:val="4472C4" w:themeColor="accent1"/>
               </w:rPr>
-              <w:t>{{GUARANTEE_DATE}}</w:t>
+              <w:t>{{</w:t>
+            </w:r>
+            <w:r>
+              <w:rPr>
+                <w:rFonts w:asciiTheme="majorHAnsi" w:hAnsiTheme="majorHAnsi" w:cstheme="majorHAnsi"/>
+                <w:i/>
+                <w:color w:val="4472C4" w:themeColor="accent1"/>
+              </w:rPr>
+              <w:t>CURRENT</w:t>
+            </w:r>
+            <w:r>
+              <w:rPr>
+                <w:rFonts w:asciiTheme="majorHAnsi" w:hAnsiTheme="majorHAnsi" w:cstheme="majorHAnsi"/>
+                <w:i/>
+                <w:color w:val="4472C4" w:themeColor="accent1"/>
+              </w:rPr>
+              <w:t>_DATE}}</w:t>
             </w:r>
           </w:p>
           <w:p>
@@ -5165,7 +5432,37 @@
               <w:rPr>
                 <w:rFonts w:asciiTheme="majorHAnsi" w:hAnsiTheme="majorHAnsi" w:cstheme="majorHAnsi"/>
               </w:rPr>
-              <w:t>; Ngày thu nợ cuối cùng: 25/6/2026)</w:t>
+              <w:t>; Ngày thu nợ cuối cùng:</w:t>
+            </w:r>
+            <w:r>
+              <w:rPr>
+                <w:rFonts w:asciiTheme="majorHAnsi" w:hAnsiTheme="majorHAnsi" w:cstheme="majorHAnsi"/>
+              </w:rPr>
+              <w:t xml:space="preserve"> </w:t>
+            </w:r>
+            <w:r>
+              <w:rPr>
+                <w:rFonts w:asciiTheme="majorHAnsi" w:hAnsiTheme="majorHAnsi" w:cstheme="majorHAnsi"/>
+              </w:rPr>
+              <w:t>{{</w:t>
+            </w:r>
+            <w:r>
+              <w:rPr>
+                <w:rFonts w:asciiTheme="majorHAnsi" w:hAnsiTheme="majorHAnsi" w:cstheme="majorHAnsi"/>
+              </w:rPr>
+              <w:t>dueDate</w:t>
+            </w:r>
+            <w:r>
+              <w:rPr>
+                <w:rFonts w:asciiTheme="majorHAnsi" w:hAnsiTheme="majorHAnsi" w:cstheme="majorHAnsi"/>
+              </w:rPr>
+              <w:t>}}</w:t>
+            </w:r>
+            <w:r>
+              <w:rPr>
+                <w:rFonts w:asciiTheme="majorHAnsi" w:hAnsiTheme="majorHAnsi" w:cstheme="majorHAnsi"/>
+              </w:rPr>
+              <w:t>)</w:t>
             </w:r>
           </w:p>
         </w:tc>
@@ -5459,25 +5756,58 @@
     </w:p>
     <w:p>
       <w:pPr>
-        <w:spacing w:line="240" w:lineRule="auto"/>
         <w:jc w:val="right"/>
-        <w:rPr>
-          <w:rFonts w:asciiTheme="majorHAnsi" w:hAnsiTheme="majorHAnsi" w:cstheme="majorHAnsi"/>
-        </w:rPr>
-      </w:pPr>
-      <w:r>
-        <w:rPr>
-          <w:rFonts w:asciiTheme="majorHAnsi" w:hAnsiTheme="majorHAnsi" w:cstheme="majorHAnsi"/>
-        </w:rPr>
-        <w:t xml:space="preserve">P. Cao Lãnh, </w:t>
-      </w:r>
-      <w:r>
         <w:rPr>
           <w:rFonts w:asciiTheme="majorHAnsi" w:hAnsiTheme="majorHAnsi" w:cstheme="majorHAnsi"/>
           <w:i/>
           <w:color w:val="4472C4" w:themeColor="accent1"/>
         </w:rPr>
-        <w:t>{{GUARANTEE_DATE_TITLE}</w:t>
+      </w:pPr>
+      <w:r>
+        <w:rPr>
+          <w:rFonts w:asciiTheme="majorHAnsi" w:hAnsiTheme="majorHAnsi" w:cstheme="majorHAnsi"/>
+        </w:rPr>
+        <w:t xml:space="preserve">P. Cao Lãnh, </w:t>
+      </w:r>
+      <w:r>
+        <w:rPr>
+          <w:rFonts w:asciiTheme="majorHAnsi" w:hAnsiTheme="majorHAnsi" w:cstheme="majorHAnsi"/>
+          <w:i/>
+          <w:color w:val="4472C4" w:themeColor="accent1"/>
+        </w:rPr>
+        <w:t>{{</w:t>
+      </w:r>
+      <w:r>
+        <w:rPr>
+          <w:rFonts w:asciiTheme="majorHAnsi" w:hAnsiTheme="majorHAnsi" w:cstheme="majorHAnsi"/>
+          <w:i/>
+          <w:color w:val="4472C4" w:themeColor="accent1"/>
+        </w:rPr>
+        <w:t>C</w:t>
+      </w:r>
+      <w:r>
+        <w:rPr>
+          <w:rFonts w:asciiTheme="majorHAnsi" w:hAnsiTheme="majorHAnsi" w:cstheme="majorHAnsi"/>
+          <w:i/>
+          <w:color w:val="4472C4" w:themeColor="accent1"/>
+        </w:rPr>
+        <w:t>URRENT_DATE_TITLE</w:t>
+      </w:r>
+      <w:r>
+        <w:rPr>
+          <w:rFonts w:asciiTheme="majorHAnsi" w:hAnsiTheme="majorHAnsi" w:cstheme="majorHAnsi"/>
+          <w:i/>
+          <w:color w:val="4472C4" w:themeColor="accent1"/>
+        </w:rPr>
+        <w:t>}</w:t>
+      </w:r>
+      <w:r>
+        <w:rPr>
+          <w:rFonts w:asciiTheme="majorHAnsi" w:hAnsiTheme="majorHAnsi" w:cstheme="majorHAnsi"/>
+          <w:i/>
+          <w:color w:val="4472C4" w:themeColor="accent1"/>
+        </w:rPr>
+        <w:t>}</w:t>
       </w:r>
     </w:p>
     <w:sectPr>

</xml_diff>